<commit_message>
Use MS Mincho 10.5pt in entrance exam guide
Co-Authored-By: Claude Opus 5.5 <noreply@anthropic.com>
Claude-Session: https://claude.ai/code/session_01Nzw8LA1h98MBfBp5SVjuS5
</commit_message>
<xml_diff>
--- a/入試ガイダンス資料_神戸女子・神戸学院・武庫川.docx
+++ b/入試ガイダンス資料_神戸女子・神戸学院・武庫川.docx
@@ -9,10 +9,10 @@
       </w:pPr>
       <w:r>
         <w:rPr>
-          <w:rFonts w:ascii="Yu Gothic" w:eastAsia="Yu Gothic" w:hAnsi="Yu Gothic"/>
+          <w:rFonts w:ascii="ＭＳ 明朝" w:eastAsia="ＭＳ 明朝" w:hAnsi="ＭＳ 明朝"/>
           <w:color w:val="595959"/>
-          <w:sz w:val="18"/>
-          <w:szCs w:val="18"/>
+          <w:sz w:val="21"/>
+          <w:szCs w:val="21"/>
         </w:rPr>
         <w:t xml:space="preserve">2026年10月　保護者懇談資料</w:t>
       </w:r>
@@ -24,10 +24,10 @@
       </w:pPr>
       <w:r>
         <w:rPr>
-          <w:rFonts w:ascii="Yu Gothic" w:eastAsia="Yu Gothic" w:hAnsi="Yu Gothic"/>
+          <w:rFonts w:ascii="ＭＳ 明朝" w:eastAsia="ＭＳ 明朝" w:hAnsi="ＭＳ 明朝"/>
           <w:color w:val="595959"/>
-          <w:sz w:val="18"/>
-          <w:szCs w:val="18"/>
+          <w:sz w:val="21"/>
+          <w:szCs w:val="21"/>
         </w:rPr>
         <w:t xml:space="preserve">　　　　　　　　　　　　　　　　　　個別指導塾 ＿＿＿＿＿＿＿＿ 教室　教室長 ＿＿＿＿＿＿</w:t>
       </w:r>
@@ -39,7 +39,7 @@
       </w:pPr>
       <w:r>
         <w:rPr>
-          <w:rFonts w:ascii="Yu Gothic" w:eastAsia="Yu Gothic" w:hAnsi="Yu Gothic"/>
+          <w:rFonts w:ascii="ＭＳ 明朝" w:eastAsia="ＭＳ 明朝" w:hAnsi="ＭＳ 明朝"/>
           <w:b/>
           <w:bCs/>
           <w:color w:val="1F4E79"/>
@@ -56,10 +56,10 @@
       </w:pPr>
       <w:r>
         <w:rPr>
-          <w:rFonts w:ascii="Yu Gothic" w:eastAsia="Yu Gothic" w:hAnsi="Yu Gothic"/>
+          <w:rFonts w:ascii="ＭＳ 明朝" w:eastAsia="ＭＳ 明朝" w:hAnsi="ＭＳ 明朝"/>
           <w:color w:val="1F4E79"/>
-          <w:sz w:val="22"/>
-          <w:szCs w:val="22"/>
+          <w:sz w:val="21"/>
+          <w:szCs w:val="21"/>
         </w:rPr>
         <w:t xml:space="preserve">～ 神戸女子大学・神戸学院大学・武庫川大学（武庫川女子大学）～</w:t>
       </w:r>
@@ -70,9 +70,9 @@
       </w:pPr>
       <w:r>
         <w:rPr>
-          <w:rFonts w:ascii="Yu Gothic" w:eastAsia="Yu Gothic" w:hAnsi="Yu Gothic"/>
-          <w:sz w:val="22"/>
-          <w:szCs w:val="22"/>
+          <w:rFonts w:ascii="ＭＳ 明朝" w:eastAsia="ＭＳ 明朝" w:hAnsi="ＭＳ 明朝"/>
+          <w:sz w:val="21"/>
+          <w:szCs w:val="21"/>
         </w:rPr>
         <w:t xml:space="preserve">生徒氏名：＿＿＿＿＿＿＿＿＿＿＿＿　さん　（高校3年・文系）</w:t>
       </w:r>
@@ -83,7 +83,7 @@
       </w:pPr>
       <w:r>
         <w:rPr>
-          <w:rFonts w:ascii="Yu Gothic" w:eastAsia="Yu Gothic" w:hAnsi="Yu Gothic"/>
+          <w:rFonts w:ascii="ＭＳ 明朝" w:eastAsia="ＭＳ 明朝" w:hAnsi="ＭＳ 明朝"/>
           <w:sz w:val="21"/>
           <w:szCs w:val="21"/>
         </w:rPr>
@@ -92,17 +92,18 @@
     </w:p>
     <w:p>
       <w:pPr>
+        <w:keepNext/>
         <w:shd w:fill="1F4E79" w:color="auto" w:val="clear"/>
         <w:spacing w:after="120" w:before="240"/>
       </w:pPr>
       <w:r>
         <w:rPr>
-          <w:rFonts w:ascii="Yu Gothic" w:eastAsia="Yu Gothic" w:hAnsi="Yu Gothic"/>
+          <w:rFonts w:ascii="ＭＳ 明朝" w:eastAsia="ＭＳ 明朝" w:hAnsi="ＭＳ 明朝"/>
           <w:b/>
           <w:bCs/>
           <w:color w:val="FFFFFF"/>
-          <w:sz w:val="26"/>
-          <w:szCs w:val="26"/>
+          <w:sz w:val="21"/>
+          <w:szCs w:val="21"/>
         </w:rPr>
         <w:t xml:space="preserve">１．まず確認していただきたい重要事項</w:t>
       </w:r>
@@ -147,7 +148,7 @@
             </w:pPr>
             <w:r>
               <w:rPr>
-                <w:rFonts w:ascii="Yu Gothic" w:eastAsia="Yu Gothic" w:hAnsi="Yu Gothic"/>
+                <w:rFonts w:ascii="ＭＳ 明朝" w:eastAsia="ＭＳ 明朝" w:hAnsi="ＭＳ 明朝"/>
                 <w:b/>
                 <w:bCs/>
                 <w:color w:val="C00000"/>
@@ -163,9 +164,9 @@
             </w:pPr>
             <w:r>
               <w:rPr>
-                <w:rFonts w:ascii="Yu Gothic" w:eastAsia="Yu Gothic" w:hAnsi="Yu Gothic"/>
-                <w:sz w:val="20"/>
-                <w:szCs w:val="20"/>
+                <w:rFonts w:ascii="ＭＳ 明朝" w:eastAsia="ＭＳ 明朝" w:hAnsi="ＭＳ 明朝"/>
+                <w:sz w:val="21"/>
+                <w:szCs w:val="21"/>
               </w:rPr>
               <w:t xml:space="preserve">出願登録と受験料の入金がどちらも必要です。受験する場合は今週中に手続きを完了させましょう。</w:t>
             </w:r>
@@ -176,7 +177,7 @@
             </w:pPr>
             <w:r>
               <w:rPr>
-                <w:rFonts w:ascii="Yu Gothic" w:eastAsia="Yu Gothic" w:hAnsi="Yu Gothic"/>
+                <w:rFonts w:ascii="ＭＳ 明朝" w:eastAsia="ＭＳ 明朝" w:hAnsi="ＭＳ 明朝"/>
                 <w:b/>
                 <w:bCs/>
                 <w:color w:val="C00000"/>
@@ -192,9 +193,9 @@
             </w:pPr>
             <w:r>
               <w:rPr>
-                <w:rFonts w:ascii="Yu Gothic" w:eastAsia="Yu Gothic" w:hAnsi="Yu Gothic"/>
-                <w:sz w:val="20"/>
-                <w:szCs w:val="20"/>
+                <w:rFonts w:ascii="ＭＳ 明朝" w:eastAsia="ＭＳ 明朝" w:hAnsi="ＭＳ 明朝"/>
+                <w:sz w:val="21"/>
+                <w:szCs w:val="21"/>
               </w:rPr>
               <w:t xml:space="preserve">出願期間が終了している可能性があります。大学の入試サイトで今すぐご確認ください（後期は12/6に試験があります）。</w:t>
             </w:r>
@@ -205,7 +206,7 @@
             </w:pPr>
             <w:r>
               <w:rPr>
-                <w:rFonts w:ascii="Yu Gothic" w:eastAsia="Yu Gothic" w:hAnsi="Yu Gothic"/>
+                <w:rFonts w:ascii="ＭＳ 明朝" w:eastAsia="ＭＳ 明朝" w:hAnsi="ＭＳ 明朝"/>
                 <w:b/>
                 <w:bCs/>
                 <w:sz w:val="21"/>
@@ -220,9 +221,9 @@
             </w:pPr>
             <w:r>
               <w:rPr>
-                <w:rFonts w:ascii="Yu Gothic" w:eastAsia="Yu Gothic" w:hAnsi="Yu Gothic"/>
-                <w:sz w:val="20"/>
-                <w:szCs w:val="20"/>
+                <w:rFonts w:ascii="ＭＳ 明朝" w:eastAsia="ＭＳ 明朝" w:hAnsi="ＭＳ 明朝"/>
+                <w:sz w:val="21"/>
+                <w:szCs w:val="21"/>
               </w:rPr>
               <w:t xml:space="preserve">受験者の層が変わるため、例年の倍率や合格最低点が参考にしにくい年です。余裕をもった併願計画をおすすめします。</w:t>
             </w:r>
@@ -232,17 +233,18 @@
     </w:tbl>
     <w:p>
       <w:pPr>
+        <w:keepNext/>
         <w:shd w:fill="1F4E79" w:color="auto" w:val="clear"/>
         <w:spacing w:after="120" w:before="240"/>
       </w:pPr>
       <w:r>
         <w:rPr>
-          <w:rFonts w:ascii="Yu Gothic" w:eastAsia="Yu Gothic" w:hAnsi="Yu Gothic"/>
+          <w:rFonts w:ascii="ＭＳ 明朝" w:eastAsia="ＭＳ 明朝" w:hAnsi="ＭＳ 明朝"/>
           <w:b/>
           <w:bCs/>
           <w:color w:val="FFFFFF"/>
-          <w:sz w:val="26"/>
-          <w:szCs w:val="26"/>
+          <w:sz w:val="21"/>
+          <w:szCs w:val="21"/>
         </w:rPr>
         <w:t xml:space="preserve">２．志望校別　試験日程・試験科目（2027年度入試）</w:t>
       </w:r>
@@ -253,16 +255,17 @@
       </w:pPr>
       <w:r>
         <w:rPr>
-          <w:rFonts w:ascii="Yu Gothic" w:eastAsia="Yu Gothic" w:hAnsi="Yu Gothic"/>
+          <w:rFonts w:ascii="ＭＳ 明朝" w:eastAsia="ＭＳ 明朝" w:hAnsi="ＭＳ 明朝"/>
           <w:color w:val="595959"/>
-          <w:sz w:val="18"/>
-          <w:szCs w:val="18"/>
+          <w:sz w:val="21"/>
+          <w:szCs w:val="21"/>
         </w:rPr>
         <w:t xml:space="preserve">※日付は2026年10月時点の公開情報です。学部・学科により異なる場合があります。</w:t>
       </w:r>
     </w:p>
     <w:p>
       <w:pPr>
+        <w:keepNext/>
         <w:pBdr>
           <w:bottom w:val="single" w:color="1F4E79" w:sz="8" w:space="2"/>
         </w:pBdr>
@@ -270,12 +273,12 @@
       </w:pPr>
       <w:r>
         <w:rPr>
-          <w:rFonts w:ascii="Yu Gothic" w:eastAsia="Yu Gothic" w:hAnsi="Yu Gothic"/>
+          <w:rFonts w:ascii="ＭＳ 明朝" w:eastAsia="ＭＳ 明朝" w:hAnsi="ＭＳ 明朝"/>
           <w:b/>
           <w:bCs/>
           <w:color w:val="1F4E79"/>
-          <w:sz w:val="23"/>
-          <w:szCs w:val="23"/>
+          <w:sz w:val="21"/>
+          <w:szCs w:val="21"/>
         </w:rPr>
         <w:t xml:space="preserve">① 神戸女子大学</w:t>
       </w:r>
@@ -328,12 +331,12 @@
             </w:pPr>
             <w:r>
               <w:rPr>
-                <w:rFonts w:ascii="Yu Gothic" w:eastAsia="Yu Gothic" w:hAnsi="Yu Gothic"/>
+                <w:rFonts w:ascii="ＭＳ 明朝" w:eastAsia="ＭＳ 明朝" w:hAnsi="ＭＳ 明朝"/>
                 <w:b/>
                 <w:bCs/>
                 <w:color w:val="FFFFFF"/>
-                <w:sz w:val="19"/>
-                <w:szCs w:val="19"/>
+                <w:sz w:val="21"/>
+                <w:szCs w:val="21"/>
               </w:rPr>
               <w:t xml:space="preserve">入試区分</w:t>
             </w:r>
@@ -364,12 +367,12 @@
             </w:pPr>
             <w:r>
               <w:rPr>
-                <w:rFonts w:ascii="Yu Gothic" w:eastAsia="Yu Gothic" w:hAnsi="Yu Gothic"/>
+                <w:rFonts w:ascii="ＭＳ 明朝" w:eastAsia="ＭＳ 明朝" w:hAnsi="ＭＳ 明朝"/>
                 <w:b/>
                 <w:bCs/>
                 <w:color w:val="FFFFFF"/>
-                <w:sz w:val="19"/>
-                <w:szCs w:val="19"/>
+                <w:sz w:val="21"/>
+                <w:szCs w:val="21"/>
               </w:rPr>
               <w:t xml:space="preserve">出願期間</w:t>
             </w:r>
@@ -400,12 +403,12 @@
             </w:pPr>
             <w:r>
               <w:rPr>
-                <w:rFonts w:ascii="Yu Gothic" w:eastAsia="Yu Gothic" w:hAnsi="Yu Gothic"/>
+                <w:rFonts w:ascii="ＭＳ 明朝" w:eastAsia="ＭＳ 明朝" w:hAnsi="ＭＳ 明朝"/>
                 <w:b/>
                 <w:bCs/>
                 <w:color w:val="FFFFFF"/>
-                <w:sz w:val="19"/>
-                <w:szCs w:val="19"/>
+                <w:sz w:val="21"/>
+                <w:szCs w:val="21"/>
               </w:rPr>
               <w:t xml:space="preserve">試験日</w:t>
             </w:r>
@@ -436,12 +439,12 @@
             </w:pPr>
             <w:r>
               <w:rPr>
-                <w:rFonts w:ascii="Yu Gothic" w:eastAsia="Yu Gothic" w:hAnsi="Yu Gothic"/>
+                <w:rFonts w:ascii="ＭＳ 明朝" w:eastAsia="ＭＳ 明朝" w:hAnsi="ＭＳ 明朝"/>
                 <w:b/>
                 <w:bCs/>
                 <w:color w:val="FFFFFF"/>
-                <w:sz w:val="19"/>
-                <w:szCs w:val="19"/>
+                <w:sz w:val="21"/>
+                <w:szCs w:val="21"/>
               </w:rPr>
               <w:t xml:space="preserve">合格発表</w:t>
             </w:r>
@@ -472,12 +475,12 @@
             </w:pPr>
             <w:r>
               <w:rPr>
-                <w:rFonts w:ascii="Yu Gothic" w:eastAsia="Yu Gothic" w:hAnsi="Yu Gothic"/>
+                <w:rFonts w:ascii="ＭＳ 明朝" w:eastAsia="ＭＳ 明朝" w:hAnsi="ＭＳ 明朝"/>
                 <w:b/>
                 <w:bCs/>
                 <w:color w:val="FFFFFF"/>
-                <w:sz w:val="19"/>
-                <w:szCs w:val="19"/>
+                <w:sz w:val="21"/>
+                <w:szCs w:val="21"/>
               </w:rPr>
               <w:t xml:space="preserve">試験科目・形式</w:t>
             </w:r>
@@ -513,11 +516,11 @@
             </w:pPr>
             <w:r>
               <w:rPr>
-                <w:rFonts w:ascii="Yu Gothic" w:eastAsia="Yu Gothic" w:hAnsi="Yu Gothic"/>
+                <w:rFonts w:ascii="ＭＳ 明朝" w:eastAsia="ＭＳ 明朝" w:hAnsi="ＭＳ 明朝"/>
                 <w:b/>
                 <w:bCs/>
-                <w:sz w:val="19"/>
-                <w:szCs w:val="19"/>
+                <w:sz w:val="21"/>
+                <w:szCs w:val="21"/>
               </w:rPr>
               <w:t xml:space="preserve">公募推薦</w:t>
             </w:r>
@@ -529,11 +532,11 @@
             </w:pPr>
             <w:r>
               <w:rPr>
-                <w:rFonts w:ascii="Yu Gothic" w:eastAsia="Yu Gothic" w:hAnsi="Yu Gothic"/>
+                <w:rFonts w:ascii="ＭＳ 明朝" w:eastAsia="ＭＳ 明朝" w:hAnsi="ＭＳ 明朝"/>
                 <w:b/>
                 <w:bCs/>
-                <w:sz w:val="19"/>
-                <w:szCs w:val="19"/>
+                <w:sz w:val="21"/>
+                <w:szCs w:val="21"/>
               </w:rPr>
               <w:t xml:space="preserve">前期A・B</w:t>
             </w:r>
@@ -563,11 +566,11 @@
             </w:pPr>
             <w:r>
               <w:rPr>
-                <w:rFonts w:ascii="Yu Gothic" w:eastAsia="Yu Gothic" w:hAnsi="Yu Gothic"/>
-                <w:b w:val="false"/>
-                <w:bCs w:val="false"/>
-                <w:sz w:val="19"/>
-                <w:szCs w:val="19"/>
+                <w:rFonts w:ascii="ＭＳ 明朝" w:eastAsia="ＭＳ 明朝" w:hAnsi="ＭＳ 明朝"/>
+                <w:b w:val="false"/>
+                <w:bCs w:val="false"/>
+                <w:sz w:val="21"/>
+                <w:szCs w:val="21"/>
               </w:rPr>
               <w:t xml:space="preserve">要項で確認</w:t>
             </w:r>
@@ -578,11 +581,11 @@
             </w:pPr>
             <w:r>
               <w:rPr>
-                <w:rFonts w:ascii="Yu Gothic" w:eastAsia="Yu Gothic" w:hAnsi="Yu Gothic"/>
-                <w:b w:val="false"/>
-                <w:bCs w:val="false"/>
-                <w:sz w:val="19"/>
-                <w:szCs w:val="19"/>
+                <w:rFonts w:ascii="ＭＳ 明朝" w:eastAsia="ＭＳ 明朝" w:hAnsi="ＭＳ 明朝"/>
+                <w:b w:val="false"/>
+                <w:bCs w:val="false"/>
+                <w:sz w:val="21"/>
+                <w:szCs w:val="21"/>
               </w:rPr>
               <w:t xml:space="preserve">（締切間近の可能性）</w:t>
             </w:r>
@@ -612,11 +615,11 @@
             </w:pPr>
             <w:r>
               <w:rPr>
-                <w:rFonts w:ascii="Yu Gothic" w:eastAsia="Yu Gothic" w:hAnsi="Yu Gothic"/>
-                <w:b w:val="false"/>
-                <w:bCs w:val="false"/>
-                <w:sz w:val="19"/>
-                <w:szCs w:val="19"/>
+                <w:rFonts w:ascii="ＭＳ 明朝" w:eastAsia="ＭＳ 明朝" w:hAnsi="ＭＳ 明朝"/>
+                <w:b w:val="false"/>
+                <w:bCs w:val="false"/>
+                <w:sz w:val="21"/>
+                <w:szCs w:val="21"/>
               </w:rPr>
               <w:t xml:space="preserve">A：10/31（土）</w:t>
             </w:r>
@@ -627,11 +630,11 @@
             </w:pPr>
             <w:r>
               <w:rPr>
-                <w:rFonts w:ascii="Yu Gothic" w:eastAsia="Yu Gothic" w:hAnsi="Yu Gothic"/>
-                <w:b w:val="false"/>
-                <w:bCs w:val="false"/>
-                <w:sz w:val="19"/>
-                <w:szCs w:val="19"/>
+                <w:rFonts w:ascii="ＭＳ 明朝" w:eastAsia="ＭＳ 明朝" w:hAnsi="ＭＳ 明朝"/>
+                <w:b w:val="false"/>
+                <w:bCs w:val="false"/>
+                <w:sz w:val="21"/>
+                <w:szCs w:val="21"/>
               </w:rPr>
               <w:t xml:space="preserve">B：11/1（日）</w:t>
             </w:r>
@@ -661,11 +664,11 @@
             </w:pPr>
             <w:r>
               <w:rPr>
-                <w:rFonts w:ascii="Yu Gothic" w:eastAsia="Yu Gothic" w:hAnsi="Yu Gothic"/>
-                <w:b w:val="false"/>
-                <w:bCs w:val="false"/>
-                <w:sz w:val="19"/>
-                <w:szCs w:val="19"/>
+                <w:rFonts w:ascii="ＭＳ 明朝" w:eastAsia="ＭＳ 明朝" w:hAnsi="ＭＳ 明朝"/>
+                <w:b w:val="false"/>
+                <w:bCs w:val="false"/>
+                <w:sz w:val="21"/>
+                <w:szCs w:val="21"/>
               </w:rPr>
               <w:t xml:space="preserve">11月中旬</w:t>
             </w:r>
@@ -695,11 +698,11 @@
             </w:pPr>
             <w:r>
               <w:rPr>
-                <w:rFonts w:ascii="Yu Gothic" w:eastAsia="Yu Gothic" w:hAnsi="Yu Gothic"/>
-                <w:b w:val="false"/>
-                <w:bCs w:val="false"/>
-                <w:sz w:val="19"/>
-                <w:szCs w:val="19"/>
+                <w:rFonts w:ascii="ＭＳ 明朝" w:eastAsia="ＭＳ 明朝" w:hAnsi="ＭＳ 明朝"/>
+                <w:b w:val="false"/>
+                <w:bCs w:val="false"/>
+                <w:sz w:val="21"/>
+                <w:szCs w:val="21"/>
               </w:rPr>
               <w:t xml:space="preserve">英語・国語・数学・日本史・化学・生物の6科目から2科目選択</w:t>
             </w:r>
@@ -710,11 +713,11 @@
             </w:pPr>
             <w:r>
               <w:rPr>
-                <w:rFonts w:ascii="Yu Gothic" w:eastAsia="Yu Gothic" w:hAnsi="Yu Gothic"/>
-                <w:b w:val="false"/>
-                <w:bCs w:val="false"/>
-                <w:sz w:val="19"/>
-                <w:szCs w:val="19"/>
+                <w:rFonts w:ascii="ＭＳ 明朝" w:eastAsia="ＭＳ 明朝" w:hAnsi="ＭＳ 明朝"/>
+                <w:b w:val="false"/>
+                <w:bCs w:val="false"/>
+                <w:sz w:val="21"/>
+                <w:szCs w:val="21"/>
               </w:rPr>
               <w:t xml:space="preserve">マーク式</w:t>
             </w:r>
@@ -750,11 +753,11 @@
             </w:pPr>
             <w:r>
               <w:rPr>
-                <w:rFonts w:ascii="Yu Gothic" w:eastAsia="Yu Gothic" w:hAnsi="Yu Gothic"/>
+                <w:rFonts w:ascii="ＭＳ 明朝" w:eastAsia="ＭＳ 明朝" w:hAnsi="ＭＳ 明朝"/>
                 <w:b/>
                 <w:bCs/>
-                <w:sz w:val="19"/>
-                <w:szCs w:val="19"/>
+                <w:sz w:val="21"/>
+                <w:szCs w:val="21"/>
               </w:rPr>
               <w:t xml:space="preserve">公募推薦</w:t>
             </w:r>
@@ -766,11 +769,11 @@
             </w:pPr>
             <w:r>
               <w:rPr>
-                <w:rFonts w:ascii="Yu Gothic" w:eastAsia="Yu Gothic" w:hAnsi="Yu Gothic"/>
+                <w:rFonts w:ascii="ＭＳ 明朝" w:eastAsia="ＭＳ 明朝" w:hAnsi="ＭＳ 明朝"/>
                 <w:b/>
                 <w:bCs/>
-                <w:sz w:val="19"/>
-                <w:szCs w:val="19"/>
+                <w:sz w:val="21"/>
+                <w:szCs w:val="21"/>
               </w:rPr>
               <w:t xml:space="preserve">後期</w:t>
             </w:r>
@@ -799,11 +802,11 @@
             </w:pPr>
             <w:r>
               <w:rPr>
-                <w:rFonts w:ascii="Yu Gothic" w:eastAsia="Yu Gothic" w:hAnsi="Yu Gothic"/>
-                <w:b w:val="false"/>
-                <w:bCs w:val="false"/>
-                <w:sz w:val="19"/>
-                <w:szCs w:val="19"/>
+                <w:rFonts w:ascii="ＭＳ 明朝" w:eastAsia="ＭＳ 明朝" w:hAnsi="ＭＳ 明朝"/>
+                <w:b w:val="false"/>
+                <w:bCs w:val="false"/>
+                <w:sz w:val="21"/>
+                <w:szCs w:val="21"/>
               </w:rPr>
               <w:t xml:space="preserve">11/11（水）～</w:t>
             </w:r>
@@ -814,11 +817,11 @@
             </w:pPr>
             <w:r>
               <w:rPr>
-                <w:rFonts w:ascii="Yu Gothic" w:eastAsia="Yu Gothic" w:hAnsi="Yu Gothic"/>
-                <w:b w:val="false"/>
-                <w:bCs w:val="false"/>
-                <w:sz w:val="19"/>
-                <w:szCs w:val="19"/>
+                <w:rFonts w:ascii="ＭＳ 明朝" w:eastAsia="ＭＳ 明朝" w:hAnsi="ＭＳ 明朝"/>
+                <w:b w:val="false"/>
+                <w:bCs w:val="false"/>
+                <w:sz w:val="21"/>
+                <w:szCs w:val="21"/>
               </w:rPr>
               <w:t xml:space="preserve">11/25（水）</w:t>
             </w:r>
@@ -847,11 +850,11 @@
             </w:pPr>
             <w:r>
               <w:rPr>
-                <w:rFonts w:ascii="Yu Gothic" w:eastAsia="Yu Gothic" w:hAnsi="Yu Gothic"/>
-                <w:b w:val="false"/>
-                <w:bCs w:val="false"/>
-                <w:sz w:val="19"/>
-                <w:szCs w:val="19"/>
+                <w:rFonts w:ascii="ＭＳ 明朝" w:eastAsia="ＭＳ 明朝" w:hAnsi="ＭＳ 明朝"/>
+                <w:b w:val="false"/>
+                <w:bCs w:val="false"/>
+                <w:sz w:val="21"/>
+                <w:szCs w:val="21"/>
               </w:rPr>
               <w:t xml:space="preserve">12/6（日）</w:t>
             </w:r>
@@ -880,11 +883,11 @@
             </w:pPr>
             <w:r>
               <w:rPr>
-                <w:rFonts w:ascii="Yu Gothic" w:eastAsia="Yu Gothic" w:hAnsi="Yu Gothic"/>
-                <w:b w:val="false"/>
-                <w:bCs w:val="false"/>
-                <w:sz w:val="19"/>
-                <w:szCs w:val="19"/>
+                <w:rFonts w:ascii="ＭＳ 明朝" w:eastAsia="ＭＳ 明朝" w:hAnsi="ＭＳ 明朝"/>
+                <w:b w:val="false"/>
+                <w:bCs w:val="false"/>
+                <w:sz w:val="21"/>
+                <w:szCs w:val="21"/>
               </w:rPr>
               <w:t xml:space="preserve">12月中旬</w:t>
             </w:r>
@@ -913,11 +916,11 @@
             </w:pPr>
             <w:r>
               <w:rPr>
-                <w:rFonts w:ascii="Yu Gothic" w:eastAsia="Yu Gothic" w:hAnsi="Yu Gothic"/>
-                <w:b w:val="false"/>
-                <w:bCs w:val="false"/>
-                <w:sz w:val="19"/>
-                <w:szCs w:val="19"/>
+                <w:rFonts w:ascii="ＭＳ 明朝" w:eastAsia="ＭＳ 明朝" w:hAnsi="ＭＳ 明朝"/>
+                <w:b w:val="false"/>
+                <w:bCs w:val="false"/>
+                <w:sz w:val="21"/>
+                <w:szCs w:val="21"/>
               </w:rPr>
               <w:t xml:space="preserve">前期と同様（2科目選択）</w:t>
             </w:r>
@@ -953,11 +956,11 @@
             </w:pPr>
             <w:r>
               <w:rPr>
-                <w:rFonts w:ascii="Yu Gothic" w:eastAsia="Yu Gothic" w:hAnsi="Yu Gothic"/>
+                <w:rFonts w:ascii="ＭＳ 明朝" w:eastAsia="ＭＳ 明朝" w:hAnsi="ＭＳ 明朝"/>
                 <w:b/>
                 <w:bCs/>
-                <w:sz w:val="19"/>
-                <w:szCs w:val="19"/>
+                <w:sz w:val="21"/>
+                <w:szCs w:val="21"/>
               </w:rPr>
               <w:t xml:space="preserve">一般</w:t>
             </w:r>
@@ -969,11 +972,11 @@
             </w:pPr>
             <w:r>
               <w:rPr>
-                <w:rFonts w:ascii="Yu Gothic" w:eastAsia="Yu Gothic" w:hAnsi="Yu Gothic"/>
+                <w:rFonts w:ascii="ＭＳ 明朝" w:eastAsia="ＭＳ 明朝" w:hAnsi="ＭＳ 明朝"/>
                 <w:b/>
                 <w:bCs/>
-                <w:sz w:val="19"/>
-                <w:szCs w:val="19"/>
+                <w:sz w:val="21"/>
+                <w:szCs w:val="21"/>
               </w:rPr>
               <w:t xml:space="preserve">前期A・B</w:t>
             </w:r>
@@ -1002,11 +1005,11 @@
             </w:pPr>
             <w:r>
               <w:rPr>
-                <w:rFonts w:ascii="Yu Gothic" w:eastAsia="Yu Gothic" w:hAnsi="Yu Gothic"/>
-                <w:b w:val="false"/>
-                <w:bCs w:val="false"/>
-                <w:sz w:val="19"/>
-                <w:szCs w:val="19"/>
+                <w:rFonts w:ascii="ＭＳ 明朝" w:eastAsia="ＭＳ 明朝" w:hAnsi="ＭＳ 明朝"/>
+                <w:b w:val="false"/>
+                <w:bCs w:val="false"/>
+                <w:sz w:val="21"/>
+                <w:szCs w:val="21"/>
               </w:rPr>
               <w:t xml:space="preserve">12/14（月）～</w:t>
             </w:r>
@@ -1017,11 +1020,11 @@
             </w:pPr>
             <w:r>
               <w:rPr>
-                <w:rFonts w:ascii="Yu Gothic" w:eastAsia="Yu Gothic" w:hAnsi="Yu Gothic"/>
-                <w:b w:val="false"/>
-                <w:bCs w:val="false"/>
-                <w:sz w:val="19"/>
-                <w:szCs w:val="19"/>
+                <w:rFonts w:ascii="ＭＳ 明朝" w:eastAsia="ＭＳ 明朝" w:hAnsi="ＭＳ 明朝"/>
+                <w:b w:val="false"/>
+                <w:bCs w:val="false"/>
+                <w:sz w:val="21"/>
+                <w:szCs w:val="21"/>
               </w:rPr>
               <w:t xml:space="preserve">1/13（水）</w:t>
             </w:r>
@@ -1050,11 +1053,11 @@
             </w:pPr>
             <w:r>
               <w:rPr>
-                <w:rFonts w:ascii="Yu Gothic" w:eastAsia="Yu Gothic" w:hAnsi="Yu Gothic"/>
-                <w:b w:val="false"/>
-                <w:bCs w:val="false"/>
-                <w:sz w:val="19"/>
-                <w:szCs w:val="19"/>
+                <w:rFonts w:ascii="ＭＳ 明朝" w:eastAsia="ＭＳ 明朝" w:hAnsi="ＭＳ 明朝"/>
+                <w:b w:val="false"/>
+                <w:bCs w:val="false"/>
+                <w:sz w:val="21"/>
+                <w:szCs w:val="21"/>
               </w:rPr>
               <w:t xml:space="preserve">A：1/23（土）</w:t>
             </w:r>
@@ -1065,11 +1068,11 @@
             </w:pPr>
             <w:r>
               <w:rPr>
-                <w:rFonts w:ascii="Yu Gothic" w:eastAsia="Yu Gothic" w:hAnsi="Yu Gothic"/>
-                <w:b w:val="false"/>
-                <w:bCs w:val="false"/>
-                <w:sz w:val="19"/>
-                <w:szCs w:val="19"/>
+                <w:rFonts w:ascii="ＭＳ 明朝" w:eastAsia="ＭＳ 明朝" w:hAnsi="ＭＳ 明朝"/>
+                <w:b w:val="false"/>
+                <w:bCs w:val="false"/>
+                <w:sz w:val="21"/>
+                <w:szCs w:val="21"/>
               </w:rPr>
               <w:t xml:space="preserve">B：1/24（日）</w:t>
             </w:r>
@@ -1098,11 +1101,11 @@
             </w:pPr>
             <w:r>
               <w:rPr>
-                <w:rFonts w:ascii="Yu Gothic" w:eastAsia="Yu Gothic" w:hAnsi="Yu Gothic"/>
-                <w:b w:val="false"/>
-                <w:bCs w:val="false"/>
-                <w:sz w:val="19"/>
-                <w:szCs w:val="19"/>
+                <w:rFonts w:ascii="ＭＳ 明朝" w:eastAsia="ＭＳ 明朝" w:hAnsi="ＭＳ 明朝"/>
+                <w:b w:val="false"/>
+                <w:bCs w:val="false"/>
+                <w:sz w:val="21"/>
+                <w:szCs w:val="21"/>
               </w:rPr>
               <w:t xml:space="preserve">1/31（日）</w:t>
             </w:r>
@@ -1131,11 +1134,11 @@
             </w:pPr>
             <w:r>
               <w:rPr>
-                <w:rFonts w:ascii="Yu Gothic" w:eastAsia="Yu Gothic" w:hAnsi="Yu Gothic"/>
-                <w:b w:val="false"/>
-                <w:bCs w:val="false"/>
-                <w:sz w:val="19"/>
-                <w:szCs w:val="19"/>
+                <w:rFonts w:ascii="ＭＳ 明朝" w:eastAsia="ＭＳ 明朝" w:hAnsi="ＭＳ 明朝"/>
+                <w:b w:val="false"/>
+                <w:bCs w:val="false"/>
+                <w:sz w:val="21"/>
+                <w:szCs w:val="21"/>
               </w:rPr>
               <w:t xml:space="preserve">英語＋国語・日本史など</w:t>
             </w:r>
@@ -1146,11 +1149,11 @@
             </w:pPr>
             <w:r>
               <w:rPr>
-                <w:rFonts w:ascii="Yu Gothic" w:eastAsia="Yu Gothic" w:hAnsi="Yu Gothic"/>
-                <w:b w:val="false"/>
-                <w:bCs w:val="false"/>
-                <w:sz w:val="19"/>
-                <w:szCs w:val="19"/>
+                <w:rFonts w:ascii="ＭＳ 明朝" w:eastAsia="ＭＳ 明朝" w:hAnsi="ＭＳ 明朝"/>
+                <w:b w:val="false"/>
+                <w:bCs w:val="false"/>
+                <w:sz w:val="21"/>
+                <w:szCs w:val="21"/>
               </w:rPr>
               <w:t xml:space="preserve">（2科目型／3科目型）</w:t>
             </w:r>
@@ -1186,11 +1189,11 @@
             </w:pPr>
             <w:r>
               <w:rPr>
-                <w:rFonts w:ascii="Yu Gothic" w:eastAsia="Yu Gothic" w:hAnsi="Yu Gothic"/>
+                <w:rFonts w:ascii="ＭＳ 明朝" w:eastAsia="ＭＳ 明朝" w:hAnsi="ＭＳ 明朝"/>
                 <w:b/>
                 <w:bCs/>
-                <w:sz w:val="19"/>
-                <w:szCs w:val="19"/>
+                <w:sz w:val="21"/>
+                <w:szCs w:val="21"/>
               </w:rPr>
               <w:t xml:space="preserve">一般</w:t>
             </w:r>
@@ -1202,11 +1205,11 @@
             </w:pPr>
             <w:r>
               <w:rPr>
-                <w:rFonts w:ascii="Yu Gothic" w:eastAsia="Yu Gothic" w:hAnsi="Yu Gothic"/>
+                <w:rFonts w:ascii="ＭＳ 明朝" w:eastAsia="ＭＳ 明朝" w:hAnsi="ＭＳ 明朝"/>
                 <w:b/>
                 <w:bCs/>
-                <w:sz w:val="19"/>
-                <w:szCs w:val="19"/>
+                <w:sz w:val="21"/>
+                <w:szCs w:val="21"/>
               </w:rPr>
               <w:t xml:space="preserve">前期C</w:t>
             </w:r>
@@ -1235,11 +1238,11 @@
             </w:pPr>
             <w:r>
               <w:rPr>
-                <w:rFonts w:ascii="Yu Gothic" w:eastAsia="Yu Gothic" w:hAnsi="Yu Gothic"/>
-                <w:b w:val="false"/>
-                <w:bCs w:val="false"/>
-                <w:sz w:val="19"/>
-                <w:szCs w:val="19"/>
+                <w:rFonts w:ascii="ＭＳ 明朝" w:eastAsia="ＭＳ 明朝" w:hAnsi="ＭＳ 明朝"/>
+                <w:b w:val="false"/>
+                <w:bCs w:val="false"/>
+                <w:sz w:val="21"/>
+                <w:szCs w:val="21"/>
               </w:rPr>
               <w:t xml:space="preserve">1/14（木）～</w:t>
             </w:r>
@@ -1250,11 +1253,11 @@
             </w:pPr>
             <w:r>
               <w:rPr>
-                <w:rFonts w:ascii="Yu Gothic" w:eastAsia="Yu Gothic" w:hAnsi="Yu Gothic"/>
-                <w:b w:val="false"/>
-                <w:bCs w:val="false"/>
-                <w:sz w:val="19"/>
-                <w:szCs w:val="19"/>
+                <w:rFonts w:ascii="ＭＳ 明朝" w:eastAsia="ＭＳ 明朝" w:hAnsi="ＭＳ 明朝"/>
+                <w:b w:val="false"/>
+                <w:bCs w:val="false"/>
+                <w:sz w:val="21"/>
+                <w:szCs w:val="21"/>
               </w:rPr>
               <w:t xml:space="preserve">2/4（木）</w:t>
             </w:r>
@@ -1283,11 +1286,11 @@
             </w:pPr>
             <w:r>
               <w:rPr>
-                <w:rFonts w:ascii="Yu Gothic" w:eastAsia="Yu Gothic" w:hAnsi="Yu Gothic"/>
-                <w:b w:val="false"/>
-                <w:bCs w:val="false"/>
-                <w:sz w:val="19"/>
-                <w:szCs w:val="19"/>
+                <w:rFonts w:ascii="ＭＳ 明朝" w:eastAsia="ＭＳ 明朝" w:hAnsi="ＭＳ 明朝"/>
+                <w:b w:val="false"/>
+                <w:bCs w:val="false"/>
+                <w:sz w:val="21"/>
+                <w:szCs w:val="21"/>
               </w:rPr>
               <w:t xml:space="preserve">2/13（土）</w:t>
             </w:r>
@@ -1316,11 +1319,11 @@
             </w:pPr>
             <w:r>
               <w:rPr>
-                <w:rFonts w:ascii="Yu Gothic" w:eastAsia="Yu Gothic" w:hAnsi="Yu Gothic"/>
-                <w:b w:val="false"/>
-                <w:bCs w:val="false"/>
-                <w:sz w:val="19"/>
-                <w:szCs w:val="19"/>
+                <w:rFonts w:ascii="ＭＳ 明朝" w:eastAsia="ＭＳ 明朝" w:hAnsi="ＭＳ 明朝"/>
+                <w:b w:val="false"/>
+                <w:bCs w:val="false"/>
+                <w:sz w:val="21"/>
+                <w:szCs w:val="21"/>
               </w:rPr>
               <w:t xml:space="preserve">2/21（日）</w:t>
             </w:r>
@@ -1349,11 +1352,11 @@
             </w:pPr>
             <w:r>
               <w:rPr>
-                <w:rFonts w:ascii="Yu Gothic" w:eastAsia="Yu Gothic" w:hAnsi="Yu Gothic"/>
-                <w:b w:val="false"/>
-                <w:bCs w:val="false"/>
-                <w:sz w:val="19"/>
-                <w:szCs w:val="19"/>
+                <w:rFonts w:ascii="ＭＳ 明朝" w:eastAsia="ＭＳ 明朝" w:hAnsi="ＭＳ 明朝"/>
+                <w:b w:val="false"/>
+                <w:bCs w:val="false"/>
+                <w:sz w:val="21"/>
+                <w:szCs w:val="21"/>
               </w:rPr>
               <w:t xml:space="preserve">英語＋選択科目</w:t>
             </w:r>
@@ -1389,11 +1392,11 @@
             </w:pPr>
             <w:r>
               <w:rPr>
-                <w:rFonts w:ascii="Yu Gothic" w:eastAsia="Yu Gothic" w:hAnsi="Yu Gothic"/>
+                <w:rFonts w:ascii="ＭＳ 明朝" w:eastAsia="ＭＳ 明朝" w:hAnsi="ＭＳ 明朝"/>
                 <w:b/>
                 <w:bCs/>
-                <w:sz w:val="19"/>
-                <w:szCs w:val="19"/>
+                <w:sz w:val="21"/>
+                <w:szCs w:val="21"/>
               </w:rPr>
               <w:t xml:space="preserve">一般</w:t>
             </w:r>
@@ -1405,11 +1408,11 @@
             </w:pPr>
             <w:r>
               <w:rPr>
-                <w:rFonts w:ascii="Yu Gothic" w:eastAsia="Yu Gothic" w:hAnsi="Yu Gothic"/>
+                <w:rFonts w:ascii="ＭＳ 明朝" w:eastAsia="ＭＳ 明朝" w:hAnsi="ＭＳ 明朝"/>
                 <w:b/>
                 <w:bCs/>
-                <w:sz w:val="19"/>
-                <w:szCs w:val="19"/>
+                <w:sz w:val="21"/>
+                <w:szCs w:val="21"/>
               </w:rPr>
               <w:t xml:space="preserve">後期</w:t>
             </w:r>
@@ -1438,11 +1441,11 @@
             </w:pPr>
             <w:r>
               <w:rPr>
-                <w:rFonts w:ascii="Yu Gothic" w:eastAsia="Yu Gothic" w:hAnsi="Yu Gothic"/>
-                <w:b w:val="false"/>
-                <w:bCs w:val="false"/>
-                <w:sz w:val="19"/>
-                <w:szCs w:val="19"/>
+                <w:rFonts w:ascii="ＭＳ 明朝" w:eastAsia="ＭＳ 明朝" w:hAnsi="ＭＳ 明朝"/>
+                <w:b w:val="false"/>
+                <w:bCs w:val="false"/>
+                <w:sz w:val="21"/>
+                <w:szCs w:val="21"/>
               </w:rPr>
               <w:t xml:space="preserve">2/10（水）～</w:t>
             </w:r>
@@ -1453,11 +1456,11 @@
             </w:pPr>
             <w:r>
               <w:rPr>
-                <w:rFonts w:ascii="Yu Gothic" w:eastAsia="Yu Gothic" w:hAnsi="Yu Gothic"/>
-                <w:b w:val="false"/>
-                <w:bCs w:val="false"/>
-                <w:sz w:val="19"/>
-                <w:szCs w:val="19"/>
+                <w:rFonts w:ascii="ＭＳ 明朝" w:eastAsia="ＭＳ 明朝" w:hAnsi="ＭＳ 明朝"/>
+                <w:b w:val="false"/>
+                <w:bCs w:val="false"/>
+                <w:sz w:val="21"/>
+                <w:szCs w:val="21"/>
               </w:rPr>
               <w:t xml:space="preserve">2/24（水）</w:t>
             </w:r>
@@ -1486,11 +1489,11 @@
             </w:pPr>
             <w:r>
               <w:rPr>
-                <w:rFonts w:ascii="Yu Gothic" w:eastAsia="Yu Gothic" w:hAnsi="Yu Gothic"/>
-                <w:b w:val="false"/>
-                <w:bCs w:val="false"/>
-                <w:sz w:val="19"/>
-                <w:szCs w:val="19"/>
+                <w:rFonts w:ascii="ＭＳ 明朝" w:eastAsia="ＭＳ 明朝" w:hAnsi="ＭＳ 明朝"/>
+                <w:b w:val="false"/>
+                <w:bCs w:val="false"/>
+                <w:sz w:val="21"/>
+                <w:szCs w:val="21"/>
               </w:rPr>
               <w:t xml:space="preserve">3/7（日）</w:t>
             </w:r>
@@ -1519,11 +1522,11 @@
             </w:pPr>
             <w:r>
               <w:rPr>
-                <w:rFonts w:ascii="Yu Gothic" w:eastAsia="Yu Gothic" w:hAnsi="Yu Gothic"/>
-                <w:b w:val="false"/>
-                <w:bCs w:val="false"/>
-                <w:sz w:val="19"/>
-                <w:szCs w:val="19"/>
+                <w:rFonts w:ascii="ＭＳ 明朝" w:eastAsia="ＭＳ 明朝" w:hAnsi="ＭＳ 明朝"/>
+                <w:b w:val="false"/>
+                <w:bCs w:val="false"/>
+                <w:sz w:val="21"/>
+                <w:szCs w:val="21"/>
               </w:rPr>
               <w:t xml:space="preserve">3/14（日）</w:t>
             </w:r>
@@ -1552,11 +1555,11 @@
             </w:pPr>
             <w:r>
               <w:rPr>
-                <w:rFonts w:ascii="Yu Gothic" w:eastAsia="Yu Gothic" w:hAnsi="Yu Gothic"/>
-                <w:b w:val="false"/>
-                <w:bCs w:val="false"/>
-                <w:sz w:val="19"/>
-                <w:szCs w:val="19"/>
+                <w:rFonts w:ascii="ＭＳ 明朝" w:eastAsia="ＭＳ 明朝" w:hAnsi="ＭＳ 明朝"/>
+                <w:b w:val="false"/>
+                <w:bCs w:val="false"/>
+                <w:sz w:val="21"/>
+                <w:szCs w:val="21"/>
               </w:rPr>
               <w:t xml:space="preserve">要項で確認（募集人数少）</w:t>
             </w:r>
@@ -1570,15 +1573,16 @@
       </w:pPr>
       <w:r>
         <w:rPr>
-          <w:rFonts w:ascii="Yu Gothic" w:eastAsia="Yu Gothic" w:hAnsi="Yu Gothic"/>
-          <w:sz w:val="19"/>
-          <w:szCs w:val="19"/>
+          <w:rFonts w:ascii="ＭＳ 明朝" w:eastAsia="ＭＳ 明朝" w:hAnsi="ＭＳ 明朝"/>
+          <w:sz w:val="21"/>
+          <w:szCs w:val="21"/>
         </w:rPr>
         <w:t xml:space="preserve">ポイント：公募・一般ともに得意な2科目を選べるため、英語＋国語に絞った対策が有効です。</w:t>
       </w:r>
     </w:p>
     <w:p>
       <w:pPr>
+        <w:keepNext/>
         <w:pBdr>
           <w:bottom w:val="single" w:color="1F4E79" w:sz="8" w:space="2"/>
         </w:pBdr>
@@ -1586,12 +1590,12 @@
       </w:pPr>
       <w:r>
         <w:rPr>
-          <w:rFonts w:ascii="Yu Gothic" w:eastAsia="Yu Gothic" w:hAnsi="Yu Gothic"/>
+          <w:rFonts w:ascii="ＭＳ 明朝" w:eastAsia="ＭＳ 明朝" w:hAnsi="ＭＳ 明朝"/>
           <w:b/>
           <w:bCs/>
           <w:color w:val="1F4E79"/>
-          <w:sz w:val="23"/>
-          <w:szCs w:val="23"/>
+          <w:sz w:val="21"/>
+          <w:szCs w:val="21"/>
         </w:rPr>
         <w:t xml:space="preserve">② 神戸学院大学</w:t>
       </w:r>
@@ -1644,12 +1648,12 @@
             </w:pPr>
             <w:r>
               <w:rPr>
-                <w:rFonts w:ascii="Yu Gothic" w:eastAsia="Yu Gothic" w:hAnsi="Yu Gothic"/>
+                <w:rFonts w:ascii="ＭＳ 明朝" w:eastAsia="ＭＳ 明朝" w:hAnsi="ＭＳ 明朝"/>
                 <w:b/>
                 <w:bCs/>
                 <w:color w:val="FFFFFF"/>
-                <w:sz w:val="19"/>
-                <w:szCs w:val="19"/>
+                <w:sz w:val="21"/>
+                <w:szCs w:val="21"/>
               </w:rPr>
               <w:t xml:space="preserve">入試区分</w:t>
             </w:r>
@@ -1680,12 +1684,12 @@
             </w:pPr>
             <w:r>
               <w:rPr>
-                <w:rFonts w:ascii="Yu Gothic" w:eastAsia="Yu Gothic" w:hAnsi="Yu Gothic"/>
+                <w:rFonts w:ascii="ＭＳ 明朝" w:eastAsia="ＭＳ 明朝" w:hAnsi="ＭＳ 明朝"/>
                 <w:b/>
                 <w:bCs/>
                 <w:color w:val="FFFFFF"/>
-                <w:sz w:val="19"/>
-                <w:szCs w:val="19"/>
+                <w:sz w:val="21"/>
+                <w:szCs w:val="21"/>
               </w:rPr>
               <w:t xml:space="preserve">出願期間</w:t>
             </w:r>
@@ -1716,12 +1720,12 @@
             </w:pPr>
             <w:r>
               <w:rPr>
-                <w:rFonts w:ascii="Yu Gothic" w:eastAsia="Yu Gothic" w:hAnsi="Yu Gothic"/>
+                <w:rFonts w:ascii="ＭＳ 明朝" w:eastAsia="ＭＳ 明朝" w:hAnsi="ＭＳ 明朝"/>
                 <w:b/>
                 <w:bCs/>
                 <w:color w:val="FFFFFF"/>
-                <w:sz w:val="19"/>
-                <w:szCs w:val="19"/>
+                <w:sz w:val="21"/>
+                <w:szCs w:val="21"/>
               </w:rPr>
               <w:t xml:space="preserve">試験日</w:t>
             </w:r>
@@ -1752,12 +1756,12 @@
             </w:pPr>
             <w:r>
               <w:rPr>
-                <w:rFonts w:ascii="Yu Gothic" w:eastAsia="Yu Gothic" w:hAnsi="Yu Gothic"/>
+                <w:rFonts w:ascii="ＭＳ 明朝" w:eastAsia="ＭＳ 明朝" w:hAnsi="ＭＳ 明朝"/>
                 <w:b/>
                 <w:bCs/>
                 <w:color w:val="FFFFFF"/>
-                <w:sz w:val="19"/>
-                <w:szCs w:val="19"/>
+                <w:sz w:val="21"/>
+                <w:szCs w:val="21"/>
               </w:rPr>
               <w:t xml:space="preserve">合格発表</w:t>
             </w:r>
@@ -1788,12 +1792,12 @@
             </w:pPr>
             <w:r>
               <w:rPr>
-                <w:rFonts w:ascii="Yu Gothic" w:eastAsia="Yu Gothic" w:hAnsi="Yu Gothic"/>
+                <w:rFonts w:ascii="ＭＳ 明朝" w:eastAsia="ＭＳ 明朝" w:hAnsi="ＭＳ 明朝"/>
                 <w:b/>
                 <w:bCs/>
                 <w:color w:val="FFFFFF"/>
-                <w:sz w:val="19"/>
-                <w:szCs w:val="19"/>
+                <w:sz w:val="21"/>
+                <w:szCs w:val="21"/>
               </w:rPr>
               <w:t xml:space="preserve">試験科目・形式</w:t>
             </w:r>
@@ -1829,11 +1833,11 @@
             </w:pPr>
             <w:r>
               <w:rPr>
-                <w:rFonts w:ascii="Yu Gothic" w:eastAsia="Yu Gothic" w:hAnsi="Yu Gothic"/>
+                <w:rFonts w:ascii="ＭＳ 明朝" w:eastAsia="ＭＳ 明朝" w:hAnsi="ＭＳ 明朝"/>
                 <w:b/>
                 <w:bCs/>
-                <w:sz w:val="19"/>
-                <w:szCs w:val="19"/>
+                <w:sz w:val="21"/>
+                <w:szCs w:val="21"/>
               </w:rPr>
               <w:t xml:space="preserve">公募推薦</w:t>
             </w:r>
@@ -1845,11 +1849,11 @@
             </w:pPr>
             <w:r>
               <w:rPr>
-                <w:rFonts w:ascii="Yu Gothic" w:eastAsia="Yu Gothic" w:hAnsi="Yu Gothic"/>
+                <w:rFonts w:ascii="ＭＳ 明朝" w:eastAsia="ＭＳ 明朝" w:hAnsi="ＭＳ 明朝"/>
                 <w:b/>
                 <w:bCs/>
-                <w:sz w:val="19"/>
-                <w:szCs w:val="19"/>
+                <w:sz w:val="21"/>
+                <w:szCs w:val="21"/>
               </w:rPr>
               <w:t xml:space="preserve">（基礎評価型）</w:t>
             </w:r>
@@ -1878,11 +1882,11 @@
             </w:pPr>
             <w:r>
               <w:rPr>
-                <w:rFonts w:ascii="Yu Gothic" w:eastAsia="Yu Gothic" w:hAnsi="Yu Gothic"/>
-                <w:b w:val="false"/>
-                <w:bCs w:val="false"/>
-                <w:sz w:val="19"/>
-                <w:szCs w:val="19"/>
+                <w:rFonts w:ascii="ＭＳ 明朝" w:eastAsia="ＭＳ 明朝" w:hAnsi="ＭＳ 明朝"/>
+                <w:b w:val="false"/>
+                <w:bCs w:val="false"/>
+                <w:sz w:val="21"/>
+                <w:szCs w:val="21"/>
               </w:rPr>
               <w:t xml:space="preserve">11/2（月）～</w:t>
             </w:r>
@@ -1893,11 +1897,11 @@
             </w:pPr>
             <w:r>
               <w:rPr>
-                <w:rFonts w:ascii="Yu Gothic" w:eastAsia="Yu Gothic" w:hAnsi="Yu Gothic"/>
-                <w:b w:val="false"/>
-                <w:bCs w:val="false"/>
-                <w:sz w:val="19"/>
-                <w:szCs w:val="19"/>
+                <w:rFonts w:ascii="ＭＳ 明朝" w:eastAsia="ＭＳ 明朝" w:hAnsi="ＭＳ 明朝"/>
+                <w:b w:val="false"/>
+                <w:bCs w:val="false"/>
+                <w:sz w:val="21"/>
+                <w:szCs w:val="21"/>
               </w:rPr>
               <w:t xml:space="preserve">11/10（火）</w:t>
             </w:r>
@@ -1926,11 +1930,11 @@
             </w:pPr>
             <w:r>
               <w:rPr>
-                <w:rFonts w:ascii="Yu Gothic" w:eastAsia="Yu Gothic" w:hAnsi="Yu Gothic"/>
-                <w:b w:val="false"/>
-                <w:bCs w:val="false"/>
-                <w:sz w:val="19"/>
-                <w:szCs w:val="19"/>
+                <w:rFonts w:ascii="ＭＳ 明朝" w:eastAsia="ＭＳ 明朝" w:hAnsi="ＭＳ 明朝"/>
+                <w:b w:val="false"/>
+                <w:bCs w:val="false"/>
+                <w:sz w:val="21"/>
+                <w:szCs w:val="21"/>
               </w:rPr>
               <w:t xml:space="preserve">11/21（土）</w:t>
             </w:r>
@@ -1941,11 +1945,11 @@
             </w:pPr>
             <w:r>
               <w:rPr>
-                <w:rFonts w:ascii="Yu Gothic" w:eastAsia="Yu Gothic" w:hAnsi="Yu Gothic"/>
-                <w:b w:val="false"/>
-                <w:bCs w:val="false"/>
-                <w:sz w:val="19"/>
-                <w:szCs w:val="19"/>
+                <w:rFonts w:ascii="ＭＳ 明朝" w:eastAsia="ＭＳ 明朝" w:hAnsi="ＭＳ 明朝"/>
+                <w:b w:val="false"/>
+                <w:bCs w:val="false"/>
+                <w:sz w:val="21"/>
+                <w:szCs w:val="21"/>
               </w:rPr>
               <w:t xml:space="preserve">11/22（日）</w:t>
             </w:r>
@@ -1956,11 +1960,11 @@
             </w:pPr>
             <w:r>
               <w:rPr>
-                <w:rFonts w:ascii="Yu Gothic" w:eastAsia="Yu Gothic" w:hAnsi="Yu Gothic"/>
-                <w:b w:val="false"/>
-                <w:bCs w:val="false"/>
-                <w:sz w:val="19"/>
-                <w:szCs w:val="19"/>
+                <w:rFonts w:ascii="ＭＳ 明朝" w:eastAsia="ＭＳ 明朝" w:hAnsi="ＭＳ 明朝"/>
+                <w:b w:val="false"/>
+                <w:bCs w:val="false"/>
+                <w:sz w:val="21"/>
+                <w:szCs w:val="21"/>
               </w:rPr>
               <w:t xml:space="preserve">※日程選択可</w:t>
             </w:r>
@@ -1989,11 +1993,11 @@
             </w:pPr>
             <w:r>
               <w:rPr>
-                <w:rFonts w:ascii="Yu Gothic" w:eastAsia="Yu Gothic" w:hAnsi="Yu Gothic"/>
-                <w:b w:val="false"/>
-                <w:bCs w:val="false"/>
-                <w:sz w:val="19"/>
-                <w:szCs w:val="19"/>
+                <w:rFonts w:ascii="ＭＳ 明朝" w:eastAsia="ＭＳ 明朝" w:hAnsi="ＭＳ 明朝"/>
+                <w:b w:val="false"/>
+                <w:bCs w:val="false"/>
+                <w:sz w:val="21"/>
+                <w:szCs w:val="21"/>
               </w:rPr>
               <w:t xml:space="preserve">12/2（水）</w:t>
             </w:r>
@@ -2022,11 +2026,11 @@
             </w:pPr>
             <w:r>
               <w:rPr>
-                <w:rFonts w:ascii="Yu Gothic" w:eastAsia="Yu Gothic" w:hAnsi="Yu Gothic"/>
-                <w:b w:val="false"/>
-                <w:bCs w:val="false"/>
-                <w:sz w:val="19"/>
-                <w:szCs w:val="19"/>
+                <w:rFonts w:ascii="ＭＳ 明朝" w:eastAsia="ＭＳ 明朝" w:hAnsi="ＭＳ 明朝"/>
+                <w:b w:val="false"/>
+                <w:bCs w:val="false"/>
+                <w:sz w:val="21"/>
+                <w:szCs w:val="21"/>
               </w:rPr>
               <w:t xml:space="preserve">英語（100点）＋国語または数学Ⅰ・A（100点）</w:t>
             </w:r>
@@ -2037,11 +2041,11 @@
             </w:pPr>
             <w:r>
               <w:rPr>
-                <w:rFonts w:ascii="Yu Gothic" w:eastAsia="Yu Gothic" w:hAnsi="Yu Gothic"/>
-                <w:b w:val="false"/>
-                <w:bCs w:val="false"/>
-                <w:sz w:val="19"/>
-                <w:szCs w:val="19"/>
+                <w:rFonts w:ascii="ＭＳ 明朝" w:eastAsia="ＭＳ 明朝" w:hAnsi="ＭＳ 明朝"/>
+                <w:b w:val="false"/>
+                <w:bCs w:val="false"/>
+                <w:sz w:val="21"/>
+                <w:szCs w:val="21"/>
               </w:rPr>
               <w:t xml:space="preserve">マーク式</w:t>
             </w:r>
@@ -2052,11 +2056,11 @@
             </w:pPr>
             <w:r>
               <w:rPr>
-                <w:rFonts w:ascii="Yu Gothic" w:eastAsia="Yu Gothic" w:hAnsi="Yu Gothic"/>
-                <w:b w:val="false"/>
-                <w:bCs w:val="false"/>
-                <w:sz w:val="19"/>
-                <w:szCs w:val="19"/>
+                <w:rFonts w:ascii="ＭＳ 明朝" w:eastAsia="ＭＳ 明朝" w:hAnsi="ＭＳ 明朝"/>
+                <w:b w:val="false"/>
+                <w:bCs w:val="false"/>
+                <w:sz w:val="21"/>
+                <w:szCs w:val="21"/>
               </w:rPr>
               <w:t xml:space="preserve">※学部により異なる</w:t>
             </w:r>
@@ -2092,11 +2096,11 @@
             </w:pPr>
             <w:r>
               <w:rPr>
-                <w:rFonts w:ascii="Yu Gothic" w:eastAsia="Yu Gothic" w:hAnsi="Yu Gothic"/>
+                <w:rFonts w:ascii="ＭＳ 明朝" w:eastAsia="ＭＳ 明朝" w:hAnsi="ＭＳ 明朝"/>
                 <w:b/>
                 <w:bCs/>
-                <w:sz w:val="19"/>
-                <w:szCs w:val="19"/>
+                <w:sz w:val="21"/>
+                <w:szCs w:val="21"/>
               </w:rPr>
               <w:t xml:space="preserve">一般</w:t>
             </w:r>
@@ -2108,11 +2112,11 @@
             </w:pPr>
             <w:r>
               <w:rPr>
-                <w:rFonts w:ascii="Yu Gothic" w:eastAsia="Yu Gothic" w:hAnsi="Yu Gothic"/>
+                <w:rFonts w:ascii="ＭＳ 明朝" w:eastAsia="ＭＳ 明朝" w:hAnsi="ＭＳ 明朝"/>
                 <w:b/>
                 <w:bCs/>
-                <w:sz w:val="19"/>
-                <w:szCs w:val="19"/>
+                <w:sz w:val="21"/>
+                <w:szCs w:val="21"/>
               </w:rPr>
               <w:t xml:space="preserve">前期日程</w:t>
             </w:r>
@@ -2141,11 +2145,11 @@
             </w:pPr>
             <w:r>
               <w:rPr>
-                <w:rFonts w:ascii="Yu Gothic" w:eastAsia="Yu Gothic" w:hAnsi="Yu Gothic"/>
-                <w:b w:val="false"/>
-                <w:bCs w:val="false"/>
-                <w:sz w:val="19"/>
-                <w:szCs w:val="19"/>
+                <w:rFonts w:ascii="ＭＳ 明朝" w:eastAsia="ＭＳ 明朝" w:hAnsi="ＭＳ 明朝"/>
+                <w:b w:val="false"/>
+                <w:bCs w:val="false"/>
+                <w:sz w:val="21"/>
+                <w:szCs w:val="21"/>
               </w:rPr>
               <w:t xml:space="preserve">12/14（月）～</w:t>
             </w:r>
@@ -2156,11 +2160,11 @@
             </w:pPr>
             <w:r>
               <w:rPr>
-                <w:rFonts w:ascii="Yu Gothic" w:eastAsia="Yu Gothic" w:hAnsi="Yu Gothic"/>
-                <w:b w:val="false"/>
-                <w:bCs w:val="false"/>
-                <w:sz w:val="19"/>
-                <w:szCs w:val="19"/>
+                <w:rFonts w:ascii="ＭＳ 明朝" w:eastAsia="ＭＳ 明朝" w:hAnsi="ＭＳ 明朝"/>
+                <w:b w:val="false"/>
+                <w:bCs w:val="false"/>
+                <w:sz w:val="21"/>
+                <w:szCs w:val="21"/>
               </w:rPr>
               <w:t xml:space="preserve">1/18（月）</w:t>
             </w:r>
@@ -2189,11 +2193,11 @@
             </w:pPr>
             <w:r>
               <w:rPr>
-                <w:rFonts w:ascii="Yu Gothic" w:eastAsia="Yu Gothic" w:hAnsi="Yu Gothic"/>
-                <w:b w:val="false"/>
-                <w:bCs w:val="false"/>
-                <w:sz w:val="19"/>
-                <w:szCs w:val="19"/>
+                <w:rFonts w:ascii="ＭＳ 明朝" w:eastAsia="ＭＳ 明朝" w:hAnsi="ＭＳ 明朝"/>
+                <w:b w:val="false"/>
+                <w:bCs w:val="false"/>
+                <w:sz w:val="21"/>
+                <w:szCs w:val="21"/>
               </w:rPr>
               <w:t xml:space="preserve">2/1（月）</w:t>
             </w:r>
@@ -2204,11 +2208,11 @@
             </w:pPr>
             <w:r>
               <w:rPr>
-                <w:rFonts w:ascii="Yu Gothic" w:eastAsia="Yu Gothic" w:hAnsi="Yu Gothic"/>
-                <w:b w:val="false"/>
-                <w:bCs w:val="false"/>
-                <w:sz w:val="19"/>
-                <w:szCs w:val="19"/>
+                <w:rFonts w:ascii="ＭＳ 明朝" w:eastAsia="ＭＳ 明朝" w:hAnsi="ＭＳ 明朝"/>
+                <w:b w:val="false"/>
+                <w:bCs w:val="false"/>
+                <w:sz w:val="21"/>
+                <w:szCs w:val="21"/>
               </w:rPr>
               <w:t xml:space="preserve">2/2（火）</w:t>
             </w:r>
@@ -2219,11 +2223,11 @@
             </w:pPr>
             <w:r>
               <w:rPr>
-                <w:rFonts w:ascii="Yu Gothic" w:eastAsia="Yu Gothic" w:hAnsi="Yu Gothic"/>
-                <w:b w:val="false"/>
-                <w:bCs w:val="false"/>
-                <w:sz w:val="19"/>
-                <w:szCs w:val="19"/>
+                <w:rFonts w:ascii="ＭＳ 明朝" w:eastAsia="ＭＳ 明朝" w:hAnsi="ＭＳ 明朝"/>
+                <w:b w:val="false"/>
+                <w:bCs w:val="false"/>
+                <w:sz w:val="21"/>
+                <w:szCs w:val="21"/>
               </w:rPr>
               <w:t xml:space="preserve">※自由選択</w:t>
             </w:r>
@@ -2252,11 +2256,11 @@
             </w:pPr>
             <w:r>
               <w:rPr>
-                <w:rFonts w:ascii="Yu Gothic" w:eastAsia="Yu Gothic" w:hAnsi="Yu Gothic"/>
-                <w:b w:val="false"/>
-                <w:bCs w:val="false"/>
-                <w:sz w:val="19"/>
-                <w:szCs w:val="19"/>
+                <w:rFonts w:ascii="ＭＳ 明朝" w:eastAsia="ＭＳ 明朝" w:hAnsi="ＭＳ 明朝"/>
+                <w:b w:val="false"/>
+                <w:bCs w:val="false"/>
+                <w:sz w:val="21"/>
+                <w:szCs w:val="21"/>
               </w:rPr>
               <w:t xml:space="preserve">2月中旬</w:t>
             </w:r>
@@ -2285,11 +2289,11 @@
             </w:pPr>
             <w:r>
               <w:rPr>
-                <w:rFonts w:ascii="Yu Gothic" w:eastAsia="Yu Gothic" w:hAnsi="Yu Gothic"/>
-                <w:b w:val="false"/>
-                <w:bCs w:val="false"/>
-                <w:sz w:val="19"/>
-                <w:szCs w:val="19"/>
+                <w:rFonts w:ascii="ＭＳ 明朝" w:eastAsia="ＭＳ 明朝" w:hAnsi="ＭＳ 明朝"/>
+                <w:b w:val="false"/>
+                <w:bCs w:val="false"/>
+                <w:sz w:val="21"/>
+                <w:szCs w:val="21"/>
               </w:rPr>
               <w:t xml:space="preserve">英語・国語・地歴または数学</w:t>
             </w:r>
@@ -2300,11 +2304,11 @@
             </w:pPr>
             <w:r>
               <w:rPr>
-                <w:rFonts w:ascii="Yu Gothic" w:eastAsia="Yu Gothic" w:hAnsi="Yu Gothic"/>
-                <w:b w:val="false"/>
-                <w:bCs w:val="false"/>
-                <w:sz w:val="19"/>
-                <w:szCs w:val="19"/>
+                <w:rFonts w:ascii="ＭＳ 明朝" w:eastAsia="ＭＳ 明朝" w:hAnsi="ＭＳ 明朝"/>
+                <w:b w:val="false"/>
+                <w:bCs w:val="false"/>
+                <w:sz w:val="21"/>
+                <w:szCs w:val="21"/>
               </w:rPr>
               <w:t xml:space="preserve">（文系学部は3科目型が中心）</w:t>
             </w:r>
@@ -2340,11 +2344,11 @@
             </w:pPr>
             <w:r>
               <w:rPr>
-                <w:rFonts w:ascii="Yu Gothic" w:eastAsia="Yu Gothic" w:hAnsi="Yu Gothic"/>
+                <w:rFonts w:ascii="ＭＳ 明朝" w:eastAsia="ＭＳ 明朝" w:hAnsi="ＭＳ 明朝"/>
                 <w:b/>
                 <w:bCs/>
-                <w:sz w:val="19"/>
-                <w:szCs w:val="19"/>
+                <w:sz w:val="21"/>
+                <w:szCs w:val="21"/>
               </w:rPr>
               <w:t xml:space="preserve">一般</w:t>
             </w:r>
@@ -2356,11 +2360,11 @@
             </w:pPr>
             <w:r>
               <w:rPr>
-                <w:rFonts w:ascii="Yu Gothic" w:eastAsia="Yu Gothic" w:hAnsi="Yu Gothic"/>
+                <w:rFonts w:ascii="ＭＳ 明朝" w:eastAsia="ＭＳ 明朝" w:hAnsi="ＭＳ 明朝"/>
                 <w:b/>
                 <w:bCs/>
-                <w:sz w:val="19"/>
-                <w:szCs w:val="19"/>
+                <w:sz w:val="21"/>
+                <w:szCs w:val="21"/>
               </w:rPr>
               <w:t xml:space="preserve">中期・後期</w:t>
             </w:r>
@@ -2389,11 +2393,11 @@
             </w:pPr>
             <w:r>
               <w:rPr>
-                <w:rFonts w:ascii="Yu Gothic" w:eastAsia="Yu Gothic" w:hAnsi="Yu Gothic"/>
-                <w:b w:val="false"/>
-                <w:bCs w:val="false"/>
-                <w:sz w:val="19"/>
-                <w:szCs w:val="19"/>
+                <w:rFonts w:ascii="ＭＳ 明朝" w:eastAsia="ＭＳ 明朝" w:hAnsi="ＭＳ 明朝"/>
+                <w:b w:val="false"/>
+                <w:bCs w:val="false"/>
+                <w:sz w:val="21"/>
+                <w:szCs w:val="21"/>
               </w:rPr>
               <w:t xml:space="preserve">要項で確認</w:t>
             </w:r>
@@ -2422,11 +2426,11 @@
             </w:pPr>
             <w:r>
               <w:rPr>
-                <w:rFonts w:ascii="Yu Gothic" w:eastAsia="Yu Gothic" w:hAnsi="Yu Gothic"/>
-                <w:b w:val="false"/>
-                <w:bCs w:val="false"/>
-                <w:sz w:val="19"/>
-                <w:szCs w:val="19"/>
+                <w:rFonts w:ascii="ＭＳ 明朝" w:eastAsia="ＭＳ 明朝" w:hAnsi="ＭＳ 明朝"/>
+                <w:b w:val="false"/>
+                <w:bCs w:val="false"/>
+                <w:sz w:val="21"/>
+                <w:szCs w:val="21"/>
               </w:rPr>
               <w:t xml:space="preserve">2月下旬～</w:t>
             </w:r>
@@ -2437,11 +2441,11 @@
             </w:pPr>
             <w:r>
               <w:rPr>
-                <w:rFonts w:ascii="Yu Gothic" w:eastAsia="Yu Gothic" w:hAnsi="Yu Gothic"/>
-                <w:b w:val="false"/>
-                <w:bCs w:val="false"/>
-                <w:sz w:val="19"/>
-                <w:szCs w:val="19"/>
+                <w:rFonts w:ascii="ＭＳ 明朝" w:eastAsia="ＭＳ 明朝" w:hAnsi="ＭＳ 明朝"/>
+                <w:b w:val="false"/>
+                <w:bCs w:val="false"/>
+                <w:sz w:val="21"/>
+                <w:szCs w:val="21"/>
               </w:rPr>
               <w:t xml:space="preserve">3月（予定）</w:t>
             </w:r>
@@ -2470,11 +2474,11 @@
             </w:pPr>
             <w:r>
               <w:rPr>
-                <w:rFonts w:ascii="Yu Gothic" w:eastAsia="Yu Gothic" w:hAnsi="Yu Gothic"/>
-                <w:b w:val="false"/>
-                <w:bCs w:val="false"/>
-                <w:sz w:val="19"/>
-                <w:szCs w:val="19"/>
+                <w:rFonts w:ascii="ＭＳ 明朝" w:eastAsia="ＭＳ 明朝" w:hAnsi="ＭＳ 明朝"/>
+                <w:b w:val="false"/>
+                <w:bCs w:val="false"/>
+                <w:sz w:val="21"/>
+                <w:szCs w:val="21"/>
               </w:rPr>
               <w:t xml:space="preserve">要項で確認</w:t>
             </w:r>
@@ -2503,11 +2507,11 @@
             </w:pPr>
             <w:r>
               <w:rPr>
-                <w:rFonts w:ascii="Yu Gothic" w:eastAsia="Yu Gothic" w:hAnsi="Yu Gothic"/>
-                <w:b w:val="false"/>
-                <w:bCs w:val="false"/>
-                <w:sz w:val="19"/>
-                <w:szCs w:val="19"/>
+                <w:rFonts w:ascii="ＭＳ 明朝" w:eastAsia="ＭＳ 明朝" w:hAnsi="ＭＳ 明朝"/>
+                <w:b w:val="false"/>
+                <w:bCs w:val="false"/>
+                <w:sz w:val="21"/>
+                <w:szCs w:val="21"/>
               </w:rPr>
               <w:t xml:space="preserve">要項で確認（募集人数少）</w:t>
             </w:r>
@@ -2521,15 +2525,16 @@
       </w:pPr>
       <w:r>
         <w:rPr>
-          <w:rFonts w:ascii="Yu Gothic" w:eastAsia="Yu Gothic" w:hAnsi="Yu Gothic"/>
-          <w:sz w:val="19"/>
-          <w:szCs w:val="19"/>
+          <w:rFonts w:ascii="ＭＳ 明朝" w:eastAsia="ＭＳ 明朝" w:hAnsi="ＭＳ 明朝"/>
+          <w:sz w:val="21"/>
+          <w:szCs w:val="21"/>
         </w:rPr>
         <w:t xml:space="preserve">ポイント：公募推薦は2日間の日程から選べるうえ、同じ日に別の選考型も併願できます。一般前期は3科目型が中心なので、地歴（または数学）の準備も必要です。</w:t>
       </w:r>
     </w:p>
     <w:p>
       <w:pPr>
+        <w:keepNext/>
         <w:pBdr>
           <w:bottom w:val="single" w:color="1F4E79" w:sz="8" w:space="2"/>
         </w:pBdr>
@@ -2537,12 +2542,12 @@
       </w:pPr>
       <w:r>
         <w:rPr>
-          <w:rFonts w:ascii="Yu Gothic" w:eastAsia="Yu Gothic" w:hAnsi="Yu Gothic"/>
+          <w:rFonts w:ascii="ＭＳ 明朝" w:eastAsia="ＭＳ 明朝" w:hAnsi="ＭＳ 明朝"/>
           <w:b/>
           <w:bCs/>
           <w:color w:val="1F4E79"/>
-          <w:sz w:val="23"/>
-          <w:szCs w:val="23"/>
+          <w:sz w:val="21"/>
+          <w:szCs w:val="21"/>
         </w:rPr>
         <w:t xml:space="preserve">③ 武庫川大学（現：武庫川女子大学）</w:t>
       </w:r>
@@ -2595,12 +2600,12 @@
             </w:pPr>
             <w:r>
               <w:rPr>
-                <w:rFonts w:ascii="Yu Gothic" w:eastAsia="Yu Gothic" w:hAnsi="Yu Gothic"/>
+                <w:rFonts w:ascii="ＭＳ 明朝" w:eastAsia="ＭＳ 明朝" w:hAnsi="ＭＳ 明朝"/>
                 <w:b/>
                 <w:bCs/>
                 <w:color w:val="FFFFFF"/>
-                <w:sz w:val="19"/>
-                <w:szCs w:val="19"/>
+                <w:sz w:val="21"/>
+                <w:szCs w:val="21"/>
               </w:rPr>
               <w:t xml:space="preserve">入試区分</w:t>
             </w:r>
@@ -2631,12 +2636,12 @@
             </w:pPr>
             <w:r>
               <w:rPr>
-                <w:rFonts w:ascii="Yu Gothic" w:eastAsia="Yu Gothic" w:hAnsi="Yu Gothic"/>
+                <w:rFonts w:ascii="ＭＳ 明朝" w:eastAsia="ＭＳ 明朝" w:hAnsi="ＭＳ 明朝"/>
                 <w:b/>
                 <w:bCs/>
                 <w:color w:val="FFFFFF"/>
-                <w:sz w:val="19"/>
-                <w:szCs w:val="19"/>
+                <w:sz w:val="21"/>
+                <w:szCs w:val="21"/>
               </w:rPr>
               <w:t xml:space="preserve">出願期間</w:t>
             </w:r>
@@ -2667,12 +2672,12 @@
             </w:pPr>
             <w:r>
               <w:rPr>
-                <w:rFonts w:ascii="Yu Gothic" w:eastAsia="Yu Gothic" w:hAnsi="Yu Gothic"/>
+                <w:rFonts w:ascii="ＭＳ 明朝" w:eastAsia="ＭＳ 明朝" w:hAnsi="ＭＳ 明朝"/>
                 <w:b/>
                 <w:bCs/>
                 <w:color w:val="FFFFFF"/>
-                <w:sz w:val="19"/>
-                <w:szCs w:val="19"/>
+                <w:sz w:val="21"/>
+                <w:szCs w:val="21"/>
               </w:rPr>
               <w:t xml:space="preserve">試験日</w:t>
             </w:r>
@@ -2703,12 +2708,12 @@
             </w:pPr>
             <w:r>
               <w:rPr>
-                <w:rFonts w:ascii="Yu Gothic" w:eastAsia="Yu Gothic" w:hAnsi="Yu Gothic"/>
+                <w:rFonts w:ascii="ＭＳ 明朝" w:eastAsia="ＭＳ 明朝" w:hAnsi="ＭＳ 明朝"/>
                 <w:b/>
                 <w:bCs/>
                 <w:color w:val="FFFFFF"/>
-                <w:sz w:val="19"/>
-                <w:szCs w:val="19"/>
+                <w:sz w:val="21"/>
+                <w:szCs w:val="21"/>
               </w:rPr>
               <w:t xml:space="preserve">合格発表</w:t>
             </w:r>
@@ -2739,12 +2744,12 @@
             </w:pPr>
             <w:r>
               <w:rPr>
-                <w:rFonts w:ascii="Yu Gothic" w:eastAsia="Yu Gothic" w:hAnsi="Yu Gothic"/>
+                <w:rFonts w:ascii="ＭＳ 明朝" w:eastAsia="ＭＳ 明朝" w:hAnsi="ＭＳ 明朝"/>
                 <w:b/>
                 <w:bCs/>
                 <w:color w:val="FFFFFF"/>
-                <w:sz w:val="19"/>
-                <w:szCs w:val="19"/>
+                <w:sz w:val="21"/>
+                <w:szCs w:val="21"/>
               </w:rPr>
               <w:t xml:space="preserve">試験科目・形式</w:t>
             </w:r>
@@ -2780,11 +2785,11 @@
             </w:pPr>
             <w:r>
               <w:rPr>
-                <w:rFonts w:ascii="Yu Gothic" w:eastAsia="Yu Gothic" w:hAnsi="Yu Gothic"/>
+                <w:rFonts w:ascii="ＭＳ 明朝" w:eastAsia="ＭＳ 明朝" w:hAnsi="ＭＳ 明朝"/>
                 <w:b/>
                 <w:bCs/>
-                <w:sz w:val="19"/>
-                <w:szCs w:val="19"/>
+                <w:sz w:val="21"/>
+                <w:szCs w:val="21"/>
               </w:rPr>
               <w:t xml:space="preserve">公募推薦</w:t>
             </w:r>
@@ -2796,11 +2801,11 @@
             </w:pPr>
             <w:r>
               <w:rPr>
-                <w:rFonts w:ascii="Yu Gothic" w:eastAsia="Yu Gothic" w:hAnsi="Yu Gothic"/>
+                <w:rFonts w:ascii="ＭＳ 明朝" w:eastAsia="ＭＳ 明朝" w:hAnsi="ＭＳ 明朝"/>
                 <w:b/>
                 <w:bCs/>
-                <w:sz w:val="19"/>
-                <w:szCs w:val="19"/>
+                <w:sz w:val="21"/>
+                <w:szCs w:val="21"/>
               </w:rPr>
               <w:t xml:space="preserve">前期</w:t>
             </w:r>
@@ -2830,11 +2835,11 @@
             </w:pPr>
             <w:r>
               <w:rPr>
-                <w:rFonts w:ascii="Yu Gothic" w:eastAsia="Yu Gothic" w:hAnsi="Yu Gothic"/>
-                <w:b w:val="false"/>
-                <w:bCs w:val="false"/>
-                <w:sz w:val="19"/>
-                <w:szCs w:val="19"/>
+                <w:rFonts w:ascii="ＭＳ 明朝" w:eastAsia="ＭＳ 明朝" w:hAnsi="ＭＳ 明朝"/>
+                <w:b w:val="false"/>
+                <w:bCs w:val="false"/>
+                <w:sz w:val="21"/>
+                <w:szCs w:val="21"/>
               </w:rPr>
               <w:t xml:space="preserve">10/1（木）～</w:t>
             </w:r>
@@ -2845,11 +2850,11 @@
             </w:pPr>
             <w:r>
               <w:rPr>
-                <w:rFonts w:ascii="Yu Gothic" w:eastAsia="Yu Gothic" w:hAnsi="Yu Gothic"/>
-                <w:b w:val="false"/>
-                <w:bCs w:val="false"/>
-                <w:sz w:val="19"/>
-                <w:szCs w:val="19"/>
+                <w:rFonts w:ascii="ＭＳ 明朝" w:eastAsia="ＭＳ 明朝" w:hAnsi="ＭＳ 明朝"/>
+                <w:b w:val="false"/>
+                <w:bCs w:val="false"/>
+                <w:sz w:val="21"/>
+                <w:szCs w:val="21"/>
               </w:rPr>
               <w:t xml:space="preserve">10/21（水）</w:t>
             </w:r>
@@ -2879,11 +2884,11 @@
             </w:pPr>
             <w:r>
               <w:rPr>
-                <w:rFonts w:ascii="Yu Gothic" w:eastAsia="Yu Gothic" w:hAnsi="Yu Gothic"/>
-                <w:b w:val="false"/>
-                <w:bCs w:val="false"/>
-                <w:sz w:val="19"/>
-                <w:szCs w:val="19"/>
+                <w:rFonts w:ascii="ＭＳ 明朝" w:eastAsia="ＭＳ 明朝" w:hAnsi="ＭＳ 明朝"/>
+                <w:b w:val="false"/>
+                <w:bCs w:val="false"/>
+                <w:sz w:val="21"/>
+                <w:szCs w:val="21"/>
               </w:rPr>
               <w:t xml:space="preserve">11/3（火・祝）</w:t>
             </w:r>
@@ -2894,11 +2899,11 @@
             </w:pPr>
             <w:r>
               <w:rPr>
-                <w:rFonts w:ascii="Yu Gothic" w:eastAsia="Yu Gothic" w:hAnsi="Yu Gothic"/>
-                <w:b w:val="false"/>
-                <w:bCs w:val="false"/>
-                <w:sz w:val="19"/>
-                <w:szCs w:val="19"/>
+                <w:rFonts w:ascii="ＭＳ 明朝" w:eastAsia="ＭＳ 明朝" w:hAnsi="ＭＳ 明朝"/>
+                <w:b w:val="false"/>
+                <w:bCs w:val="false"/>
+                <w:sz w:val="21"/>
+                <w:szCs w:val="21"/>
               </w:rPr>
               <w:t xml:space="preserve">午前・午後</w:t>
             </w:r>
@@ -2928,11 +2933,11 @@
             </w:pPr>
             <w:r>
               <w:rPr>
-                <w:rFonts w:ascii="Yu Gothic" w:eastAsia="Yu Gothic" w:hAnsi="Yu Gothic"/>
-                <w:b w:val="false"/>
-                <w:bCs w:val="false"/>
-                <w:sz w:val="19"/>
-                <w:szCs w:val="19"/>
+                <w:rFonts w:ascii="ＭＳ 明朝" w:eastAsia="ＭＳ 明朝" w:hAnsi="ＭＳ 明朝"/>
+                <w:b w:val="false"/>
+                <w:bCs w:val="false"/>
+                <w:sz w:val="21"/>
+                <w:szCs w:val="21"/>
               </w:rPr>
               <w:t xml:space="preserve">11月中旬</w:t>
             </w:r>
@@ -2962,11 +2967,11 @@
             </w:pPr>
             <w:r>
               <w:rPr>
-                <w:rFonts w:ascii="Yu Gothic" w:eastAsia="Yu Gothic" w:hAnsi="Yu Gothic"/>
-                <w:b w:val="false"/>
-                <w:bCs w:val="false"/>
-                <w:sz w:val="19"/>
-                <w:szCs w:val="19"/>
+                <w:rFonts w:ascii="ＭＳ 明朝" w:eastAsia="ＭＳ 明朝" w:hAnsi="ＭＳ 明朝"/>
+                <w:b w:val="false"/>
+                <w:bCs w:val="false"/>
+                <w:sz w:val="21"/>
+                <w:szCs w:val="21"/>
               </w:rPr>
               <w:t xml:space="preserve">2教科（100分）マーク式</w:t>
             </w:r>
@@ -2977,11 +2982,11 @@
             </w:pPr>
             <w:r>
               <w:rPr>
-                <w:rFonts w:ascii="Yu Gothic" w:eastAsia="Yu Gothic" w:hAnsi="Yu Gothic"/>
-                <w:b w:val="false"/>
-                <w:bCs w:val="false"/>
-                <w:sz w:val="19"/>
-                <w:szCs w:val="19"/>
+                <w:rFonts w:ascii="ＭＳ 明朝" w:eastAsia="ＭＳ 明朝" w:hAnsi="ＭＳ 明朝"/>
+                <w:b w:val="false"/>
+                <w:bCs w:val="false"/>
+                <w:sz w:val="21"/>
+                <w:szCs w:val="21"/>
               </w:rPr>
               <w:t xml:space="preserve">国語・英語など</w:t>
             </w:r>
@@ -2992,11 +2997,11 @@
             </w:pPr>
             <w:r>
               <w:rPr>
-                <w:rFonts w:ascii="Yu Gothic" w:eastAsia="Yu Gothic" w:hAnsi="Yu Gothic"/>
-                <w:b w:val="false"/>
-                <w:bCs w:val="false"/>
-                <w:sz w:val="19"/>
-                <w:szCs w:val="19"/>
+                <w:rFonts w:ascii="ＭＳ 明朝" w:eastAsia="ＭＳ 明朝" w:hAnsi="ＭＳ 明朝"/>
+                <w:b w:val="false"/>
+                <w:bCs w:val="false"/>
+                <w:sz w:val="21"/>
+                <w:szCs w:val="21"/>
               </w:rPr>
               <w:t xml:space="preserve">※学科により必須科目あり</w:t>
             </w:r>
@@ -3032,11 +3037,11 @@
             </w:pPr>
             <w:r>
               <w:rPr>
-                <w:rFonts w:ascii="Yu Gothic" w:eastAsia="Yu Gothic" w:hAnsi="Yu Gothic"/>
+                <w:rFonts w:ascii="ＭＳ 明朝" w:eastAsia="ＭＳ 明朝" w:hAnsi="ＭＳ 明朝"/>
                 <w:b/>
                 <w:bCs/>
-                <w:sz w:val="19"/>
-                <w:szCs w:val="19"/>
+                <w:sz w:val="21"/>
+                <w:szCs w:val="21"/>
               </w:rPr>
               <w:t xml:space="preserve">公募推薦</w:t>
             </w:r>
@@ -3048,11 +3053,11 @@
             </w:pPr>
             <w:r>
               <w:rPr>
-                <w:rFonts w:ascii="Yu Gothic" w:eastAsia="Yu Gothic" w:hAnsi="Yu Gothic"/>
+                <w:rFonts w:ascii="ＭＳ 明朝" w:eastAsia="ＭＳ 明朝" w:hAnsi="ＭＳ 明朝"/>
                 <w:b/>
                 <w:bCs/>
-                <w:sz w:val="19"/>
-                <w:szCs w:val="19"/>
+                <w:sz w:val="21"/>
+                <w:szCs w:val="21"/>
               </w:rPr>
               <w:t xml:space="preserve">後期</w:t>
             </w:r>
@@ -3081,11 +3086,11 @@
             </w:pPr>
             <w:r>
               <w:rPr>
-                <w:rFonts w:ascii="Yu Gothic" w:eastAsia="Yu Gothic" w:hAnsi="Yu Gothic"/>
-                <w:b w:val="false"/>
-                <w:bCs w:val="false"/>
-                <w:sz w:val="19"/>
-                <w:szCs w:val="19"/>
+                <w:rFonts w:ascii="ＭＳ 明朝" w:eastAsia="ＭＳ 明朝" w:hAnsi="ＭＳ 明朝"/>
+                <w:b w:val="false"/>
+                <w:bCs w:val="false"/>
+                <w:sz w:val="21"/>
+                <w:szCs w:val="21"/>
               </w:rPr>
               <w:t xml:space="preserve">10/22（木）～</w:t>
             </w:r>
@@ -3096,11 +3101,11 @@
             </w:pPr>
             <w:r>
               <w:rPr>
-                <w:rFonts w:ascii="Yu Gothic" w:eastAsia="Yu Gothic" w:hAnsi="Yu Gothic"/>
-                <w:b w:val="false"/>
-                <w:bCs w:val="false"/>
-                <w:sz w:val="19"/>
-                <w:szCs w:val="19"/>
+                <w:rFonts w:ascii="ＭＳ 明朝" w:eastAsia="ＭＳ 明朝" w:hAnsi="ＭＳ 明朝"/>
+                <w:b w:val="false"/>
+                <w:bCs w:val="false"/>
+                <w:sz w:val="21"/>
+                <w:szCs w:val="21"/>
               </w:rPr>
               <w:t xml:space="preserve">11/11（水）</w:t>
             </w:r>
@@ -3129,11 +3134,11 @@
             </w:pPr>
             <w:r>
               <w:rPr>
-                <w:rFonts w:ascii="Yu Gothic" w:eastAsia="Yu Gothic" w:hAnsi="Yu Gothic"/>
-                <w:b w:val="false"/>
-                <w:bCs w:val="false"/>
-                <w:sz w:val="19"/>
-                <w:szCs w:val="19"/>
+                <w:rFonts w:ascii="ＭＳ 明朝" w:eastAsia="ＭＳ 明朝" w:hAnsi="ＭＳ 明朝"/>
+                <w:b w:val="false"/>
+                <w:bCs w:val="false"/>
+                <w:sz w:val="21"/>
+                <w:szCs w:val="21"/>
               </w:rPr>
               <w:t xml:space="preserve">11/23（月・祝）</w:t>
             </w:r>
@@ -3144,11 +3149,11 @@
             </w:pPr>
             <w:r>
               <w:rPr>
-                <w:rFonts w:ascii="Yu Gothic" w:eastAsia="Yu Gothic" w:hAnsi="Yu Gothic"/>
-                <w:b w:val="false"/>
-                <w:bCs w:val="false"/>
-                <w:sz w:val="19"/>
-                <w:szCs w:val="19"/>
+                <w:rFonts w:ascii="ＭＳ 明朝" w:eastAsia="ＭＳ 明朝" w:hAnsi="ＭＳ 明朝"/>
+                <w:b w:val="false"/>
+                <w:bCs w:val="false"/>
+                <w:sz w:val="21"/>
+                <w:szCs w:val="21"/>
               </w:rPr>
               <w:t xml:space="preserve">午前・午後</w:t>
             </w:r>
@@ -3177,11 +3182,11 @@
             </w:pPr>
             <w:r>
               <w:rPr>
-                <w:rFonts w:ascii="Yu Gothic" w:eastAsia="Yu Gothic" w:hAnsi="Yu Gothic"/>
-                <w:b w:val="false"/>
-                <w:bCs w:val="false"/>
-                <w:sz w:val="19"/>
-                <w:szCs w:val="19"/>
+                <w:rFonts w:ascii="ＭＳ 明朝" w:eastAsia="ＭＳ 明朝" w:hAnsi="ＭＳ 明朝"/>
+                <w:b w:val="false"/>
+                <w:bCs w:val="false"/>
+                <w:sz w:val="21"/>
+                <w:szCs w:val="21"/>
               </w:rPr>
               <w:t xml:space="preserve">12月上旬</w:t>
             </w:r>
@@ -3210,11 +3215,11 @@
             </w:pPr>
             <w:r>
               <w:rPr>
-                <w:rFonts w:ascii="Yu Gothic" w:eastAsia="Yu Gothic" w:hAnsi="Yu Gothic"/>
-                <w:b w:val="false"/>
-                <w:bCs w:val="false"/>
-                <w:sz w:val="19"/>
-                <w:szCs w:val="19"/>
+                <w:rFonts w:ascii="ＭＳ 明朝" w:eastAsia="ＭＳ 明朝" w:hAnsi="ＭＳ 明朝"/>
+                <w:b w:val="false"/>
+                <w:bCs w:val="false"/>
+                <w:sz w:val="21"/>
+                <w:szCs w:val="21"/>
               </w:rPr>
               <w:t xml:space="preserve">前期と同様</w:t>
             </w:r>
@@ -3225,11 +3230,11 @@
             </w:pPr>
             <w:r>
               <w:rPr>
-                <w:rFonts w:ascii="Yu Gothic" w:eastAsia="Yu Gothic" w:hAnsi="Yu Gothic"/>
-                <w:b w:val="false"/>
-                <w:bCs w:val="false"/>
-                <w:sz w:val="19"/>
-                <w:szCs w:val="19"/>
+                <w:rFonts w:ascii="ＭＳ 明朝" w:eastAsia="ＭＳ 明朝" w:hAnsi="ＭＳ 明朝"/>
+                <w:b w:val="false"/>
+                <w:bCs w:val="false"/>
+                <w:sz w:val="21"/>
+                <w:szCs w:val="21"/>
               </w:rPr>
               <w:t xml:space="preserve">例：日本語日本文学科は国語必須＋英・数・理から1</w:t>
             </w:r>
@@ -3265,11 +3270,11 @@
             </w:pPr>
             <w:r>
               <w:rPr>
-                <w:rFonts w:ascii="Yu Gothic" w:eastAsia="Yu Gothic" w:hAnsi="Yu Gothic"/>
+                <w:rFonts w:ascii="ＭＳ 明朝" w:eastAsia="ＭＳ 明朝" w:hAnsi="ＭＳ 明朝"/>
                 <w:b/>
                 <w:bCs/>
-                <w:sz w:val="19"/>
-                <w:szCs w:val="19"/>
+                <w:sz w:val="21"/>
+                <w:szCs w:val="21"/>
               </w:rPr>
               <w:t xml:space="preserve">一般</w:t>
             </w:r>
@@ -3281,11 +3286,11 @@
             </w:pPr>
             <w:r>
               <w:rPr>
-                <w:rFonts w:ascii="Yu Gothic" w:eastAsia="Yu Gothic" w:hAnsi="Yu Gothic"/>
+                <w:rFonts w:ascii="ＭＳ 明朝" w:eastAsia="ＭＳ 明朝" w:hAnsi="ＭＳ 明朝"/>
                 <w:b/>
                 <w:bCs/>
-                <w:sz w:val="19"/>
-                <w:szCs w:val="19"/>
+                <w:sz w:val="21"/>
+                <w:szCs w:val="21"/>
               </w:rPr>
               <w:t xml:space="preserve">前期</w:t>
             </w:r>
@@ -3314,11 +3319,11 @@
             </w:pPr>
             <w:r>
               <w:rPr>
-                <w:rFonts w:ascii="Yu Gothic" w:eastAsia="Yu Gothic" w:hAnsi="Yu Gothic"/>
-                <w:b w:val="false"/>
-                <w:bCs w:val="false"/>
-                <w:sz w:val="19"/>
-                <w:szCs w:val="19"/>
+                <w:rFonts w:ascii="ＭＳ 明朝" w:eastAsia="ＭＳ 明朝" w:hAnsi="ＭＳ 明朝"/>
+                <w:b w:val="false"/>
+                <w:bCs w:val="false"/>
+                <w:sz w:val="21"/>
+                <w:szCs w:val="21"/>
               </w:rPr>
               <w:t xml:space="preserve">12/21（月）～</w:t>
             </w:r>
@@ -3329,11 +3334,11 @@
             </w:pPr>
             <w:r>
               <w:rPr>
-                <w:rFonts w:ascii="Yu Gothic" w:eastAsia="Yu Gothic" w:hAnsi="Yu Gothic"/>
-                <w:b w:val="false"/>
-                <w:bCs w:val="false"/>
-                <w:sz w:val="19"/>
-                <w:szCs w:val="19"/>
+                <w:rFonts w:ascii="ＭＳ 明朝" w:eastAsia="ＭＳ 明朝" w:hAnsi="ＭＳ 明朝"/>
+                <w:b w:val="false"/>
+                <w:bCs w:val="false"/>
+                <w:sz w:val="21"/>
+                <w:szCs w:val="21"/>
               </w:rPr>
               <w:t xml:space="preserve">1/11（月・祝）</w:t>
             </w:r>
@@ -3362,11 +3367,11 @@
             </w:pPr>
             <w:r>
               <w:rPr>
-                <w:rFonts w:ascii="Yu Gothic" w:eastAsia="Yu Gothic" w:hAnsi="Yu Gothic"/>
-                <w:b w:val="false"/>
-                <w:bCs w:val="false"/>
-                <w:sz w:val="19"/>
-                <w:szCs w:val="19"/>
+                <w:rFonts w:ascii="ＭＳ 明朝" w:eastAsia="ＭＳ 明朝" w:hAnsi="ＭＳ 明朝"/>
+                <w:b w:val="false"/>
+                <w:bCs w:val="false"/>
+                <w:sz w:val="21"/>
+                <w:szCs w:val="21"/>
               </w:rPr>
               <w:t xml:space="preserve">1/24（日）</w:t>
             </w:r>
@@ -3377,11 +3382,11 @@
             </w:pPr>
             <w:r>
               <w:rPr>
-                <w:rFonts w:ascii="Yu Gothic" w:eastAsia="Yu Gothic" w:hAnsi="Yu Gothic"/>
-                <w:b w:val="false"/>
-                <w:bCs w:val="false"/>
-                <w:sz w:val="19"/>
-                <w:szCs w:val="19"/>
+                <w:rFonts w:ascii="ＭＳ 明朝" w:eastAsia="ＭＳ 明朝" w:hAnsi="ＭＳ 明朝"/>
+                <w:b w:val="false"/>
+                <w:bCs w:val="false"/>
+                <w:sz w:val="21"/>
+                <w:szCs w:val="21"/>
               </w:rPr>
               <w:t xml:space="preserve">1/25（月）</w:t>
             </w:r>
@@ -3410,11 +3415,11 @@
             </w:pPr>
             <w:r>
               <w:rPr>
-                <w:rFonts w:ascii="Yu Gothic" w:eastAsia="Yu Gothic" w:hAnsi="Yu Gothic"/>
-                <w:b w:val="false"/>
-                <w:bCs w:val="false"/>
-                <w:sz w:val="19"/>
-                <w:szCs w:val="19"/>
+                <w:rFonts w:ascii="ＭＳ 明朝" w:eastAsia="ＭＳ 明朝" w:hAnsi="ＭＳ 明朝"/>
+                <w:b w:val="false"/>
+                <w:bCs w:val="false"/>
+                <w:sz w:val="21"/>
+                <w:szCs w:val="21"/>
               </w:rPr>
               <w:t xml:space="preserve">2月上旬</w:t>
             </w:r>
@@ -3443,11 +3448,11 @@
             </w:pPr>
             <w:r>
               <w:rPr>
-                <w:rFonts w:ascii="Yu Gothic" w:eastAsia="Yu Gothic" w:hAnsi="Yu Gothic"/>
-                <w:b w:val="false"/>
-                <w:bCs w:val="false"/>
-                <w:sz w:val="19"/>
-                <w:szCs w:val="19"/>
+                <w:rFonts w:ascii="ＭＳ 明朝" w:eastAsia="ＭＳ 明朝" w:hAnsi="ＭＳ 明朝"/>
+                <w:b w:val="false"/>
+                <w:bCs w:val="false"/>
+                <w:sz w:val="21"/>
+                <w:szCs w:val="21"/>
               </w:rPr>
               <w:t xml:space="preserve">2科目型／3科目型</w:t>
             </w:r>
@@ -3458,11 +3463,11 @@
             </w:pPr>
             <w:r>
               <w:rPr>
-                <w:rFonts w:ascii="Yu Gothic" w:eastAsia="Yu Gothic" w:hAnsi="Yu Gothic"/>
-                <w:b w:val="false"/>
-                <w:bCs w:val="false"/>
-                <w:sz w:val="19"/>
-                <w:szCs w:val="19"/>
+                <w:rFonts w:ascii="ＭＳ 明朝" w:eastAsia="ＭＳ 明朝" w:hAnsi="ＭＳ 明朝"/>
+                <w:b w:val="false"/>
+                <w:bCs w:val="false"/>
+                <w:sz w:val="21"/>
+                <w:szCs w:val="21"/>
               </w:rPr>
               <w:t xml:space="preserve">国語・英語＋選択（数学・地歴など）</w:t>
             </w:r>
@@ -3498,11 +3503,11 @@
             </w:pPr>
             <w:r>
               <w:rPr>
-                <w:rFonts w:ascii="Yu Gothic" w:eastAsia="Yu Gothic" w:hAnsi="Yu Gothic"/>
+                <w:rFonts w:ascii="ＭＳ 明朝" w:eastAsia="ＭＳ 明朝" w:hAnsi="ＭＳ 明朝"/>
                 <w:b/>
                 <w:bCs/>
-                <w:sz w:val="19"/>
-                <w:szCs w:val="19"/>
+                <w:sz w:val="21"/>
+                <w:szCs w:val="21"/>
               </w:rPr>
               <w:t xml:space="preserve">一般</w:t>
             </w:r>
@@ -3514,11 +3519,11 @@
             </w:pPr>
             <w:r>
               <w:rPr>
-                <w:rFonts w:ascii="Yu Gothic" w:eastAsia="Yu Gothic" w:hAnsi="Yu Gothic"/>
+                <w:rFonts w:ascii="ＭＳ 明朝" w:eastAsia="ＭＳ 明朝" w:hAnsi="ＭＳ 明朝"/>
                 <w:b/>
                 <w:bCs/>
-                <w:sz w:val="19"/>
-                <w:szCs w:val="19"/>
+                <w:sz w:val="21"/>
+                <w:szCs w:val="21"/>
               </w:rPr>
               <w:t xml:space="preserve">後期</w:t>
             </w:r>
@@ -3547,11 +3552,11 @@
             </w:pPr>
             <w:r>
               <w:rPr>
-                <w:rFonts w:ascii="Yu Gothic" w:eastAsia="Yu Gothic" w:hAnsi="Yu Gothic"/>
-                <w:b w:val="false"/>
-                <w:bCs w:val="false"/>
-                <w:sz w:val="19"/>
-                <w:szCs w:val="19"/>
+                <w:rFonts w:ascii="ＭＳ 明朝" w:eastAsia="ＭＳ 明朝" w:hAnsi="ＭＳ 明朝"/>
+                <w:b w:val="false"/>
+                <w:bCs w:val="false"/>
+                <w:sz w:val="21"/>
+                <w:szCs w:val="21"/>
               </w:rPr>
               <w:t xml:space="preserve">2/6（土）～</w:t>
             </w:r>
@@ -3562,11 +3567,11 @@
             </w:pPr>
             <w:r>
               <w:rPr>
-                <w:rFonts w:ascii="Yu Gothic" w:eastAsia="Yu Gothic" w:hAnsi="Yu Gothic"/>
-                <w:b w:val="false"/>
-                <w:bCs w:val="false"/>
-                <w:sz w:val="19"/>
-                <w:szCs w:val="19"/>
+                <w:rFonts w:ascii="ＭＳ 明朝" w:eastAsia="ＭＳ 明朝" w:hAnsi="ＭＳ 明朝"/>
+                <w:b w:val="false"/>
+                <w:bCs w:val="false"/>
+                <w:sz w:val="21"/>
+                <w:szCs w:val="21"/>
               </w:rPr>
               <w:t xml:space="preserve">2/19（金）</w:t>
             </w:r>
@@ -3595,11 +3600,11 @@
             </w:pPr>
             <w:r>
               <w:rPr>
-                <w:rFonts w:ascii="Yu Gothic" w:eastAsia="Yu Gothic" w:hAnsi="Yu Gothic"/>
-                <w:b w:val="false"/>
-                <w:bCs w:val="false"/>
-                <w:sz w:val="19"/>
-                <w:szCs w:val="19"/>
+                <w:rFonts w:ascii="ＭＳ 明朝" w:eastAsia="ＭＳ 明朝" w:hAnsi="ＭＳ 明朝"/>
+                <w:b w:val="false"/>
+                <w:bCs w:val="false"/>
+                <w:sz w:val="21"/>
+                <w:szCs w:val="21"/>
               </w:rPr>
               <w:t xml:space="preserve">3/2（火）</w:t>
             </w:r>
@@ -3628,11 +3633,11 @@
             </w:pPr>
             <w:r>
               <w:rPr>
-                <w:rFonts w:ascii="Yu Gothic" w:eastAsia="Yu Gothic" w:hAnsi="Yu Gothic"/>
-                <w:b w:val="false"/>
-                <w:bCs w:val="false"/>
-                <w:sz w:val="19"/>
-                <w:szCs w:val="19"/>
+                <w:rFonts w:ascii="ＭＳ 明朝" w:eastAsia="ＭＳ 明朝" w:hAnsi="ＭＳ 明朝"/>
+                <w:b w:val="false"/>
+                <w:bCs w:val="false"/>
+                <w:sz w:val="21"/>
+                <w:szCs w:val="21"/>
               </w:rPr>
               <w:t xml:space="preserve">3月中旬</w:t>
             </w:r>
@@ -3661,11 +3666,11 @@
             </w:pPr>
             <w:r>
               <w:rPr>
-                <w:rFonts w:ascii="Yu Gothic" w:eastAsia="Yu Gothic" w:hAnsi="Yu Gothic"/>
-                <w:b w:val="false"/>
-                <w:bCs w:val="false"/>
-                <w:sz w:val="19"/>
-                <w:szCs w:val="19"/>
+                <w:rFonts w:ascii="ＭＳ 明朝" w:eastAsia="ＭＳ 明朝" w:hAnsi="ＭＳ 明朝"/>
+                <w:b w:val="false"/>
+                <w:bCs w:val="false"/>
+                <w:sz w:val="21"/>
+                <w:szCs w:val="21"/>
               </w:rPr>
               <w:t xml:space="preserve">要項で確認（募集人数少）</w:t>
             </w:r>
@@ -3679,26 +3684,27 @@
       </w:pPr>
       <w:r>
         <w:rPr>
-          <w:rFonts w:ascii="Yu Gothic" w:eastAsia="Yu Gothic" w:hAnsi="Yu Gothic"/>
-          <w:sz w:val="19"/>
-          <w:szCs w:val="19"/>
+          <w:rFonts w:ascii="ＭＳ 明朝" w:eastAsia="ＭＳ 明朝" w:hAnsi="ＭＳ 明朝"/>
+          <w:sz w:val="21"/>
+          <w:szCs w:val="21"/>
         </w:rPr>
         <w:t xml:space="preserve">ポイント：公募は午前・午後の両方を受験でき、前期・後期とあわせて最大4回受験のチャンスがあります。</w:t>
       </w:r>
     </w:p>
     <w:p>
       <w:pPr>
+        <w:keepNext/>
         <w:shd w:fill="1F4E79" w:color="auto" w:val="clear"/>
         <w:spacing w:after="120" w:before="240"/>
       </w:pPr>
       <w:r>
         <w:rPr>
-          <w:rFonts w:ascii="Yu Gothic" w:eastAsia="Yu Gothic" w:hAnsi="Yu Gothic"/>
+          <w:rFonts w:ascii="ＭＳ 明朝" w:eastAsia="ＭＳ 明朝" w:hAnsi="ＭＳ 明朝"/>
           <w:b/>
           <w:bCs/>
           <w:color w:val="FFFFFF"/>
-          <w:sz w:val="26"/>
-          <w:szCs w:val="26"/>
+          <w:sz w:val="21"/>
+          <w:szCs w:val="21"/>
         </w:rPr>
         <w:t xml:space="preserve">３．入試カレンダー（全体の流れ）</w:t>
       </w:r>
@@ -3749,12 +3755,12 @@
             </w:pPr>
             <w:r>
               <w:rPr>
-                <w:rFonts w:ascii="Yu Gothic" w:eastAsia="Yu Gothic" w:hAnsi="Yu Gothic"/>
+                <w:rFonts w:ascii="ＭＳ 明朝" w:eastAsia="ＭＳ 明朝" w:hAnsi="ＭＳ 明朝"/>
                 <w:b/>
                 <w:bCs/>
                 <w:color w:val="FFFFFF"/>
-                <w:sz w:val="19"/>
-                <w:szCs w:val="19"/>
+                <w:sz w:val="21"/>
+                <w:szCs w:val="21"/>
               </w:rPr>
               <w:t xml:space="preserve">時期</w:t>
             </w:r>
@@ -3785,12 +3791,12 @@
             </w:pPr>
             <w:r>
               <w:rPr>
-                <w:rFonts w:ascii="Yu Gothic" w:eastAsia="Yu Gothic" w:hAnsi="Yu Gothic"/>
+                <w:rFonts w:ascii="ＭＳ 明朝" w:eastAsia="ＭＳ 明朝" w:hAnsi="ＭＳ 明朝"/>
                 <w:b/>
                 <w:bCs/>
                 <w:color w:val="FFFFFF"/>
-                <w:sz w:val="19"/>
-                <w:szCs w:val="19"/>
+                <w:sz w:val="21"/>
+                <w:szCs w:val="21"/>
               </w:rPr>
               <w:t xml:space="preserve">入試の予定</w:t>
             </w:r>
@@ -3821,12 +3827,12 @@
             </w:pPr>
             <w:r>
               <w:rPr>
-                <w:rFonts w:ascii="Yu Gothic" w:eastAsia="Yu Gothic" w:hAnsi="Yu Gothic"/>
+                <w:rFonts w:ascii="ＭＳ 明朝" w:eastAsia="ＭＳ 明朝" w:hAnsi="ＭＳ 明朝"/>
                 <w:b/>
                 <w:bCs/>
                 <w:color w:val="FFFFFF"/>
-                <w:sz w:val="19"/>
-                <w:szCs w:val="19"/>
+                <w:sz w:val="21"/>
+                <w:szCs w:val="21"/>
               </w:rPr>
               <w:t xml:space="preserve">学習・準備のポイント</w:t>
             </w:r>
@@ -3862,11 +3868,11 @@
             </w:pPr>
             <w:r>
               <w:rPr>
-                <w:rFonts w:ascii="Yu Gothic" w:eastAsia="Yu Gothic" w:hAnsi="Yu Gothic"/>
+                <w:rFonts w:ascii="ＭＳ 明朝" w:eastAsia="ＭＳ 明朝" w:hAnsi="ＭＳ 明朝"/>
                 <w:b/>
                 <w:bCs/>
-                <w:sz w:val="19"/>
-                <w:szCs w:val="19"/>
+                <w:sz w:val="21"/>
+                <w:szCs w:val="21"/>
               </w:rPr>
               <w:t xml:space="preserve">10月下旬</w:t>
             </w:r>
@@ -3896,7 +3902,7 @@
             </w:pPr>
             <w:r>
               <w:rPr>
-                <w:rFonts w:ascii="Yu Gothic" w:eastAsia="Yu Gothic" w:hAnsi="Yu Gothic"/>
+                <w:rFonts w:ascii="ＭＳ 明朝" w:eastAsia="ＭＳ 明朝" w:hAnsi="ＭＳ 明朝"/>
                 <w:b/>
                 <w:bCs/>
                 <w:color w:val="C00000"/>
@@ -3912,11 +3918,11 @@
             </w:pPr>
             <w:r>
               <w:rPr>
-                <w:rFonts w:ascii="Yu Gothic" w:eastAsia="Yu Gothic" w:hAnsi="Yu Gothic"/>
-                <w:b w:val="false"/>
-                <w:bCs w:val="false"/>
-                <w:sz w:val="19"/>
-                <w:szCs w:val="19"/>
+                <w:rFonts w:ascii="ＭＳ 明朝" w:eastAsia="ＭＳ 明朝" w:hAnsi="ＭＳ 明朝"/>
+                <w:b w:val="false"/>
+                <w:bCs w:val="false"/>
+                <w:sz w:val="21"/>
+                <w:szCs w:val="21"/>
               </w:rPr>
               <w:t xml:space="preserve">10/31・11/1 神戸女子 公募前期</w:t>
             </w:r>
@@ -3946,11 +3952,11 @@
             </w:pPr>
             <w:r>
               <w:rPr>
-                <w:rFonts w:ascii="Yu Gothic" w:eastAsia="Yu Gothic" w:hAnsi="Yu Gothic"/>
-                <w:b w:val="false"/>
-                <w:bCs w:val="false"/>
-                <w:sz w:val="19"/>
-                <w:szCs w:val="19"/>
+                <w:rFonts w:ascii="ＭＳ 明朝" w:eastAsia="ＭＳ 明朝" w:hAnsi="ＭＳ 明朝"/>
+                <w:b w:val="false"/>
+                <w:bCs w:val="false"/>
+                <w:sz w:val="21"/>
+                <w:szCs w:val="21"/>
               </w:rPr>
               <w:t xml:space="preserve">過去問で時間配分の最終確認</w:t>
             </w:r>
@@ -3961,11 +3967,11 @@
             </w:pPr>
             <w:r>
               <w:rPr>
-                <w:rFonts w:ascii="Yu Gothic" w:eastAsia="Yu Gothic" w:hAnsi="Yu Gothic"/>
-                <w:b w:val="false"/>
-                <w:bCs w:val="false"/>
-                <w:sz w:val="19"/>
-                <w:szCs w:val="19"/>
+                <w:rFonts w:ascii="ＭＳ 明朝" w:eastAsia="ＭＳ 明朝" w:hAnsi="ＭＳ 明朝"/>
+                <w:b w:val="false"/>
+                <w:bCs w:val="false"/>
+                <w:sz w:val="21"/>
+                <w:szCs w:val="21"/>
               </w:rPr>
               <w:t xml:space="preserve">出願書類・写真・受験料の準備</w:t>
             </w:r>
@@ -4001,11 +4007,11 @@
             </w:pPr>
             <w:r>
               <w:rPr>
-                <w:rFonts w:ascii="Yu Gothic" w:eastAsia="Yu Gothic" w:hAnsi="Yu Gothic"/>
+                <w:rFonts w:ascii="ＭＳ 明朝" w:eastAsia="ＭＳ 明朝" w:hAnsi="ＭＳ 明朝"/>
                 <w:b/>
                 <w:bCs/>
-                <w:sz w:val="19"/>
-                <w:szCs w:val="19"/>
+                <w:sz w:val="21"/>
+                <w:szCs w:val="21"/>
               </w:rPr>
               <w:t xml:space="preserve">11月</w:t>
             </w:r>
@@ -4034,11 +4040,11 @@
             </w:pPr>
             <w:r>
               <w:rPr>
-                <w:rFonts w:ascii="Yu Gothic" w:eastAsia="Yu Gothic" w:hAnsi="Yu Gothic"/>
-                <w:b w:val="false"/>
-                <w:bCs w:val="false"/>
-                <w:sz w:val="19"/>
-                <w:szCs w:val="19"/>
+                <w:rFonts w:ascii="ＭＳ 明朝" w:eastAsia="ＭＳ 明朝" w:hAnsi="ＭＳ 明朝"/>
+                <w:b w:val="false"/>
+                <w:bCs w:val="false"/>
+                <w:sz w:val="21"/>
+                <w:szCs w:val="21"/>
               </w:rPr>
               <w:t xml:space="preserve">11/3 武庫川 公募前期</w:t>
             </w:r>
@@ -4049,11 +4055,11 @@
             </w:pPr>
             <w:r>
               <w:rPr>
-                <w:rFonts w:ascii="Yu Gothic" w:eastAsia="Yu Gothic" w:hAnsi="Yu Gothic"/>
-                <w:b w:val="false"/>
-                <w:bCs w:val="false"/>
-                <w:sz w:val="19"/>
-                <w:szCs w:val="19"/>
+                <w:rFonts w:ascii="ＭＳ 明朝" w:eastAsia="ＭＳ 明朝" w:hAnsi="ＭＳ 明朝"/>
+                <w:b w:val="false"/>
+                <w:bCs w:val="false"/>
+                <w:sz w:val="21"/>
+                <w:szCs w:val="21"/>
               </w:rPr>
               <w:t xml:space="preserve">11/10 神戸学院 公募 出願締切</w:t>
             </w:r>
@@ -4064,11 +4070,11 @@
             </w:pPr>
             <w:r>
               <w:rPr>
-                <w:rFonts w:ascii="Yu Gothic" w:eastAsia="Yu Gothic" w:hAnsi="Yu Gothic"/>
-                <w:b w:val="false"/>
-                <w:bCs w:val="false"/>
-                <w:sz w:val="19"/>
-                <w:szCs w:val="19"/>
+                <w:rFonts w:ascii="ＭＳ 明朝" w:eastAsia="ＭＳ 明朝" w:hAnsi="ＭＳ 明朝"/>
+                <w:b w:val="false"/>
+                <w:bCs w:val="false"/>
+                <w:sz w:val="21"/>
+                <w:szCs w:val="21"/>
               </w:rPr>
               <w:t xml:space="preserve">11/11 武庫川 公募後期 出願締切</w:t>
             </w:r>
@@ -4079,11 +4085,11 @@
             </w:pPr>
             <w:r>
               <w:rPr>
-                <w:rFonts w:ascii="Yu Gothic" w:eastAsia="Yu Gothic" w:hAnsi="Yu Gothic"/>
-                <w:b w:val="false"/>
-                <w:bCs w:val="false"/>
-                <w:sz w:val="19"/>
-                <w:szCs w:val="19"/>
+                <w:rFonts w:ascii="ＭＳ 明朝" w:eastAsia="ＭＳ 明朝" w:hAnsi="ＭＳ 明朝"/>
+                <w:b w:val="false"/>
+                <w:bCs w:val="false"/>
+                <w:sz w:val="21"/>
+                <w:szCs w:val="21"/>
               </w:rPr>
               <w:t xml:space="preserve">11/21・22 神戸学院 公募</w:t>
             </w:r>
@@ -4094,11 +4100,11 @@
             </w:pPr>
             <w:r>
               <w:rPr>
-                <w:rFonts w:ascii="Yu Gothic" w:eastAsia="Yu Gothic" w:hAnsi="Yu Gothic"/>
-                <w:b w:val="false"/>
-                <w:bCs w:val="false"/>
-                <w:sz w:val="19"/>
-                <w:szCs w:val="19"/>
+                <w:rFonts w:ascii="ＭＳ 明朝" w:eastAsia="ＭＳ 明朝" w:hAnsi="ＭＳ 明朝"/>
+                <w:b w:val="false"/>
+                <w:bCs w:val="false"/>
+                <w:sz w:val="21"/>
+                <w:szCs w:val="21"/>
               </w:rPr>
               <w:t xml:space="preserve">11/23 武庫川 公募後期</w:t>
             </w:r>
@@ -4109,11 +4115,11 @@
             </w:pPr>
             <w:r>
               <w:rPr>
-                <w:rFonts w:ascii="Yu Gothic" w:eastAsia="Yu Gothic" w:hAnsi="Yu Gothic"/>
-                <w:b w:val="false"/>
-                <w:bCs w:val="false"/>
-                <w:sz w:val="19"/>
-                <w:szCs w:val="19"/>
+                <w:rFonts w:ascii="ＭＳ 明朝" w:eastAsia="ＭＳ 明朝" w:hAnsi="ＭＳ 明朝"/>
+                <w:b w:val="false"/>
+                <w:bCs w:val="false"/>
+                <w:sz w:val="21"/>
+                <w:szCs w:val="21"/>
               </w:rPr>
               <w:t xml:space="preserve">11/25 神戸女子 公募後期 出願締切</w:t>
             </w:r>
@@ -4142,11 +4148,11 @@
             </w:pPr>
             <w:r>
               <w:rPr>
-                <w:rFonts w:ascii="Yu Gothic" w:eastAsia="Yu Gothic" w:hAnsi="Yu Gothic"/>
-                <w:b w:val="false"/>
-                <w:bCs w:val="false"/>
-                <w:sz w:val="19"/>
-                <w:szCs w:val="19"/>
+                <w:rFonts w:ascii="ＭＳ 明朝" w:eastAsia="ＭＳ 明朝" w:hAnsi="ＭＳ 明朝"/>
+                <w:b w:val="false"/>
+                <w:bCs w:val="false"/>
+                <w:sz w:val="21"/>
+                <w:szCs w:val="21"/>
               </w:rPr>
               <w:t xml:space="preserve">試験ごとに「解き直し」をして次の試験へ</w:t>
             </w:r>
@@ -4157,11 +4163,11 @@
             </w:pPr>
             <w:r>
               <w:rPr>
-                <w:rFonts w:ascii="Yu Gothic" w:eastAsia="Yu Gothic" w:hAnsi="Yu Gothic"/>
-                <w:b w:val="false"/>
-                <w:bCs w:val="false"/>
-                <w:sz w:val="19"/>
-                <w:szCs w:val="19"/>
+                <w:rFonts w:ascii="ＭＳ 明朝" w:eastAsia="ＭＳ 明朝" w:hAnsi="ＭＳ 明朝"/>
+                <w:b w:val="false"/>
+                <w:bCs w:val="false"/>
+                <w:sz w:val="21"/>
+                <w:szCs w:val="21"/>
               </w:rPr>
               <w:t xml:space="preserve">体調管理（インフルエンザ予防接種）</w:t>
             </w:r>
@@ -4197,11 +4203,11 @@
             </w:pPr>
             <w:r>
               <w:rPr>
-                <w:rFonts w:ascii="Yu Gothic" w:eastAsia="Yu Gothic" w:hAnsi="Yu Gothic"/>
+                <w:rFonts w:ascii="ＭＳ 明朝" w:eastAsia="ＭＳ 明朝" w:hAnsi="ＭＳ 明朝"/>
                 <w:b/>
                 <w:bCs/>
-                <w:sz w:val="19"/>
-                <w:szCs w:val="19"/>
+                <w:sz w:val="21"/>
+                <w:szCs w:val="21"/>
               </w:rPr>
               <w:t xml:space="preserve">12月</w:t>
             </w:r>
@@ -4230,11 +4236,11 @@
             </w:pPr>
             <w:r>
               <w:rPr>
-                <w:rFonts w:ascii="Yu Gothic" w:eastAsia="Yu Gothic" w:hAnsi="Yu Gothic"/>
-                <w:b w:val="false"/>
-                <w:bCs w:val="false"/>
-                <w:sz w:val="19"/>
-                <w:szCs w:val="19"/>
+                <w:rFonts w:ascii="ＭＳ 明朝" w:eastAsia="ＭＳ 明朝" w:hAnsi="ＭＳ 明朝"/>
+                <w:b w:val="false"/>
+                <w:bCs w:val="false"/>
+                <w:sz w:val="21"/>
+                <w:szCs w:val="21"/>
               </w:rPr>
               <w:t xml:space="preserve">12/6 神戸女子 公募後期</w:t>
             </w:r>
@@ -4245,11 +4251,11 @@
             </w:pPr>
             <w:r>
               <w:rPr>
-                <w:rFonts w:ascii="Yu Gothic" w:eastAsia="Yu Gothic" w:hAnsi="Yu Gothic"/>
-                <w:b w:val="false"/>
-                <w:bCs w:val="false"/>
-                <w:sz w:val="19"/>
-                <w:szCs w:val="19"/>
+                <w:rFonts w:ascii="ＭＳ 明朝" w:eastAsia="ＭＳ 明朝" w:hAnsi="ＭＳ 明朝"/>
+                <w:b w:val="false"/>
+                <w:bCs w:val="false"/>
+                <w:sz w:val="21"/>
+                <w:szCs w:val="21"/>
               </w:rPr>
               <w:t xml:space="preserve">公募推薦の合格発表・入学手続</w:t>
             </w:r>
@@ -4260,11 +4266,11 @@
             </w:pPr>
             <w:r>
               <w:rPr>
-                <w:rFonts w:ascii="Yu Gothic" w:eastAsia="Yu Gothic" w:hAnsi="Yu Gothic"/>
-                <w:b w:val="false"/>
-                <w:bCs w:val="false"/>
-                <w:sz w:val="19"/>
-                <w:szCs w:val="19"/>
+                <w:rFonts w:ascii="ＭＳ 明朝" w:eastAsia="ＭＳ 明朝" w:hAnsi="ＭＳ 明朝"/>
+                <w:b w:val="false"/>
+                <w:bCs w:val="false"/>
+                <w:sz w:val="21"/>
+                <w:szCs w:val="21"/>
               </w:rPr>
               <w:t xml:space="preserve">一般選抜の出願開始</w:t>
             </w:r>
@@ -4293,11 +4299,11 @@
             </w:pPr>
             <w:r>
               <w:rPr>
-                <w:rFonts w:ascii="Yu Gothic" w:eastAsia="Yu Gothic" w:hAnsi="Yu Gothic"/>
-                <w:b w:val="false"/>
-                <w:bCs w:val="false"/>
-                <w:sz w:val="19"/>
-                <w:szCs w:val="19"/>
+                <w:rFonts w:ascii="ＭＳ 明朝" w:eastAsia="ＭＳ 明朝" w:hAnsi="ＭＳ 明朝"/>
+                <w:b w:val="false"/>
+                <w:bCs w:val="false"/>
+                <w:sz w:val="21"/>
+                <w:szCs w:val="21"/>
               </w:rPr>
               <w:t xml:space="preserve">公募の結果に関係なく一般選抜の対策を継続</w:t>
             </w:r>
@@ -4308,11 +4314,11 @@
             </w:pPr>
             <w:r>
               <w:rPr>
-                <w:rFonts w:ascii="Yu Gothic" w:eastAsia="Yu Gothic" w:hAnsi="Yu Gothic"/>
-                <w:b w:val="false"/>
-                <w:bCs w:val="false"/>
-                <w:sz w:val="19"/>
-                <w:szCs w:val="19"/>
+                <w:rFonts w:ascii="ＭＳ 明朝" w:eastAsia="ＭＳ 明朝" w:hAnsi="ＭＳ 明朝"/>
+                <w:b w:val="false"/>
+                <w:bCs w:val="false"/>
+                <w:sz w:val="21"/>
+                <w:szCs w:val="21"/>
               </w:rPr>
               <w:t xml:space="preserve">一般の過去問に着手</w:t>
             </w:r>
@@ -4348,11 +4354,11 @@
             </w:pPr>
             <w:r>
               <w:rPr>
-                <w:rFonts w:ascii="Yu Gothic" w:eastAsia="Yu Gothic" w:hAnsi="Yu Gothic"/>
+                <w:rFonts w:ascii="ＭＳ 明朝" w:eastAsia="ＭＳ 明朝" w:hAnsi="ＭＳ 明朝"/>
                 <w:b/>
                 <w:bCs/>
-                <w:sz w:val="19"/>
-                <w:szCs w:val="19"/>
+                <w:sz w:val="21"/>
+                <w:szCs w:val="21"/>
               </w:rPr>
               <w:t xml:space="preserve">1月</w:t>
             </w:r>
@@ -4381,11 +4387,11 @@
             </w:pPr>
             <w:r>
               <w:rPr>
-                <w:rFonts w:ascii="Yu Gothic" w:eastAsia="Yu Gothic" w:hAnsi="Yu Gothic"/>
-                <w:b w:val="false"/>
-                <w:bCs w:val="false"/>
-                <w:sz w:val="19"/>
-                <w:szCs w:val="19"/>
+                <w:rFonts w:ascii="ＭＳ 明朝" w:eastAsia="ＭＳ 明朝" w:hAnsi="ＭＳ 明朝"/>
+                <w:b w:val="false"/>
+                <w:bCs w:val="false"/>
+                <w:sz w:val="21"/>
+                <w:szCs w:val="21"/>
               </w:rPr>
               <w:t xml:space="preserve">1/16・17 大学入学共通テスト（利用する場合）</w:t>
             </w:r>
@@ -4396,11 +4402,11 @@
             </w:pPr>
             <w:r>
               <w:rPr>
-                <w:rFonts w:ascii="Yu Gothic" w:eastAsia="Yu Gothic" w:hAnsi="Yu Gothic"/>
-                <w:b w:val="false"/>
-                <w:bCs w:val="false"/>
-                <w:sz w:val="19"/>
-                <w:szCs w:val="19"/>
+                <w:rFonts w:ascii="ＭＳ 明朝" w:eastAsia="ＭＳ 明朝" w:hAnsi="ＭＳ 明朝"/>
+                <w:b w:val="false"/>
+                <w:bCs w:val="false"/>
+                <w:sz w:val="21"/>
+                <w:szCs w:val="21"/>
               </w:rPr>
               <w:t xml:space="preserve">1/23・24 神戸女子 一般前期A・B</w:t>
             </w:r>
@@ -4411,11 +4417,11 @@
             </w:pPr>
             <w:r>
               <w:rPr>
-                <w:rFonts w:ascii="Yu Gothic" w:eastAsia="Yu Gothic" w:hAnsi="Yu Gothic"/>
-                <w:b w:val="false"/>
-                <w:bCs w:val="false"/>
-                <w:sz w:val="19"/>
-                <w:szCs w:val="19"/>
+                <w:rFonts w:ascii="ＭＳ 明朝" w:eastAsia="ＭＳ 明朝" w:hAnsi="ＭＳ 明朝"/>
+                <w:b w:val="false"/>
+                <w:bCs w:val="false"/>
+                <w:sz w:val="21"/>
+                <w:szCs w:val="21"/>
               </w:rPr>
               <w:t xml:space="preserve">1/24・25 武庫川 一般前期</w:t>
             </w:r>
@@ -4444,11 +4450,11 @@
             </w:pPr>
             <w:r>
               <w:rPr>
-                <w:rFonts w:ascii="Yu Gothic" w:eastAsia="Yu Gothic" w:hAnsi="Yu Gothic"/>
-                <w:b w:val="false"/>
-                <w:bCs w:val="false"/>
-                <w:sz w:val="19"/>
-                <w:szCs w:val="19"/>
+                <w:rFonts w:ascii="ＭＳ 明朝" w:eastAsia="ＭＳ 明朝" w:hAnsi="ＭＳ 明朝"/>
+                <w:b w:val="false"/>
+                <w:bCs w:val="false"/>
+                <w:sz w:val="21"/>
+                <w:szCs w:val="21"/>
               </w:rPr>
               <w:t xml:space="preserve">苦手単元の総復習</w:t>
             </w:r>
@@ -4459,11 +4465,11 @@
             </w:pPr>
             <w:r>
               <w:rPr>
-                <w:rFonts w:ascii="Yu Gothic" w:eastAsia="Yu Gothic" w:hAnsi="Yu Gothic"/>
-                <w:b w:val="false"/>
-                <w:bCs w:val="false"/>
-                <w:sz w:val="19"/>
-                <w:szCs w:val="19"/>
+                <w:rFonts w:ascii="ＭＳ 明朝" w:eastAsia="ＭＳ 明朝" w:hAnsi="ＭＳ 明朝"/>
+                <w:b w:val="false"/>
+                <w:bCs w:val="false"/>
+                <w:sz w:val="21"/>
+                <w:szCs w:val="21"/>
               </w:rPr>
               <w:t xml:space="preserve">試験日の重複に注意</w:t>
             </w:r>
@@ -4499,11 +4505,11 @@
             </w:pPr>
             <w:r>
               <w:rPr>
-                <w:rFonts w:ascii="Yu Gothic" w:eastAsia="Yu Gothic" w:hAnsi="Yu Gothic"/>
+                <w:rFonts w:ascii="ＭＳ 明朝" w:eastAsia="ＭＳ 明朝" w:hAnsi="ＭＳ 明朝"/>
                 <w:b/>
                 <w:bCs/>
-                <w:sz w:val="19"/>
-                <w:szCs w:val="19"/>
+                <w:sz w:val="21"/>
+                <w:szCs w:val="21"/>
               </w:rPr>
               <w:t xml:space="preserve">2月～3月</w:t>
             </w:r>
@@ -4532,11 +4538,11 @@
             </w:pPr>
             <w:r>
               <w:rPr>
-                <w:rFonts w:ascii="Yu Gothic" w:eastAsia="Yu Gothic" w:hAnsi="Yu Gothic"/>
-                <w:b w:val="false"/>
-                <w:bCs w:val="false"/>
-                <w:sz w:val="19"/>
-                <w:szCs w:val="19"/>
+                <w:rFonts w:ascii="ＭＳ 明朝" w:eastAsia="ＭＳ 明朝" w:hAnsi="ＭＳ 明朝"/>
+                <w:b w:val="false"/>
+                <w:bCs w:val="false"/>
+                <w:sz w:val="21"/>
+                <w:szCs w:val="21"/>
               </w:rPr>
               <w:t xml:space="preserve">2/1・2 神戸学院 一般前期</w:t>
             </w:r>
@@ -4547,11 +4553,11 @@
             </w:pPr>
             <w:r>
               <w:rPr>
-                <w:rFonts w:ascii="Yu Gothic" w:eastAsia="Yu Gothic" w:hAnsi="Yu Gothic"/>
-                <w:b w:val="false"/>
-                <w:bCs w:val="false"/>
-                <w:sz w:val="19"/>
-                <w:szCs w:val="19"/>
+                <w:rFonts w:ascii="ＭＳ 明朝" w:eastAsia="ＭＳ 明朝" w:hAnsi="ＭＳ 明朝"/>
+                <w:b w:val="false"/>
+                <w:bCs w:val="false"/>
+                <w:sz w:val="21"/>
+                <w:szCs w:val="21"/>
               </w:rPr>
               <w:t xml:space="preserve">2/13 神戸女子 一般前期C</w:t>
             </w:r>
@@ -4562,11 +4568,11 @@
             </w:pPr>
             <w:r>
               <w:rPr>
-                <w:rFonts w:ascii="Yu Gothic" w:eastAsia="Yu Gothic" w:hAnsi="Yu Gothic"/>
-                <w:b w:val="false"/>
-                <w:bCs w:val="false"/>
-                <w:sz w:val="19"/>
-                <w:szCs w:val="19"/>
+                <w:rFonts w:ascii="ＭＳ 明朝" w:eastAsia="ＭＳ 明朝" w:hAnsi="ＭＳ 明朝"/>
+                <w:b w:val="false"/>
+                <w:bCs w:val="false"/>
+                <w:sz w:val="21"/>
+                <w:szCs w:val="21"/>
               </w:rPr>
               <w:t xml:space="preserve">3月 各大学 後期日程</w:t>
             </w:r>
@@ -4595,11 +4601,11 @@
             </w:pPr>
             <w:r>
               <w:rPr>
-                <w:rFonts w:ascii="Yu Gothic" w:eastAsia="Yu Gothic" w:hAnsi="Yu Gothic"/>
-                <w:b w:val="false"/>
-                <w:bCs w:val="false"/>
-                <w:sz w:val="19"/>
-                <w:szCs w:val="19"/>
+                <w:rFonts w:ascii="ＭＳ 明朝" w:eastAsia="ＭＳ 明朝" w:hAnsi="ＭＳ 明朝"/>
+                <w:b w:val="false"/>
+                <w:bCs w:val="false"/>
+                <w:sz w:val="21"/>
+                <w:szCs w:val="21"/>
               </w:rPr>
               <w:t xml:space="preserve">最後まで気持ちを切らさない</w:t>
             </w:r>
@@ -4610,11 +4616,11 @@
             </w:pPr>
             <w:r>
               <w:rPr>
-                <w:rFonts w:ascii="Yu Gothic" w:eastAsia="Yu Gothic" w:hAnsi="Yu Gothic"/>
-                <w:b w:val="false"/>
-                <w:bCs w:val="false"/>
-                <w:sz w:val="19"/>
-                <w:szCs w:val="19"/>
+                <w:rFonts w:ascii="ＭＳ 明朝" w:eastAsia="ＭＳ 明朝" w:hAnsi="ＭＳ 明朝"/>
+                <w:b w:val="false"/>
+                <w:bCs w:val="false"/>
+                <w:sz w:val="21"/>
+                <w:szCs w:val="21"/>
               </w:rPr>
               <w:t xml:space="preserve">後期日程は募集人数が少なく難化しやすい</w:t>
             </w:r>
@@ -4628,7 +4634,7 @@
       </w:pPr>
       <w:r>
         <w:rPr>
-          <w:rFonts w:ascii="Yu Gothic" w:eastAsia="Yu Gothic" w:hAnsi="Yu Gothic"/>
+          <w:rFonts w:ascii="ＭＳ 明朝" w:eastAsia="ＭＳ 明朝" w:hAnsi="ＭＳ 明朝"/>
           <w:sz w:val="21"/>
           <w:szCs w:val="21"/>
         </w:rPr>
@@ -4637,6 +4643,7 @@
     </w:p>
     <w:p>
       <w:pPr>
+        <w:keepNext/>
         <w:pBdr>
           <w:bottom w:val="single" w:color="1F4E79" w:sz="8" w:space="2"/>
         </w:pBdr>
@@ -4644,12 +4651,12 @@
       </w:pPr>
       <w:r>
         <w:rPr>
-          <w:rFonts w:ascii="Yu Gothic" w:eastAsia="Yu Gothic" w:hAnsi="Yu Gothic"/>
+          <w:rFonts w:ascii="ＭＳ 明朝" w:eastAsia="ＭＳ 明朝" w:hAnsi="ＭＳ 明朝"/>
           <w:b/>
           <w:bCs/>
           <w:color w:val="1F4E79"/>
-          <w:sz w:val="23"/>
-          <w:szCs w:val="23"/>
+          <w:sz w:val="21"/>
+          <w:szCs w:val="21"/>
         </w:rPr>
         <w:t xml:space="preserve">おすすめの受験戦略</w:t>
       </w:r>
@@ -4665,7 +4672,7 @@
       </w:pPr>
       <w:r>
         <w:rPr>
-          <w:rFonts w:ascii="Yu Gothic" w:eastAsia="Yu Gothic" w:hAnsi="Yu Gothic"/>
+          <w:rFonts w:ascii="ＭＳ 明朝" w:eastAsia="ＭＳ 明朝" w:hAnsi="ＭＳ 明朝"/>
           <w:b/>
           <w:bCs/>
           <w:sz w:val="21"/>
@@ -4675,7 +4682,7 @@
       </w:r>
       <w:r>
         <w:rPr>
-          <w:rFonts w:ascii="Yu Gothic" w:eastAsia="Yu Gothic" w:hAnsi="Yu Gothic"/>
+          <w:rFonts w:ascii="ＭＳ 明朝" w:eastAsia="ＭＳ 明朝" w:hAnsi="ＭＳ 明朝"/>
           <w:sz w:val="21"/>
           <w:szCs w:val="21"/>
         </w:rPr>
@@ -4693,7 +4700,7 @@
       </w:pPr>
       <w:r>
         <w:rPr>
-          <w:rFonts w:ascii="Yu Gothic" w:eastAsia="Yu Gothic" w:hAnsi="Yu Gothic"/>
+          <w:rFonts w:ascii="ＭＳ 明朝" w:eastAsia="ＭＳ 明朝" w:hAnsi="ＭＳ 明朝"/>
           <w:b/>
           <w:bCs/>
           <w:sz w:val="21"/>
@@ -4703,7 +4710,7 @@
       </w:r>
       <w:r>
         <w:rPr>
-          <w:rFonts w:ascii="Yu Gothic" w:eastAsia="Yu Gothic" w:hAnsi="Yu Gothic"/>
+          <w:rFonts w:ascii="ＭＳ 明朝" w:eastAsia="ＭＳ 明朝" w:hAnsi="ＭＳ 明朝"/>
           <w:sz w:val="21"/>
           <w:szCs w:val="21"/>
         </w:rPr>
@@ -4721,7 +4728,7 @@
       </w:pPr>
       <w:r>
         <w:rPr>
-          <w:rFonts w:ascii="Yu Gothic" w:eastAsia="Yu Gothic" w:hAnsi="Yu Gothic"/>
+          <w:rFonts w:ascii="ＭＳ 明朝" w:eastAsia="ＭＳ 明朝" w:hAnsi="ＭＳ 明朝"/>
           <w:b/>
           <w:bCs/>
           <w:color w:val="C00000"/>
@@ -4732,7 +4739,7 @@
       </w:r>
       <w:r>
         <w:rPr>
-          <w:rFonts w:ascii="Yu Gothic" w:eastAsia="Yu Gothic" w:hAnsi="Yu Gothic"/>
+          <w:rFonts w:ascii="ＭＳ 明朝" w:eastAsia="ＭＳ 明朝" w:hAnsi="ＭＳ 明朝"/>
           <w:sz w:val="21"/>
           <w:szCs w:val="21"/>
         </w:rPr>
@@ -4750,7 +4757,7 @@
       </w:pPr>
       <w:r>
         <w:rPr>
-          <w:rFonts w:ascii="Yu Gothic" w:eastAsia="Yu Gothic" w:hAnsi="Yu Gothic"/>
+          <w:rFonts w:ascii="ＭＳ 明朝" w:eastAsia="ＭＳ 明朝" w:hAnsi="ＭＳ 明朝"/>
           <w:b/>
           <w:bCs/>
           <w:sz w:val="21"/>
@@ -4760,7 +4767,7 @@
       </w:r>
       <w:r>
         <w:rPr>
-          <w:rFonts w:ascii="Yu Gothic" w:eastAsia="Yu Gothic" w:hAnsi="Yu Gothic"/>
+          <w:rFonts w:ascii="ＭＳ 明朝" w:eastAsia="ＭＳ 明朝" w:hAnsi="ＭＳ 明朝"/>
           <w:sz w:val="21"/>
           <w:szCs w:val="21"/>
         </w:rPr>
@@ -4769,23 +4776,25 @@
     </w:p>
     <w:p>
       <w:pPr>
+        <w:keepNext/>
         <w:shd w:fill="1F4E79" w:color="auto" w:val="clear"/>
         <w:spacing w:after="120" w:before="240"/>
       </w:pPr>
       <w:r>
         <w:rPr>
-          <w:rFonts w:ascii="Yu Gothic" w:eastAsia="Yu Gothic" w:hAnsi="Yu Gothic"/>
+          <w:rFonts w:ascii="ＭＳ 明朝" w:eastAsia="ＭＳ 明朝" w:hAnsi="ＭＳ 明朝"/>
           <w:b/>
           <w:bCs/>
           <w:color w:val="FFFFFF"/>
-          <w:sz w:val="26"/>
-          <w:szCs w:val="26"/>
+          <w:sz w:val="21"/>
+          <w:szCs w:val="21"/>
         </w:rPr>
         <w:t xml:space="preserve">４．今から入試に向けて気を付けること</w:t>
       </w:r>
     </w:p>
     <w:p>
       <w:pPr>
+        <w:keepNext/>
         <w:pBdr>
           <w:bottom w:val="single" w:color="1F4E79" w:sz="8" w:space="2"/>
         </w:pBdr>
@@ -4793,12 +4802,12 @@
       </w:pPr>
       <w:r>
         <w:rPr>
-          <w:rFonts w:ascii="Yu Gothic" w:eastAsia="Yu Gothic" w:hAnsi="Yu Gothic"/>
+          <w:rFonts w:ascii="ＭＳ 明朝" w:eastAsia="ＭＳ 明朝" w:hAnsi="ＭＳ 明朝"/>
           <w:b/>
           <w:bCs/>
           <w:color w:val="1F4E79"/>
-          <w:sz w:val="23"/>
-          <w:szCs w:val="23"/>
+          <w:sz w:val="21"/>
+          <w:szCs w:val="21"/>
         </w:rPr>
         <w:t xml:space="preserve">【学習面】</w:t>
       </w:r>
@@ -4814,7 +4823,7 @@
       </w:pPr>
       <w:r>
         <w:rPr>
-          <w:rFonts w:ascii="Yu Gothic" w:eastAsia="Yu Gothic" w:hAnsi="Yu Gothic"/>
+          <w:rFonts w:ascii="ＭＳ 明朝" w:eastAsia="ＭＳ 明朝" w:hAnsi="ＭＳ 明朝"/>
           <w:b/>
           <w:bCs/>
           <w:sz w:val="21"/>
@@ -4824,7 +4833,7 @@
       </w:r>
       <w:r>
         <w:rPr>
-          <w:rFonts w:ascii="Yu Gothic" w:eastAsia="Yu Gothic" w:hAnsi="Yu Gothic"/>
+          <w:rFonts w:ascii="ＭＳ 明朝" w:eastAsia="ＭＳ 明朝" w:hAnsi="ＭＳ 明朝"/>
           <w:sz w:val="21"/>
           <w:szCs w:val="21"/>
         </w:rPr>
@@ -4842,7 +4851,7 @@
       </w:pPr>
       <w:r>
         <w:rPr>
-          <w:rFonts w:ascii="Yu Gothic" w:eastAsia="Yu Gothic" w:hAnsi="Yu Gothic"/>
+          <w:rFonts w:ascii="ＭＳ 明朝" w:eastAsia="ＭＳ 明朝" w:hAnsi="ＭＳ 明朝"/>
           <w:b/>
           <w:bCs/>
           <w:sz w:val="21"/>
@@ -4852,7 +4861,7 @@
       </w:r>
       <w:r>
         <w:rPr>
-          <w:rFonts w:ascii="Yu Gothic" w:eastAsia="Yu Gothic" w:hAnsi="Yu Gothic"/>
+          <w:rFonts w:ascii="ＭＳ 明朝" w:eastAsia="ＭＳ 明朝" w:hAnsi="ＭＳ 明朝"/>
           <w:sz w:val="21"/>
           <w:szCs w:val="21"/>
         </w:rPr>
@@ -4870,7 +4879,7 @@
       </w:pPr>
       <w:r>
         <w:rPr>
-          <w:rFonts w:ascii="Yu Gothic" w:eastAsia="Yu Gothic" w:hAnsi="Yu Gothic"/>
+          <w:rFonts w:ascii="ＭＳ 明朝" w:eastAsia="ＭＳ 明朝" w:hAnsi="ＭＳ 明朝"/>
           <w:b/>
           <w:bCs/>
           <w:sz w:val="21"/>
@@ -4880,7 +4889,7 @@
       </w:r>
       <w:r>
         <w:rPr>
-          <w:rFonts w:ascii="Yu Gothic" w:eastAsia="Yu Gothic" w:hAnsi="Yu Gothic"/>
+          <w:rFonts w:ascii="ＭＳ 明朝" w:eastAsia="ＭＳ 明朝" w:hAnsi="ＭＳ 明朝"/>
           <w:sz w:val="21"/>
           <w:szCs w:val="21"/>
         </w:rPr>
@@ -4898,7 +4907,7 @@
       </w:pPr>
       <w:r>
         <w:rPr>
-          <w:rFonts w:ascii="Yu Gothic" w:eastAsia="Yu Gothic" w:hAnsi="Yu Gothic"/>
+          <w:rFonts w:ascii="ＭＳ 明朝" w:eastAsia="ＭＳ 明朝" w:hAnsi="ＭＳ 明朝"/>
           <w:b/>
           <w:bCs/>
           <w:sz w:val="21"/>
@@ -4908,7 +4917,7 @@
       </w:r>
       <w:r>
         <w:rPr>
-          <w:rFonts w:ascii="Yu Gothic" w:eastAsia="Yu Gothic" w:hAnsi="Yu Gothic"/>
+          <w:rFonts w:ascii="ＭＳ 明朝" w:eastAsia="ＭＳ 明朝" w:hAnsi="ＭＳ 明朝"/>
           <w:sz w:val="21"/>
           <w:szCs w:val="21"/>
         </w:rPr>
@@ -4926,7 +4935,7 @@
       </w:pPr>
       <w:r>
         <w:rPr>
-          <w:rFonts w:ascii="Yu Gothic" w:eastAsia="Yu Gothic" w:hAnsi="Yu Gothic"/>
+          <w:rFonts w:ascii="ＭＳ 明朝" w:eastAsia="ＭＳ 明朝" w:hAnsi="ＭＳ 明朝"/>
           <w:b/>
           <w:bCs/>
           <w:sz w:val="21"/>
@@ -4936,7 +4945,7 @@
       </w:r>
       <w:r>
         <w:rPr>
-          <w:rFonts w:ascii="Yu Gothic" w:eastAsia="Yu Gothic" w:hAnsi="Yu Gothic"/>
+          <w:rFonts w:ascii="ＭＳ 明朝" w:eastAsia="ＭＳ 明朝" w:hAnsi="ＭＳ 明朝"/>
           <w:sz w:val="21"/>
           <w:szCs w:val="21"/>
         </w:rPr>
@@ -4945,6 +4954,7 @@
     </w:p>
     <w:p>
       <w:pPr>
+        <w:keepNext/>
         <w:pBdr>
           <w:bottom w:val="single" w:color="1F4E79" w:sz="8" w:space="2"/>
         </w:pBdr>
@@ -4952,12 +4962,12 @@
       </w:pPr>
       <w:r>
         <w:rPr>
-          <w:rFonts w:ascii="Yu Gothic" w:eastAsia="Yu Gothic" w:hAnsi="Yu Gothic"/>
+          <w:rFonts w:ascii="ＭＳ 明朝" w:eastAsia="ＭＳ 明朝" w:hAnsi="ＭＳ 明朝"/>
           <w:b/>
           <w:bCs/>
           <w:color w:val="1F4E79"/>
-          <w:sz w:val="23"/>
-          <w:szCs w:val="23"/>
+          <w:sz w:val="21"/>
+          <w:szCs w:val="21"/>
         </w:rPr>
         <w:t xml:space="preserve">【生活・手続き面】</w:t>
       </w:r>
@@ -4973,7 +4983,7 @@
       </w:pPr>
       <w:r>
         <w:rPr>
-          <w:rFonts w:ascii="Yu Gothic" w:eastAsia="Yu Gothic" w:hAnsi="Yu Gothic"/>
+          <w:rFonts w:ascii="ＭＳ 明朝" w:eastAsia="ＭＳ 明朝" w:hAnsi="ＭＳ 明朝"/>
           <w:b/>
           <w:bCs/>
           <w:sz w:val="21"/>
@@ -4983,7 +4993,7 @@
       </w:r>
       <w:r>
         <w:rPr>
-          <w:rFonts w:ascii="Yu Gothic" w:eastAsia="Yu Gothic" w:hAnsi="Yu Gothic"/>
+          <w:rFonts w:ascii="ＭＳ 明朝" w:eastAsia="ＭＳ 明朝" w:hAnsi="ＭＳ 明朝"/>
           <w:sz w:val="21"/>
           <w:szCs w:val="21"/>
         </w:rPr>
@@ -5001,7 +5011,7 @@
       </w:pPr>
       <w:r>
         <w:rPr>
-          <w:rFonts w:ascii="Yu Gothic" w:eastAsia="Yu Gothic" w:hAnsi="Yu Gothic"/>
+          <w:rFonts w:ascii="ＭＳ 明朝" w:eastAsia="ＭＳ 明朝" w:hAnsi="ＭＳ 明朝"/>
           <w:b/>
           <w:bCs/>
           <w:sz w:val="21"/>
@@ -5011,7 +5021,7 @@
       </w:r>
       <w:r>
         <w:rPr>
-          <w:rFonts w:ascii="Yu Gothic" w:eastAsia="Yu Gothic" w:hAnsi="Yu Gothic"/>
+          <w:rFonts w:ascii="ＭＳ 明朝" w:eastAsia="ＭＳ 明朝" w:hAnsi="ＭＳ 明朝"/>
           <w:sz w:val="21"/>
           <w:szCs w:val="21"/>
         </w:rPr>
@@ -5029,7 +5039,7 @@
       </w:pPr>
       <w:r>
         <w:rPr>
-          <w:rFonts w:ascii="Yu Gothic" w:eastAsia="Yu Gothic" w:hAnsi="Yu Gothic"/>
+          <w:rFonts w:ascii="ＭＳ 明朝" w:eastAsia="ＭＳ 明朝" w:hAnsi="ＭＳ 明朝"/>
           <w:sz w:val="21"/>
           <w:szCs w:val="21"/>
         </w:rPr>
@@ -5047,7 +5057,7 @@
       </w:pPr>
       <w:r>
         <w:rPr>
-          <w:rFonts w:ascii="Yu Gothic" w:eastAsia="Yu Gothic" w:hAnsi="Yu Gothic"/>
+          <w:rFonts w:ascii="ＭＳ 明朝" w:eastAsia="ＭＳ 明朝" w:hAnsi="ＭＳ 明朝"/>
           <w:b/>
           <w:bCs/>
           <w:sz w:val="21"/>
@@ -5057,7 +5067,7 @@
       </w:r>
       <w:r>
         <w:rPr>
-          <w:rFonts w:ascii="Yu Gothic" w:eastAsia="Yu Gothic" w:hAnsi="Yu Gothic"/>
+          <w:rFonts w:ascii="ＭＳ 明朝" w:eastAsia="ＭＳ 明朝" w:hAnsi="ＭＳ 明朝"/>
           <w:sz w:val="21"/>
           <w:szCs w:val="21"/>
         </w:rPr>
@@ -5075,7 +5085,7 @@
       </w:pPr>
       <w:r>
         <w:rPr>
-          <w:rFonts w:ascii="Yu Gothic" w:eastAsia="Yu Gothic" w:hAnsi="Yu Gothic"/>
+          <w:rFonts w:ascii="ＭＳ 明朝" w:eastAsia="ＭＳ 明朝" w:hAnsi="ＭＳ 明朝"/>
           <w:sz w:val="21"/>
           <w:szCs w:val="21"/>
         </w:rPr>
@@ -5084,6 +5094,7 @@
     </w:p>
     <w:p>
       <w:pPr>
+        <w:keepNext/>
         <w:pBdr>
           <w:bottom w:val="single" w:color="1F4E79" w:sz="8" w:space="2"/>
         </w:pBdr>
@@ -5091,12 +5102,12 @@
       </w:pPr>
       <w:r>
         <w:rPr>
-          <w:rFonts w:ascii="Yu Gothic" w:eastAsia="Yu Gothic" w:hAnsi="Yu Gothic"/>
+          <w:rFonts w:ascii="ＭＳ 明朝" w:eastAsia="ＭＳ 明朝" w:hAnsi="ＭＳ 明朝"/>
           <w:b/>
           <w:bCs/>
           <w:color w:val="1F4E79"/>
-          <w:sz w:val="23"/>
-          <w:szCs w:val="23"/>
+          <w:sz w:val="21"/>
+          <w:szCs w:val="21"/>
         </w:rPr>
         <w:t xml:space="preserve">【保護者の皆様へのお願い】</w:t>
       </w:r>
@@ -5112,7 +5123,7 @@
       </w:pPr>
       <w:r>
         <w:rPr>
-          <w:rFonts w:ascii="Yu Gothic" w:eastAsia="Yu Gothic" w:hAnsi="Yu Gothic"/>
+          <w:rFonts w:ascii="ＭＳ 明朝" w:eastAsia="ＭＳ 明朝" w:hAnsi="ＭＳ 明朝"/>
           <w:sz w:val="21"/>
           <w:szCs w:val="21"/>
         </w:rPr>
@@ -5130,7 +5141,7 @@
       </w:pPr>
       <w:r>
         <w:rPr>
-          <w:rFonts w:ascii="Yu Gothic" w:eastAsia="Yu Gothic" w:hAnsi="Yu Gothic"/>
+          <w:rFonts w:ascii="ＭＳ 明朝" w:eastAsia="ＭＳ 明朝" w:hAnsi="ＭＳ 明朝"/>
           <w:sz w:val="21"/>
           <w:szCs w:val="21"/>
         </w:rPr>
@@ -5148,7 +5159,7 @@
       </w:pPr>
       <w:r>
         <w:rPr>
-          <w:rFonts w:ascii="Yu Gothic" w:eastAsia="Yu Gothic" w:hAnsi="Yu Gothic"/>
+          <w:rFonts w:ascii="ＭＳ 明朝" w:eastAsia="ＭＳ 明朝" w:hAnsi="ＭＳ 明朝"/>
           <w:sz w:val="21"/>
           <w:szCs w:val="21"/>
         </w:rPr>
@@ -5157,17 +5168,18 @@
     </w:p>
     <w:p>
       <w:pPr>
+        <w:keepNext/>
         <w:shd w:fill="1F4E79" w:color="auto" w:val="clear"/>
         <w:spacing w:after="120" w:before="240"/>
       </w:pPr>
       <w:r>
         <w:rPr>
-          <w:rFonts w:ascii="Yu Gothic" w:eastAsia="Yu Gothic" w:hAnsi="Yu Gothic"/>
+          <w:rFonts w:ascii="ＭＳ 明朝" w:eastAsia="ＭＳ 明朝" w:hAnsi="ＭＳ 明朝"/>
           <w:b/>
           <w:bCs/>
           <w:color w:val="FFFFFF"/>
-          <w:sz w:val="26"/>
-          <w:szCs w:val="26"/>
+          <w:sz w:val="21"/>
+          <w:szCs w:val="21"/>
         </w:rPr>
         <w:t xml:space="preserve">５．塾での今後のサポート</w:t>
       </w:r>
@@ -5183,7 +5195,7 @@
       </w:pPr>
       <w:r>
         <w:rPr>
-          <w:rFonts w:ascii="Yu Gothic" w:eastAsia="Yu Gothic" w:hAnsi="Yu Gothic"/>
+          <w:rFonts w:ascii="ＭＳ 明朝" w:eastAsia="ＭＳ 明朝" w:hAnsi="ＭＳ 明朝"/>
           <w:sz w:val="21"/>
           <w:szCs w:val="21"/>
         </w:rPr>
@@ -5201,7 +5213,7 @@
       </w:pPr>
       <w:r>
         <w:rPr>
-          <w:rFonts w:ascii="Yu Gothic" w:eastAsia="Yu Gothic" w:hAnsi="Yu Gothic"/>
+          <w:rFonts w:ascii="ＭＳ 明朝" w:eastAsia="ＭＳ 明朝" w:hAnsi="ＭＳ 明朝"/>
           <w:sz w:val="21"/>
           <w:szCs w:val="21"/>
         </w:rPr>
@@ -5219,7 +5231,7 @@
       </w:pPr>
       <w:r>
         <w:rPr>
-          <w:rFonts w:ascii="Yu Gothic" w:eastAsia="Yu Gothic" w:hAnsi="Yu Gothic"/>
+          <w:rFonts w:ascii="ＭＳ 明朝" w:eastAsia="ＭＳ 明朝" w:hAnsi="ＭＳ 明朝"/>
           <w:sz w:val="21"/>
           <w:szCs w:val="21"/>
         </w:rPr>
@@ -5232,7 +5244,7 @@
       </w:pPr>
       <w:r>
         <w:rPr>
-          <w:rFonts w:ascii="Yu Gothic" w:eastAsia="Yu Gothic" w:hAnsi="Yu Gothic"/>
+          <w:rFonts w:ascii="ＭＳ 明朝" w:eastAsia="ＭＳ 明朝" w:hAnsi="ＭＳ 明朝"/>
           <w:sz w:val="21"/>
           <w:szCs w:val="21"/>
         </w:rPr>
@@ -5245,10 +5257,10 @@
       </w:pPr>
       <w:r>
         <w:rPr>
-          <w:rFonts w:ascii="Yu Gothic" w:eastAsia="Yu Gothic" w:hAnsi="Yu Gothic"/>
+          <w:rFonts w:ascii="ＭＳ 明朝" w:eastAsia="ＭＳ 明朝" w:hAnsi="ＭＳ 明朝"/>
           <w:color w:val="595959"/>
-          <w:sz w:val="18"/>
-          <w:szCs w:val="18"/>
+          <w:sz w:val="21"/>
+          <w:szCs w:val="21"/>
         </w:rPr>
         <w:t xml:space="preserve">【ご注意】本資料は2026年10月時点で公表されている情報をもとに作成しております。出願の際は、必ず各大学の「入学試験要項（募集要項）」および入試サイトで最新の情報をご確認ください。</w:t>
       </w:r>
@@ -5259,7 +5271,7 @@
       </w:pPr>
       <w:r>
         <w:rPr>
-          <w:rFonts w:ascii="Yu Gothic" w:eastAsia="Yu Gothic" w:hAnsi="Yu Gothic"/>
+          <w:rFonts w:ascii="ＭＳ 明朝" w:eastAsia="ＭＳ 明朝" w:hAnsi="ＭＳ 明朝"/>
           <w:sz w:val="21"/>
           <w:szCs w:val="21"/>
         </w:rPr>
@@ -5272,7 +5284,7 @@
       </w:pPr>
       <w:r>
         <w:rPr>
-          <w:rFonts w:ascii="Yu Gothic" w:eastAsia="Yu Gothic" w:hAnsi="Yu Gothic"/>
+          <w:rFonts w:ascii="ＭＳ 明朝" w:eastAsia="ＭＳ 明朝" w:hAnsi="ＭＳ 明朝"/>
           <w:b/>
           <w:bCs/>
           <w:color w:val="1F4E79"/>
@@ -5324,9 +5336,9 @@
             </w:pPr>
             <w:r>
               <w:rPr>
-                <w:rFonts w:ascii="Yu Gothic" w:eastAsia="Yu Gothic" w:hAnsi="Yu Gothic"/>
-                <w:sz w:val="19"/>
-                <w:szCs w:val="19"/>
+                <w:rFonts w:ascii="ＭＳ 明朝" w:eastAsia="ＭＳ 明朝" w:hAnsi="ＭＳ 明朝"/>
+                <w:sz w:val="21"/>
+                <w:szCs w:val="21"/>
               </w:rPr>
               <w:t xml:space="preserve"/>
             </w:r>
@@ -5394,9 +5406,10 @@
     </w:pPr>
     <w:r>
       <w:rPr>
+        <w:rFonts w:ascii="ＭＳ 明朝" w:eastAsia="ＭＳ 明朝" w:hAnsi="ＭＳ 明朝"/>
         <w:color w:val="808080"/>
-        <w:sz w:val="18"/>
-        <w:szCs w:val="18"/>
+        <w:sz w:val="21"/>
+        <w:szCs w:val="21"/>
       </w:rPr>
       <w:t xml:space="preserve">- </w:t>
       <w:fldChar w:fldCharType="begin"/>
@@ -5592,7 +5605,7 @@
   <w:docDefaults>
     <w:rPrDefault>
       <w:rPr>
-        <w:rFonts w:ascii="Yu Gothic" w:eastAsia="Yu Gothic" w:hAnsi="Yu Gothic"/>
+        <w:rFonts w:ascii="ＭＳ 明朝" w:eastAsia="ＭＳ 明朝" w:hAnsi="ＭＳ 明朝"/>
         <w:sz w:val="21"/>
         <w:szCs w:val="21"/>
       </w:rPr>

</xml_diff>

<commit_message>
Use default line spacing in entrance exam guide
Co-Authored-By: Claude Opus 5.5 <noreply@anthropic.com>
Claude-Session: https://claude.ai/code/session_01Nzw8LA1h98MBfBp5SVjuS5
</commit_message>
<xml_diff>
--- a/入試ガイダンス資料_神戸女子・神戸学院・武庫川.docx
+++ b/入試ガイダンス資料_神戸女子・神戸学院・武庫川.docx
@@ -4,7 +4,7 @@
   <w:body>
     <w:p>
       <w:pPr>
-        <w:spacing w:after="0" w:before="0" w:line="300"/>
+        <w:spacing w:after="0" w:before="0"/>
         <w:jc w:val="right"/>
       </w:pPr>
       <w:r>
@@ -19,7 +19,7 @@
     </w:p>
     <w:p>
       <w:pPr>
-        <w:spacing w:after="200" w:before="0" w:line="300"/>
+        <w:spacing w:after="200" w:before="0"/>
         <w:jc w:val="right"/>
       </w:pPr>
       <w:r>
@@ -34,7 +34,7 @@
     </w:p>
     <w:p>
       <w:pPr>
-        <w:spacing w:after="60" w:before="0" w:line="300"/>
+        <w:spacing w:after="60" w:before="0"/>
         <w:jc w:val="center"/>
       </w:pPr>
       <w:r>
@@ -51,7 +51,7 @@
     </w:p>
     <w:p>
       <w:pPr>
-        <w:spacing w:after="200" w:before="0" w:line="300"/>
+        <w:spacing w:after="200" w:before="0"/>
         <w:jc w:val="center"/>
       </w:pPr>
       <w:r>
@@ -66,7 +66,7 @@
     </w:p>
     <w:p>
       <w:pPr>
-        <w:spacing w:after="160" w:before="0" w:line="300"/>
+        <w:spacing w:after="160" w:before="0"/>
       </w:pPr>
       <w:r>
         <w:rPr>
@@ -79,7 +79,7 @@
     </w:p>
     <w:p>
       <w:pPr>
-        <w:spacing w:after="80" w:before="0" w:line="300"/>
+        <w:spacing w:after="80" w:before="0"/>
       </w:pPr>
       <w:r>
         <w:rPr>
@@ -144,7 +144,7 @@
           </w:tcPr>
           <w:p>
             <w:pPr>
-              <w:spacing w:after="0" w:line="270"/>
+              <w:spacing w:after="0"/>
             </w:pPr>
             <w:r>
               <w:rPr>
@@ -160,7 +160,7 @@
           </w:p>
           <w:p>
             <w:pPr>
-              <w:spacing w:after="0" w:line="270"/>
+              <w:spacing w:after="0"/>
             </w:pPr>
             <w:r>
               <w:rPr>
@@ -173,7 +173,7 @@
           </w:p>
           <w:p>
             <w:pPr>
-              <w:spacing w:after="0" w:line="270"/>
+              <w:spacing w:after="0"/>
             </w:pPr>
             <w:r>
               <w:rPr>
@@ -189,7 +189,7 @@
           </w:p>
           <w:p>
             <w:pPr>
-              <w:spacing w:after="0" w:line="270"/>
+              <w:spacing w:after="0"/>
             </w:pPr>
             <w:r>
               <w:rPr>
@@ -202,7 +202,7 @@
           </w:p>
           <w:p>
             <w:pPr>
-              <w:spacing w:after="0" w:line="270"/>
+              <w:spacing w:after="0"/>
             </w:pPr>
             <w:r>
               <w:rPr>
@@ -217,7 +217,7 @@
           </w:p>
           <w:p>
             <w:pPr>
-              <w:spacing w:after="0" w:line="270"/>
+              <w:spacing w:after="0"/>
             </w:pPr>
             <w:r>
               <w:rPr>
@@ -251,7 +251,7 @@
     </w:p>
     <w:p>
       <w:pPr>
-        <w:spacing w:after="80" w:before="0" w:line="300"/>
+        <w:spacing w:after="80" w:before="0"/>
       </w:pPr>
       <w:r>
         <w:rPr>
@@ -326,7 +326,7 @@
           </w:tcPr>
           <w:p>
             <w:pPr>
-              <w:spacing w:after="0" w:line="270"/>
+              <w:spacing w:after="0"/>
               <w:jc w:val="center"/>
             </w:pPr>
             <w:r>
@@ -362,7 +362,7 @@
           </w:tcPr>
           <w:p>
             <w:pPr>
-              <w:spacing w:after="0" w:line="270"/>
+              <w:spacing w:after="0"/>
               <w:jc w:val="center"/>
             </w:pPr>
             <w:r>
@@ -398,7 +398,7 @@
           </w:tcPr>
           <w:p>
             <w:pPr>
-              <w:spacing w:after="0" w:line="270"/>
+              <w:spacing w:after="0"/>
               <w:jc w:val="center"/>
             </w:pPr>
             <w:r>
@@ -434,7 +434,7 @@
           </w:tcPr>
           <w:p>
             <w:pPr>
-              <w:spacing w:after="0" w:line="270"/>
+              <w:spacing w:after="0"/>
               <w:jc w:val="center"/>
             </w:pPr>
             <w:r>
@@ -470,7 +470,7 @@
           </w:tcPr>
           <w:p>
             <w:pPr>
-              <w:spacing w:after="0" w:line="270"/>
+              <w:spacing w:after="0"/>
               <w:jc w:val="center"/>
             </w:pPr>
             <w:r>
@@ -511,7 +511,7 @@
           </w:tcPr>
           <w:p>
             <w:pPr>
-              <w:spacing w:after="0" w:line="270"/>
+              <w:spacing w:after="0"/>
               <w:jc w:val="center"/>
             </w:pPr>
             <w:r>
@@ -527,7 +527,7 @@
           </w:p>
           <w:p>
             <w:pPr>
-              <w:spacing w:after="0" w:line="270"/>
+              <w:spacing w:after="0"/>
               <w:jc w:val="center"/>
             </w:pPr>
             <w:r>
@@ -562,7 +562,7 @@
           </w:tcPr>
           <w:p>
             <w:pPr>
-              <w:spacing w:after="0" w:line="270"/>
+              <w:spacing w:after="0"/>
             </w:pPr>
             <w:r>
               <w:rPr>
@@ -577,7 +577,7 @@
           </w:p>
           <w:p>
             <w:pPr>
-              <w:spacing w:after="0" w:line="270"/>
+              <w:spacing w:after="0"/>
             </w:pPr>
             <w:r>
               <w:rPr>
@@ -611,7 +611,7 @@
           </w:tcPr>
           <w:p>
             <w:pPr>
-              <w:spacing w:after="0" w:line="270"/>
+              <w:spacing w:after="0"/>
             </w:pPr>
             <w:r>
               <w:rPr>
@@ -626,7 +626,7 @@
           </w:p>
           <w:p>
             <w:pPr>
-              <w:spacing w:after="0" w:line="270"/>
+              <w:spacing w:after="0"/>
             </w:pPr>
             <w:r>
               <w:rPr>
@@ -660,7 +660,7 @@
           </w:tcPr>
           <w:p>
             <w:pPr>
-              <w:spacing w:after="0" w:line="270"/>
+              <w:spacing w:after="0"/>
             </w:pPr>
             <w:r>
               <w:rPr>
@@ -694,7 +694,7 @@
           </w:tcPr>
           <w:p>
             <w:pPr>
-              <w:spacing w:after="0" w:line="270"/>
+              <w:spacing w:after="0"/>
             </w:pPr>
             <w:r>
               <w:rPr>
@@ -709,7 +709,7 @@
           </w:p>
           <w:p>
             <w:pPr>
-              <w:spacing w:after="0" w:line="270"/>
+              <w:spacing w:after="0"/>
             </w:pPr>
             <w:r>
               <w:rPr>
@@ -748,7 +748,7 @@
           </w:tcPr>
           <w:p>
             <w:pPr>
-              <w:spacing w:after="0" w:line="270"/>
+              <w:spacing w:after="0"/>
               <w:jc w:val="center"/>
             </w:pPr>
             <w:r>
@@ -764,7 +764,7 @@
           </w:p>
           <w:p>
             <w:pPr>
-              <w:spacing w:after="0" w:line="270"/>
+              <w:spacing w:after="0"/>
               <w:jc w:val="center"/>
             </w:pPr>
             <w:r>
@@ -798,7 +798,7 @@
           </w:tcPr>
           <w:p>
             <w:pPr>
-              <w:spacing w:after="0" w:line="270"/>
+              <w:spacing w:after="0"/>
             </w:pPr>
             <w:r>
               <w:rPr>
@@ -813,7 +813,7 @@
           </w:p>
           <w:p>
             <w:pPr>
-              <w:spacing w:after="0" w:line="270"/>
+              <w:spacing w:after="0"/>
             </w:pPr>
             <w:r>
               <w:rPr>
@@ -846,7 +846,7 @@
           </w:tcPr>
           <w:p>
             <w:pPr>
-              <w:spacing w:after="0" w:line="270"/>
+              <w:spacing w:after="0"/>
             </w:pPr>
             <w:r>
               <w:rPr>
@@ -879,7 +879,7 @@
           </w:tcPr>
           <w:p>
             <w:pPr>
-              <w:spacing w:after="0" w:line="270"/>
+              <w:spacing w:after="0"/>
             </w:pPr>
             <w:r>
               <w:rPr>
@@ -912,7 +912,7 @@
           </w:tcPr>
           <w:p>
             <w:pPr>
-              <w:spacing w:after="0" w:line="270"/>
+              <w:spacing w:after="0"/>
             </w:pPr>
             <w:r>
               <w:rPr>
@@ -951,7 +951,7 @@
           </w:tcPr>
           <w:p>
             <w:pPr>
-              <w:spacing w:after="0" w:line="270"/>
+              <w:spacing w:after="0"/>
               <w:jc w:val="center"/>
             </w:pPr>
             <w:r>
@@ -967,7 +967,7 @@
           </w:p>
           <w:p>
             <w:pPr>
-              <w:spacing w:after="0" w:line="270"/>
+              <w:spacing w:after="0"/>
               <w:jc w:val="center"/>
             </w:pPr>
             <w:r>
@@ -1001,7 +1001,7 @@
           </w:tcPr>
           <w:p>
             <w:pPr>
-              <w:spacing w:after="0" w:line="270"/>
+              <w:spacing w:after="0"/>
             </w:pPr>
             <w:r>
               <w:rPr>
@@ -1016,7 +1016,7 @@
           </w:p>
           <w:p>
             <w:pPr>
-              <w:spacing w:after="0" w:line="270"/>
+              <w:spacing w:after="0"/>
             </w:pPr>
             <w:r>
               <w:rPr>
@@ -1049,7 +1049,7 @@
           </w:tcPr>
           <w:p>
             <w:pPr>
-              <w:spacing w:after="0" w:line="270"/>
+              <w:spacing w:after="0"/>
             </w:pPr>
             <w:r>
               <w:rPr>
@@ -1064,7 +1064,7 @@
           </w:p>
           <w:p>
             <w:pPr>
-              <w:spacing w:after="0" w:line="270"/>
+              <w:spacing w:after="0"/>
             </w:pPr>
             <w:r>
               <w:rPr>
@@ -1097,7 +1097,7 @@
           </w:tcPr>
           <w:p>
             <w:pPr>
-              <w:spacing w:after="0" w:line="270"/>
+              <w:spacing w:after="0"/>
             </w:pPr>
             <w:r>
               <w:rPr>
@@ -1130,7 +1130,7 @@
           </w:tcPr>
           <w:p>
             <w:pPr>
-              <w:spacing w:after="0" w:line="270"/>
+              <w:spacing w:after="0"/>
             </w:pPr>
             <w:r>
               <w:rPr>
@@ -1145,7 +1145,7 @@
           </w:p>
           <w:p>
             <w:pPr>
-              <w:spacing w:after="0" w:line="270"/>
+              <w:spacing w:after="0"/>
             </w:pPr>
             <w:r>
               <w:rPr>
@@ -1184,7 +1184,7 @@
           </w:tcPr>
           <w:p>
             <w:pPr>
-              <w:spacing w:after="0" w:line="270"/>
+              <w:spacing w:after="0"/>
               <w:jc w:val="center"/>
             </w:pPr>
             <w:r>
@@ -1200,7 +1200,7 @@
           </w:p>
           <w:p>
             <w:pPr>
-              <w:spacing w:after="0" w:line="270"/>
+              <w:spacing w:after="0"/>
               <w:jc w:val="center"/>
             </w:pPr>
             <w:r>
@@ -1234,7 +1234,7 @@
           </w:tcPr>
           <w:p>
             <w:pPr>
-              <w:spacing w:after="0" w:line="270"/>
+              <w:spacing w:after="0"/>
             </w:pPr>
             <w:r>
               <w:rPr>
@@ -1249,7 +1249,7 @@
           </w:p>
           <w:p>
             <w:pPr>
-              <w:spacing w:after="0" w:line="270"/>
+              <w:spacing w:after="0"/>
             </w:pPr>
             <w:r>
               <w:rPr>
@@ -1282,7 +1282,7 @@
           </w:tcPr>
           <w:p>
             <w:pPr>
-              <w:spacing w:after="0" w:line="270"/>
+              <w:spacing w:after="0"/>
             </w:pPr>
             <w:r>
               <w:rPr>
@@ -1315,7 +1315,7 @@
           </w:tcPr>
           <w:p>
             <w:pPr>
-              <w:spacing w:after="0" w:line="270"/>
+              <w:spacing w:after="0"/>
             </w:pPr>
             <w:r>
               <w:rPr>
@@ -1348,7 +1348,7 @@
           </w:tcPr>
           <w:p>
             <w:pPr>
-              <w:spacing w:after="0" w:line="270"/>
+              <w:spacing w:after="0"/>
             </w:pPr>
             <w:r>
               <w:rPr>
@@ -1387,7 +1387,7 @@
           </w:tcPr>
           <w:p>
             <w:pPr>
-              <w:spacing w:after="0" w:line="270"/>
+              <w:spacing w:after="0"/>
               <w:jc w:val="center"/>
             </w:pPr>
             <w:r>
@@ -1403,7 +1403,7 @@
           </w:p>
           <w:p>
             <w:pPr>
-              <w:spacing w:after="0" w:line="270"/>
+              <w:spacing w:after="0"/>
               <w:jc w:val="center"/>
             </w:pPr>
             <w:r>
@@ -1437,7 +1437,7 @@
           </w:tcPr>
           <w:p>
             <w:pPr>
-              <w:spacing w:after="0" w:line="270"/>
+              <w:spacing w:after="0"/>
             </w:pPr>
             <w:r>
               <w:rPr>
@@ -1452,7 +1452,7 @@
           </w:p>
           <w:p>
             <w:pPr>
-              <w:spacing w:after="0" w:line="270"/>
+              <w:spacing w:after="0"/>
             </w:pPr>
             <w:r>
               <w:rPr>
@@ -1485,7 +1485,7 @@
           </w:tcPr>
           <w:p>
             <w:pPr>
-              <w:spacing w:after="0" w:line="270"/>
+              <w:spacing w:after="0"/>
             </w:pPr>
             <w:r>
               <w:rPr>
@@ -1518,7 +1518,7 @@
           </w:tcPr>
           <w:p>
             <w:pPr>
-              <w:spacing w:after="0" w:line="270"/>
+              <w:spacing w:after="0"/>
             </w:pPr>
             <w:r>
               <w:rPr>
@@ -1551,7 +1551,7 @@
           </w:tcPr>
           <w:p>
             <w:pPr>
-              <w:spacing w:after="0" w:line="270"/>
+              <w:spacing w:after="0"/>
             </w:pPr>
             <w:r>
               <w:rPr>
@@ -1569,7 +1569,7 @@
     </w:tbl>
     <w:p>
       <w:pPr>
-        <w:spacing w:after="80" w:before="80" w:line="300"/>
+        <w:spacing w:after="80" w:before="80"/>
       </w:pPr>
       <w:r>
         <w:rPr>
@@ -1643,7 +1643,7 @@
           </w:tcPr>
           <w:p>
             <w:pPr>
-              <w:spacing w:after="0" w:line="270"/>
+              <w:spacing w:after="0"/>
               <w:jc w:val="center"/>
             </w:pPr>
             <w:r>
@@ -1679,7 +1679,7 @@
           </w:tcPr>
           <w:p>
             <w:pPr>
-              <w:spacing w:after="0" w:line="270"/>
+              <w:spacing w:after="0"/>
               <w:jc w:val="center"/>
             </w:pPr>
             <w:r>
@@ -1715,7 +1715,7 @@
           </w:tcPr>
           <w:p>
             <w:pPr>
-              <w:spacing w:after="0" w:line="270"/>
+              <w:spacing w:after="0"/>
               <w:jc w:val="center"/>
             </w:pPr>
             <w:r>
@@ -1751,7 +1751,7 @@
           </w:tcPr>
           <w:p>
             <w:pPr>
-              <w:spacing w:after="0" w:line="270"/>
+              <w:spacing w:after="0"/>
               <w:jc w:val="center"/>
             </w:pPr>
             <w:r>
@@ -1787,7 +1787,7 @@
           </w:tcPr>
           <w:p>
             <w:pPr>
-              <w:spacing w:after="0" w:line="270"/>
+              <w:spacing w:after="0"/>
               <w:jc w:val="center"/>
             </w:pPr>
             <w:r>
@@ -1828,7 +1828,7 @@
           </w:tcPr>
           <w:p>
             <w:pPr>
-              <w:spacing w:after="0" w:line="270"/>
+              <w:spacing w:after="0"/>
               <w:jc w:val="center"/>
             </w:pPr>
             <w:r>
@@ -1844,7 +1844,7 @@
           </w:p>
           <w:p>
             <w:pPr>
-              <w:spacing w:after="0" w:line="270"/>
+              <w:spacing w:after="0"/>
               <w:jc w:val="center"/>
             </w:pPr>
             <w:r>
@@ -1878,7 +1878,7 @@
           </w:tcPr>
           <w:p>
             <w:pPr>
-              <w:spacing w:after="0" w:line="270"/>
+              <w:spacing w:after="0"/>
             </w:pPr>
             <w:r>
               <w:rPr>
@@ -1893,7 +1893,7 @@
           </w:p>
           <w:p>
             <w:pPr>
-              <w:spacing w:after="0" w:line="270"/>
+              <w:spacing w:after="0"/>
             </w:pPr>
             <w:r>
               <w:rPr>
@@ -1926,7 +1926,7 @@
           </w:tcPr>
           <w:p>
             <w:pPr>
-              <w:spacing w:after="0" w:line="270"/>
+              <w:spacing w:after="0"/>
             </w:pPr>
             <w:r>
               <w:rPr>
@@ -1941,7 +1941,7 @@
           </w:p>
           <w:p>
             <w:pPr>
-              <w:spacing w:after="0" w:line="270"/>
+              <w:spacing w:after="0"/>
             </w:pPr>
             <w:r>
               <w:rPr>
@@ -1956,7 +1956,7 @@
           </w:p>
           <w:p>
             <w:pPr>
-              <w:spacing w:after="0" w:line="270"/>
+              <w:spacing w:after="0"/>
             </w:pPr>
             <w:r>
               <w:rPr>
@@ -1989,7 +1989,7 @@
           </w:tcPr>
           <w:p>
             <w:pPr>
-              <w:spacing w:after="0" w:line="270"/>
+              <w:spacing w:after="0"/>
             </w:pPr>
             <w:r>
               <w:rPr>
@@ -2022,7 +2022,7 @@
           </w:tcPr>
           <w:p>
             <w:pPr>
-              <w:spacing w:after="0" w:line="270"/>
+              <w:spacing w:after="0"/>
             </w:pPr>
             <w:r>
               <w:rPr>
@@ -2037,7 +2037,7 @@
           </w:p>
           <w:p>
             <w:pPr>
-              <w:spacing w:after="0" w:line="270"/>
+              <w:spacing w:after="0"/>
             </w:pPr>
             <w:r>
               <w:rPr>
@@ -2052,7 +2052,7 @@
           </w:p>
           <w:p>
             <w:pPr>
-              <w:spacing w:after="0" w:line="270"/>
+              <w:spacing w:after="0"/>
             </w:pPr>
             <w:r>
               <w:rPr>
@@ -2091,7 +2091,7 @@
           </w:tcPr>
           <w:p>
             <w:pPr>
-              <w:spacing w:after="0" w:line="270"/>
+              <w:spacing w:after="0"/>
               <w:jc w:val="center"/>
             </w:pPr>
             <w:r>
@@ -2107,7 +2107,7 @@
           </w:p>
           <w:p>
             <w:pPr>
-              <w:spacing w:after="0" w:line="270"/>
+              <w:spacing w:after="0"/>
               <w:jc w:val="center"/>
             </w:pPr>
             <w:r>
@@ -2141,7 +2141,7 @@
           </w:tcPr>
           <w:p>
             <w:pPr>
-              <w:spacing w:after="0" w:line="270"/>
+              <w:spacing w:after="0"/>
             </w:pPr>
             <w:r>
               <w:rPr>
@@ -2156,7 +2156,7 @@
           </w:p>
           <w:p>
             <w:pPr>
-              <w:spacing w:after="0" w:line="270"/>
+              <w:spacing w:after="0"/>
             </w:pPr>
             <w:r>
               <w:rPr>
@@ -2189,7 +2189,7 @@
           </w:tcPr>
           <w:p>
             <w:pPr>
-              <w:spacing w:after="0" w:line="270"/>
+              <w:spacing w:after="0"/>
             </w:pPr>
             <w:r>
               <w:rPr>
@@ -2204,7 +2204,7 @@
           </w:p>
           <w:p>
             <w:pPr>
-              <w:spacing w:after="0" w:line="270"/>
+              <w:spacing w:after="0"/>
             </w:pPr>
             <w:r>
               <w:rPr>
@@ -2219,7 +2219,7 @@
           </w:p>
           <w:p>
             <w:pPr>
-              <w:spacing w:after="0" w:line="270"/>
+              <w:spacing w:after="0"/>
             </w:pPr>
             <w:r>
               <w:rPr>
@@ -2252,7 +2252,7 @@
           </w:tcPr>
           <w:p>
             <w:pPr>
-              <w:spacing w:after="0" w:line="270"/>
+              <w:spacing w:after="0"/>
             </w:pPr>
             <w:r>
               <w:rPr>
@@ -2285,7 +2285,7 @@
           </w:tcPr>
           <w:p>
             <w:pPr>
-              <w:spacing w:after="0" w:line="270"/>
+              <w:spacing w:after="0"/>
             </w:pPr>
             <w:r>
               <w:rPr>
@@ -2300,7 +2300,7 @@
           </w:p>
           <w:p>
             <w:pPr>
-              <w:spacing w:after="0" w:line="270"/>
+              <w:spacing w:after="0"/>
             </w:pPr>
             <w:r>
               <w:rPr>
@@ -2339,7 +2339,7 @@
           </w:tcPr>
           <w:p>
             <w:pPr>
-              <w:spacing w:after="0" w:line="270"/>
+              <w:spacing w:after="0"/>
               <w:jc w:val="center"/>
             </w:pPr>
             <w:r>
@@ -2355,7 +2355,7 @@
           </w:p>
           <w:p>
             <w:pPr>
-              <w:spacing w:after="0" w:line="270"/>
+              <w:spacing w:after="0"/>
               <w:jc w:val="center"/>
             </w:pPr>
             <w:r>
@@ -2389,7 +2389,7 @@
           </w:tcPr>
           <w:p>
             <w:pPr>
-              <w:spacing w:after="0" w:line="270"/>
+              <w:spacing w:after="0"/>
             </w:pPr>
             <w:r>
               <w:rPr>
@@ -2422,7 +2422,7 @@
           </w:tcPr>
           <w:p>
             <w:pPr>
-              <w:spacing w:after="0" w:line="270"/>
+              <w:spacing w:after="0"/>
             </w:pPr>
             <w:r>
               <w:rPr>
@@ -2437,7 +2437,7 @@
           </w:p>
           <w:p>
             <w:pPr>
-              <w:spacing w:after="0" w:line="270"/>
+              <w:spacing w:after="0"/>
             </w:pPr>
             <w:r>
               <w:rPr>
@@ -2470,7 +2470,7 @@
           </w:tcPr>
           <w:p>
             <w:pPr>
-              <w:spacing w:after="0" w:line="270"/>
+              <w:spacing w:after="0"/>
             </w:pPr>
             <w:r>
               <w:rPr>
@@ -2503,7 +2503,7 @@
           </w:tcPr>
           <w:p>
             <w:pPr>
-              <w:spacing w:after="0" w:line="270"/>
+              <w:spacing w:after="0"/>
             </w:pPr>
             <w:r>
               <w:rPr>
@@ -2521,7 +2521,7 @@
     </w:tbl>
     <w:p>
       <w:pPr>
-        <w:spacing w:after="80" w:before="80" w:line="300"/>
+        <w:spacing w:after="80" w:before="80"/>
       </w:pPr>
       <w:r>
         <w:rPr>
@@ -2595,7 +2595,7 @@
           </w:tcPr>
           <w:p>
             <w:pPr>
-              <w:spacing w:after="0" w:line="270"/>
+              <w:spacing w:after="0"/>
               <w:jc w:val="center"/>
             </w:pPr>
             <w:r>
@@ -2631,7 +2631,7 @@
           </w:tcPr>
           <w:p>
             <w:pPr>
-              <w:spacing w:after="0" w:line="270"/>
+              <w:spacing w:after="0"/>
               <w:jc w:val="center"/>
             </w:pPr>
             <w:r>
@@ -2667,7 +2667,7 @@
           </w:tcPr>
           <w:p>
             <w:pPr>
-              <w:spacing w:after="0" w:line="270"/>
+              <w:spacing w:after="0"/>
               <w:jc w:val="center"/>
             </w:pPr>
             <w:r>
@@ -2703,7 +2703,7 @@
           </w:tcPr>
           <w:p>
             <w:pPr>
-              <w:spacing w:after="0" w:line="270"/>
+              <w:spacing w:after="0"/>
               <w:jc w:val="center"/>
             </w:pPr>
             <w:r>
@@ -2739,7 +2739,7 @@
           </w:tcPr>
           <w:p>
             <w:pPr>
-              <w:spacing w:after="0" w:line="270"/>
+              <w:spacing w:after="0"/>
               <w:jc w:val="center"/>
             </w:pPr>
             <w:r>
@@ -2780,7 +2780,7 @@
           </w:tcPr>
           <w:p>
             <w:pPr>
-              <w:spacing w:after="0" w:line="270"/>
+              <w:spacing w:after="0"/>
               <w:jc w:val="center"/>
             </w:pPr>
             <w:r>
@@ -2796,7 +2796,7 @@
           </w:p>
           <w:p>
             <w:pPr>
-              <w:spacing w:after="0" w:line="270"/>
+              <w:spacing w:after="0"/>
               <w:jc w:val="center"/>
             </w:pPr>
             <w:r>
@@ -2831,7 +2831,7 @@
           </w:tcPr>
           <w:p>
             <w:pPr>
-              <w:spacing w:after="0" w:line="270"/>
+              <w:spacing w:after="0"/>
             </w:pPr>
             <w:r>
               <w:rPr>
@@ -2846,7 +2846,7 @@
           </w:p>
           <w:p>
             <w:pPr>
-              <w:spacing w:after="0" w:line="270"/>
+              <w:spacing w:after="0"/>
             </w:pPr>
             <w:r>
               <w:rPr>
@@ -2880,7 +2880,7 @@
           </w:tcPr>
           <w:p>
             <w:pPr>
-              <w:spacing w:after="0" w:line="270"/>
+              <w:spacing w:after="0"/>
             </w:pPr>
             <w:r>
               <w:rPr>
@@ -2895,7 +2895,7 @@
           </w:p>
           <w:p>
             <w:pPr>
-              <w:spacing w:after="0" w:line="270"/>
+              <w:spacing w:after="0"/>
             </w:pPr>
             <w:r>
               <w:rPr>
@@ -2929,7 +2929,7 @@
           </w:tcPr>
           <w:p>
             <w:pPr>
-              <w:spacing w:after="0" w:line="270"/>
+              <w:spacing w:after="0"/>
             </w:pPr>
             <w:r>
               <w:rPr>
@@ -2963,7 +2963,7 @@
           </w:tcPr>
           <w:p>
             <w:pPr>
-              <w:spacing w:after="0" w:line="270"/>
+              <w:spacing w:after="0"/>
             </w:pPr>
             <w:r>
               <w:rPr>
@@ -2978,7 +2978,7 @@
           </w:p>
           <w:p>
             <w:pPr>
-              <w:spacing w:after="0" w:line="270"/>
+              <w:spacing w:after="0"/>
             </w:pPr>
             <w:r>
               <w:rPr>
@@ -2993,7 +2993,7 @@
           </w:p>
           <w:p>
             <w:pPr>
-              <w:spacing w:after="0" w:line="270"/>
+              <w:spacing w:after="0"/>
             </w:pPr>
             <w:r>
               <w:rPr>
@@ -3032,7 +3032,7 @@
           </w:tcPr>
           <w:p>
             <w:pPr>
-              <w:spacing w:after="0" w:line="270"/>
+              <w:spacing w:after="0"/>
               <w:jc w:val="center"/>
             </w:pPr>
             <w:r>
@@ -3048,7 +3048,7 @@
           </w:p>
           <w:p>
             <w:pPr>
-              <w:spacing w:after="0" w:line="270"/>
+              <w:spacing w:after="0"/>
               <w:jc w:val="center"/>
             </w:pPr>
             <w:r>
@@ -3082,7 +3082,7 @@
           </w:tcPr>
           <w:p>
             <w:pPr>
-              <w:spacing w:after="0" w:line="270"/>
+              <w:spacing w:after="0"/>
             </w:pPr>
             <w:r>
               <w:rPr>
@@ -3097,7 +3097,7 @@
           </w:p>
           <w:p>
             <w:pPr>
-              <w:spacing w:after="0" w:line="270"/>
+              <w:spacing w:after="0"/>
             </w:pPr>
             <w:r>
               <w:rPr>
@@ -3130,7 +3130,7 @@
           </w:tcPr>
           <w:p>
             <w:pPr>
-              <w:spacing w:after="0" w:line="270"/>
+              <w:spacing w:after="0"/>
             </w:pPr>
             <w:r>
               <w:rPr>
@@ -3145,7 +3145,7 @@
           </w:p>
           <w:p>
             <w:pPr>
-              <w:spacing w:after="0" w:line="270"/>
+              <w:spacing w:after="0"/>
             </w:pPr>
             <w:r>
               <w:rPr>
@@ -3178,7 +3178,7 @@
           </w:tcPr>
           <w:p>
             <w:pPr>
-              <w:spacing w:after="0" w:line="270"/>
+              <w:spacing w:after="0"/>
             </w:pPr>
             <w:r>
               <w:rPr>
@@ -3211,7 +3211,7 @@
           </w:tcPr>
           <w:p>
             <w:pPr>
-              <w:spacing w:after="0" w:line="270"/>
+              <w:spacing w:after="0"/>
             </w:pPr>
             <w:r>
               <w:rPr>
@@ -3226,7 +3226,7 @@
           </w:p>
           <w:p>
             <w:pPr>
-              <w:spacing w:after="0" w:line="270"/>
+              <w:spacing w:after="0"/>
             </w:pPr>
             <w:r>
               <w:rPr>
@@ -3265,7 +3265,7 @@
           </w:tcPr>
           <w:p>
             <w:pPr>
-              <w:spacing w:after="0" w:line="270"/>
+              <w:spacing w:after="0"/>
               <w:jc w:val="center"/>
             </w:pPr>
             <w:r>
@@ -3281,7 +3281,7 @@
           </w:p>
           <w:p>
             <w:pPr>
-              <w:spacing w:after="0" w:line="270"/>
+              <w:spacing w:after="0"/>
               <w:jc w:val="center"/>
             </w:pPr>
             <w:r>
@@ -3315,7 +3315,7 @@
           </w:tcPr>
           <w:p>
             <w:pPr>
-              <w:spacing w:after="0" w:line="270"/>
+              <w:spacing w:after="0"/>
             </w:pPr>
             <w:r>
               <w:rPr>
@@ -3330,7 +3330,7 @@
           </w:p>
           <w:p>
             <w:pPr>
-              <w:spacing w:after="0" w:line="270"/>
+              <w:spacing w:after="0"/>
             </w:pPr>
             <w:r>
               <w:rPr>
@@ -3363,7 +3363,7 @@
           </w:tcPr>
           <w:p>
             <w:pPr>
-              <w:spacing w:after="0" w:line="270"/>
+              <w:spacing w:after="0"/>
             </w:pPr>
             <w:r>
               <w:rPr>
@@ -3378,7 +3378,7 @@
           </w:p>
           <w:p>
             <w:pPr>
-              <w:spacing w:after="0" w:line="270"/>
+              <w:spacing w:after="0"/>
             </w:pPr>
             <w:r>
               <w:rPr>
@@ -3411,7 +3411,7 @@
           </w:tcPr>
           <w:p>
             <w:pPr>
-              <w:spacing w:after="0" w:line="270"/>
+              <w:spacing w:after="0"/>
             </w:pPr>
             <w:r>
               <w:rPr>
@@ -3444,7 +3444,7 @@
           </w:tcPr>
           <w:p>
             <w:pPr>
-              <w:spacing w:after="0" w:line="270"/>
+              <w:spacing w:after="0"/>
             </w:pPr>
             <w:r>
               <w:rPr>
@@ -3459,7 +3459,7 @@
           </w:p>
           <w:p>
             <w:pPr>
-              <w:spacing w:after="0" w:line="270"/>
+              <w:spacing w:after="0"/>
             </w:pPr>
             <w:r>
               <w:rPr>
@@ -3498,7 +3498,7 @@
           </w:tcPr>
           <w:p>
             <w:pPr>
-              <w:spacing w:after="0" w:line="270"/>
+              <w:spacing w:after="0"/>
               <w:jc w:val="center"/>
             </w:pPr>
             <w:r>
@@ -3514,7 +3514,7 @@
           </w:p>
           <w:p>
             <w:pPr>
-              <w:spacing w:after="0" w:line="270"/>
+              <w:spacing w:after="0"/>
               <w:jc w:val="center"/>
             </w:pPr>
             <w:r>
@@ -3548,7 +3548,7 @@
           </w:tcPr>
           <w:p>
             <w:pPr>
-              <w:spacing w:after="0" w:line="270"/>
+              <w:spacing w:after="0"/>
             </w:pPr>
             <w:r>
               <w:rPr>
@@ -3563,7 +3563,7 @@
           </w:p>
           <w:p>
             <w:pPr>
-              <w:spacing w:after="0" w:line="270"/>
+              <w:spacing w:after="0"/>
             </w:pPr>
             <w:r>
               <w:rPr>
@@ -3596,7 +3596,7 @@
           </w:tcPr>
           <w:p>
             <w:pPr>
-              <w:spacing w:after="0" w:line="270"/>
+              <w:spacing w:after="0"/>
             </w:pPr>
             <w:r>
               <w:rPr>
@@ -3629,7 +3629,7 @@
           </w:tcPr>
           <w:p>
             <w:pPr>
-              <w:spacing w:after="0" w:line="270"/>
+              <w:spacing w:after="0"/>
             </w:pPr>
             <w:r>
               <w:rPr>
@@ -3662,7 +3662,7 @@
           </w:tcPr>
           <w:p>
             <w:pPr>
-              <w:spacing w:after="0" w:line="270"/>
+              <w:spacing w:after="0"/>
             </w:pPr>
             <w:r>
               <w:rPr>
@@ -3680,7 +3680,7 @@
     </w:tbl>
     <w:p>
       <w:pPr>
-        <w:spacing w:after="80" w:before="80" w:line="300"/>
+        <w:spacing w:after="80" w:before="80"/>
       </w:pPr>
       <w:r>
         <w:rPr>
@@ -3750,7 +3750,7 @@
           </w:tcPr>
           <w:p>
             <w:pPr>
-              <w:spacing w:after="0" w:line="270"/>
+              <w:spacing w:after="0"/>
               <w:jc w:val="center"/>
             </w:pPr>
             <w:r>
@@ -3786,7 +3786,7 @@
           </w:tcPr>
           <w:p>
             <w:pPr>
-              <w:spacing w:after="0" w:line="270"/>
+              <w:spacing w:after="0"/>
               <w:jc w:val="center"/>
             </w:pPr>
             <w:r>
@@ -3822,7 +3822,7 @@
           </w:tcPr>
           <w:p>
             <w:pPr>
-              <w:spacing w:after="0" w:line="270"/>
+              <w:spacing w:after="0"/>
               <w:jc w:val="center"/>
             </w:pPr>
             <w:r>
@@ -3863,7 +3863,7 @@
           </w:tcPr>
           <w:p>
             <w:pPr>
-              <w:spacing w:after="0" w:line="270"/>
+              <w:spacing w:after="0"/>
               <w:jc w:val="center"/>
             </w:pPr>
             <w:r>
@@ -3898,7 +3898,7 @@
           </w:tcPr>
           <w:p>
             <w:pPr>
-              <w:spacing w:after="0" w:line="270"/>
+              <w:spacing w:after="0"/>
             </w:pPr>
             <w:r>
               <w:rPr>
@@ -3914,7 +3914,7 @@
           </w:p>
           <w:p>
             <w:pPr>
-              <w:spacing w:after="0" w:line="270"/>
+              <w:spacing w:after="0"/>
             </w:pPr>
             <w:r>
               <w:rPr>
@@ -3948,7 +3948,7 @@
           </w:tcPr>
           <w:p>
             <w:pPr>
-              <w:spacing w:after="0" w:line="270"/>
+              <w:spacing w:after="0"/>
             </w:pPr>
             <w:r>
               <w:rPr>
@@ -3963,7 +3963,7 @@
           </w:p>
           <w:p>
             <w:pPr>
-              <w:spacing w:after="0" w:line="270"/>
+              <w:spacing w:after="0"/>
             </w:pPr>
             <w:r>
               <w:rPr>
@@ -4002,7 +4002,7 @@
           </w:tcPr>
           <w:p>
             <w:pPr>
-              <w:spacing w:after="0" w:line="270"/>
+              <w:spacing w:after="0"/>
               <w:jc w:val="center"/>
             </w:pPr>
             <w:r>
@@ -4036,7 +4036,7 @@
           </w:tcPr>
           <w:p>
             <w:pPr>
-              <w:spacing w:after="0" w:line="270"/>
+              <w:spacing w:after="0"/>
             </w:pPr>
             <w:r>
               <w:rPr>
@@ -4051,7 +4051,7 @@
           </w:p>
           <w:p>
             <w:pPr>
-              <w:spacing w:after="0" w:line="270"/>
+              <w:spacing w:after="0"/>
             </w:pPr>
             <w:r>
               <w:rPr>
@@ -4066,7 +4066,7 @@
           </w:p>
           <w:p>
             <w:pPr>
-              <w:spacing w:after="0" w:line="270"/>
+              <w:spacing w:after="0"/>
             </w:pPr>
             <w:r>
               <w:rPr>
@@ -4081,7 +4081,7 @@
           </w:p>
           <w:p>
             <w:pPr>
-              <w:spacing w:after="0" w:line="270"/>
+              <w:spacing w:after="0"/>
             </w:pPr>
             <w:r>
               <w:rPr>
@@ -4096,7 +4096,7 @@
           </w:p>
           <w:p>
             <w:pPr>
-              <w:spacing w:after="0" w:line="270"/>
+              <w:spacing w:after="0"/>
             </w:pPr>
             <w:r>
               <w:rPr>
@@ -4111,7 +4111,7 @@
           </w:p>
           <w:p>
             <w:pPr>
-              <w:spacing w:after="0" w:line="270"/>
+              <w:spacing w:after="0"/>
             </w:pPr>
             <w:r>
               <w:rPr>
@@ -4144,7 +4144,7 @@
           </w:tcPr>
           <w:p>
             <w:pPr>
-              <w:spacing w:after="0" w:line="270"/>
+              <w:spacing w:after="0"/>
             </w:pPr>
             <w:r>
               <w:rPr>
@@ -4159,7 +4159,7 @@
           </w:p>
           <w:p>
             <w:pPr>
-              <w:spacing w:after="0" w:line="270"/>
+              <w:spacing w:after="0"/>
             </w:pPr>
             <w:r>
               <w:rPr>
@@ -4198,7 +4198,7 @@
           </w:tcPr>
           <w:p>
             <w:pPr>
-              <w:spacing w:after="0" w:line="270"/>
+              <w:spacing w:after="0"/>
               <w:jc w:val="center"/>
             </w:pPr>
             <w:r>
@@ -4232,7 +4232,7 @@
           </w:tcPr>
           <w:p>
             <w:pPr>
-              <w:spacing w:after="0" w:line="270"/>
+              <w:spacing w:after="0"/>
             </w:pPr>
             <w:r>
               <w:rPr>
@@ -4247,7 +4247,7 @@
           </w:p>
           <w:p>
             <w:pPr>
-              <w:spacing w:after="0" w:line="270"/>
+              <w:spacing w:after="0"/>
             </w:pPr>
             <w:r>
               <w:rPr>
@@ -4262,7 +4262,7 @@
           </w:p>
           <w:p>
             <w:pPr>
-              <w:spacing w:after="0" w:line="270"/>
+              <w:spacing w:after="0"/>
             </w:pPr>
             <w:r>
               <w:rPr>
@@ -4295,7 +4295,7 @@
           </w:tcPr>
           <w:p>
             <w:pPr>
-              <w:spacing w:after="0" w:line="270"/>
+              <w:spacing w:after="0"/>
             </w:pPr>
             <w:r>
               <w:rPr>
@@ -4310,7 +4310,7 @@
           </w:p>
           <w:p>
             <w:pPr>
-              <w:spacing w:after="0" w:line="270"/>
+              <w:spacing w:after="0"/>
             </w:pPr>
             <w:r>
               <w:rPr>
@@ -4349,7 +4349,7 @@
           </w:tcPr>
           <w:p>
             <w:pPr>
-              <w:spacing w:after="0" w:line="270"/>
+              <w:spacing w:after="0"/>
               <w:jc w:val="center"/>
             </w:pPr>
             <w:r>
@@ -4383,7 +4383,7 @@
           </w:tcPr>
           <w:p>
             <w:pPr>
-              <w:spacing w:after="0" w:line="270"/>
+              <w:spacing w:after="0"/>
             </w:pPr>
             <w:r>
               <w:rPr>
@@ -4398,7 +4398,7 @@
           </w:p>
           <w:p>
             <w:pPr>
-              <w:spacing w:after="0" w:line="270"/>
+              <w:spacing w:after="0"/>
             </w:pPr>
             <w:r>
               <w:rPr>
@@ -4413,7 +4413,7 @@
           </w:p>
           <w:p>
             <w:pPr>
-              <w:spacing w:after="0" w:line="270"/>
+              <w:spacing w:after="0"/>
             </w:pPr>
             <w:r>
               <w:rPr>
@@ -4446,7 +4446,7 @@
           </w:tcPr>
           <w:p>
             <w:pPr>
-              <w:spacing w:after="0" w:line="270"/>
+              <w:spacing w:after="0"/>
             </w:pPr>
             <w:r>
               <w:rPr>
@@ -4461,7 +4461,7 @@
           </w:p>
           <w:p>
             <w:pPr>
-              <w:spacing w:after="0" w:line="270"/>
+              <w:spacing w:after="0"/>
             </w:pPr>
             <w:r>
               <w:rPr>
@@ -4500,7 +4500,7 @@
           </w:tcPr>
           <w:p>
             <w:pPr>
-              <w:spacing w:after="0" w:line="270"/>
+              <w:spacing w:after="0"/>
               <w:jc w:val="center"/>
             </w:pPr>
             <w:r>
@@ -4534,7 +4534,7 @@
           </w:tcPr>
           <w:p>
             <w:pPr>
-              <w:spacing w:after="0" w:line="270"/>
+              <w:spacing w:after="0"/>
             </w:pPr>
             <w:r>
               <w:rPr>
@@ -4549,7 +4549,7 @@
           </w:p>
           <w:p>
             <w:pPr>
-              <w:spacing w:after="0" w:line="270"/>
+              <w:spacing w:after="0"/>
             </w:pPr>
             <w:r>
               <w:rPr>
@@ -4564,7 +4564,7 @@
           </w:p>
           <w:p>
             <w:pPr>
-              <w:spacing w:after="0" w:line="270"/>
+              <w:spacing w:after="0"/>
             </w:pPr>
             <w:r>
               <w:rPr>
@@ -4597,7 +4597,7 @@
           </w:tcPr>
           <w:p>
             <w:pPr>
-              <w:spacing w:after="0" w:line="270"/>
+              <w:spacing w:after="0"/>
             </w:pPr>
             <w:r>
               <w:rPr>
@@ -4612,7 +4612,7 @@
           </w:p>
           <w:p>
             <w:pPr>
-              <w:spacing w:after="0" w:line="270"/>
+              <w:spacing w:after="0"/>
             </w:pPr>
             <w:r>
               <w:rPr>
@@ -4630,7 +4630,7 @@
     </w:tbl>
     <w:p>
       <w:pPr>
-        <w:spacing w:after="60" w:before="0" w:line="300"/>
+        <w:spacing w:after="60" w:before="0"/>
       </w:pPr>
       <w:r>
         <w:rPr>
@@ -4668,7 +4668,7 @@
           <w:ilvl w:val="0"/>
           <w:numId w:val="2"/>
         </w:numPr>
-        <w:spacing w:after="60" w:line="300"/>
+        <w:spacing w:after="60"/>
       </w:pPr>
       <w:r>
         <w:rPr>
@@ -4696,7 +4696,7 @@
           <w:ilvl w:val="0"/>
           <w:numId w:val="2"/>
         </w:numPr>
-        <w:spacing w:after="60" w:line="300"/>
+        <w:spacing w:after="60"/>
       </w:pPr>
       <w:r>
         <w:rPr>
@@ -4724,7 +4724,7 @@
           <w:ilvl w:val="0"/>
           <w:numId w:val="2"/>
         </w:numPr>
-        <w:spacing w:after="60" w:line="300"/>
+        <w:spacing w:after="60"/>
       </w:pPr>
       <w:r>
         <w:rPr>
@@ -4753,7 +4753,7 @@
           <w:ilvl w:val="0"/>
           <w:numId w:val="2"/>
         </w:numPr>
-        <w:spacing w:after="60" w:line="300"/>
+        <w:spacing w:after="60"/>
       </w:pPr>
       <w:r>
         <w:rPr>
@@ -4819,7 +4819,7 @@
           <w:ilvl w:val="0"/>
           <w:numId w:val="3"/>
         </w:numPr>
-        <w:spacing w:after="60" w:line="300"/>
+        <w:spacing w:after="60"/>
       </w:pPr>
       <w:r>
         <w:rPr>
@@ -4847,7 +4847,7 @@
           <w:ilvl w:val="0"/>
           <w:numId w:val="3"/>
         </w:numPr>
-        <w:spacing w:after="60" w:line="300"/>
+        <w:spacing w:after="60"/>
       </w:pPr>
       <w:r>
         <w:rPr>
@@ -4875,7 +4875,7 @@
           <w:ilvl w:val="0"/>
           <w:numId w:val="3"/>
         </w:numPr>
-        <w:spacing w:after="60" w:line="300"/>
+        <w:spacing w:after="60"/>
       </w:pPr>
       <w:r>
         <w:rPr>
@@ -4903,7 +4903,7 @@
           <w:ilvl w:val="0"/>
           <w:numId w:val="3"/>
         </w:numPr>
-        <w:spacing w:after="60" w:line="300"/>
+        <w:spacing w:after="60"/>
       </w:pPr>
       <w:r>
         <w:rPr>
@@ -4931,7 +4931,7 @@
           <w:ilvl w:val="0"/>
           <w:numId w:val="3"/>
         </w:numPr>
-        <w:spacing w:after="60" w:line="300"/>
+        <w:spacing w:after="60"/>
       </w:pPr>
       <w:r>
         <w:rPr>
@@ -4979,7 +4979,7 @@
           <w:ilvl w:val="0"/>
           <w:numId w:val="2"/>
         </w:numPr>
-        <w:spacing w:after="60" w:line="300"/>
+        <w:spacing w:after="60"/>
       </w:pPr>
       <w:r>
         <w:rPr>
@@ -5007,7 +5007,7 @@
           <w:ilvl w:val="0"/>
           <w:numId w:val="2"/>
         </w:numPr>
-        <w:spacing w:after="60" w:line="300"/>
+        <w:spacing w:after="60"/>
       </w:pPr>
       <w:r>
         <w:rPr>
@@ -5035,7 +5035,7 @@
           <w:ilvl w:val="0"/>
           <w:numId w:val="2"/>
         </w:numPr>
-        <w:spacing w:after="60" w:line="300"/>
+        <w:spacing w:after="60"/>
       </w:pPr>
       <w:r>
         <w:rPr>
@@ -5053,7 +5053,7 @@
           <w:ilvl w:val="0"/>
           <w:numId w:val="2"/>
         </w:numPr>
-        <w:spacing w:after="60" w:line="300"/>
+        <w:spacing w:after="60"/>
       </w:pPr>
       <w:r>
         <w:rPr>
@@ -5081,7 +5081,7 @@
           <w:ilvl w:val="0"/>
           <w:numId w:val="2"/>
         </w:numPr>
-        <w:spacing w:after="60" w:line="300"/>
+        <w:spacing w:after="60"/>
       </w:pPr>
       <w:r>
         <w:rPr>
@@ -5119,7 +5119,7 @@
           <w:ilvl w:val="0"/>
           <w:numId w:val="2"/>
         </w:numPr>
-        <w:spacing w:after="60" w:line="300"/>
+        <w:spacing w:after="60"/>
       </w:pPr>
       <w:r>
         <w:rPr>
@@ -5137,7 +5137,7 @@
           <w:ilvl w:val="0"/>
           <w:numId w:val="2"/>
         </w:numPr>
-        <w:spacing w:after="60" w:line="300"/>
+        <w:spacing w:after="60"/>
       </w:pPr>
       <w:r>
         <w:rPr>
@@ -5155,7 +5155,7 @@
           <w:ilvl w:val="0"/>
           <w:numId w:val="2"/>
         </w:numPr>
-        <w:spacing w:after="60" w:line="300"/>
+        <w:spacing w:after="60"/>
       </w:pPr>
       <w:r>
         <w:rPr>
@@ -5191,7 +5191,7 @@
           <w:ilvl w:val="0"/>
           <w:numId w:val="2"/>
         </w:numPr>
-        <w:spacing w:after="60" w:line="300"/>
+        <w:spacing w:after="60"/>
       </w:pPr>
       <w:r>
         <w:rPr>
@@ -5209,7 +5209,7 @@
           <w:ilvl w:val="0"/>
           <w:numId w:val="2"/>
         </w:numPr>
-        <w:spacing w:after="60" w:line="300"/>
+        <w:spacing w:after="60"/>
       </w:pPr>
       <w:r>
         <w:rPr>
@@ -5227,7 +5227,7 @@
           <w:ilvl w:val="0"/>
           <w:numId w:val="2"/>
         </w:numPr>
-        <w:spacing w:after="60" w:line="300"/>
+        <w:spacing w:after="60"/>
       </w:pPr>
       <w:r>
         <w:rPr>
@@ -5240,7 +5240,7 @@
     </w:p>
     <w:p>
       <w:pPr>
-        <w:spacing w:after="60" w:before="0" w:line="300"/>
+        <w:spacing w:after="60" w:before="0"/>
       </w:pPr>
       <w:r>
         <w:rPr>
@@ -5253,7 +5253,7 @@
     </w:p>
     <w:p>
       <w:pPr>
-        <w:spacing w:after="80" w:before="0" w:line="300"/>
+        <w:spacing w:after="80" w:before="0"/>
       </w:pPr>
       <w:r>
         <w:rPr>
@@ -5267,7 +5267,7 @@
     </w:p>
     <w:p>
       <w:pPr>
-        <w:spacing w:after="60" w:before="0" w:line="300"/>
+        <w:spacing w:after="60" w:before="0"/>
       </w:pPr>
       <w:r>
         <w:rPr>
@@ -5280,7 +5280,7 @@
     </w:p>
     <w:p>
       <w:pPr>
-        <w:spacing w:after="40" w:before="0" w:line="300"/>
+        <w:spacing w:after="40" w:before="0"/>
       </w:pPr>
       <w:r>
         <w:rPr>
@@ -5332,7 +5332,7 @@
           </w:tcPr>
           <w:p>
             <w:pPr>
-              <w:spacing w:after="0" w:line="270"/>
+              <w:spacing w:after="0"/>
             </w:pPr>
             <w:r>
               <w:rPr>

</xml_diff>